<commit_message>
docs: correct heading spacing, English italics and table continuation
</commit_message>
<xml_diff>
--- a/docs/coursework/ПЗ_Белковец.docx
+++ b/docs/coursework/ПЗ_Белковец.docx
@@ -4,7 +4,7 @@
   <w:body>
     <w:p>
       <w:pPr>
-        <w:spacing w:before="280" w:after="280"/>
+        <w:keepNext/>
         <w:ind w:firstLine="0"/>
         <w:jc w:val="center"/>
       </w:pPr>
@@ -14,6 +14,11 @@
         </w:rPr>
         <w:t>СОДЕРЖАНИЕ</w:t>
       </w:r>
+    </w:p>
+    <w:p>
+      <w:pPr>
+        <w:keepNext/>
+      </w:pPr>
     </w:p>
     <w:p>
       <w:pPr>
@@ -325,7 +330,6 @@
       <w:pPr>
         <w:keepNext/>
         <w:pageBreakBefore/>
-        <w:spacing w:before="280" w:after="280"/>
         <w:ind w:firstLine="0"/>
         <w:jc w:val="center"/>
         <w:outlineLvl w:val="0"/>
@@ -341,6 +345,11 @@
       <w:bookmarkEnd w:id="0"/>
     </w:p>
     <w:p>
+      <w:pPr>
+        <w:keepNext/>
+      </w:pPr>
+    </w:p>
+    <w:p>
       <w:r>
         <w:t>Торговая транзакция содержит сведения не только о стоимости покупки, но и о составе потребительской корзины. Совместная обработка чеков позволяет определять востребованные товары, проверять применение скидок, выявлять устойчивые сочетания покупок и готовить данные для управленческих решений. При увеличении числа источников транзакций одновременный расчёт сумм и аналитических показателей требует согласованного распределения вычислительной нагрузки.</w:t>
       </w:r>
@@ -436,17 +445,20 @@
     </w:p>
     <w:p>
       <w:r>
+        <w:t xml:space="preserve">Программный комплекс получил название </w:t>
+      </w:r>
+      <w:r>
+        <w:rPr>
+          <w:i/>
+        </w:rPr>
+        <w:t>BasketNet</w:t>
+      </w:r>
+      <w:r>
+        <w:t xml:space="preserve">. Пользовательская часть представлена веб-магазином: посетитель просматривает каталог, после </w:t>
+      </w:r>
+      <w:r>
         <w:lastRenderedPageBreak/>
-        <w:t xml:space="preserve">Программный комплекс получил название </w:t>
-      </w:r>
-      <w:r>
-        <w:rPr>
-          <w:i/>
-        </w:rPr>
-        <w:t>BasketNet</w:t>
-      </w:r>
-      <w:r>
-        <w:t>. Пользовательская часть представлена веб-магазином: посетитель просматривает каталог, после входа собирает корзину, применяет купон и оформляет учебный заказ. В административной части доступны каталог, настройки купонов, аналитика, состояние воркеров и генератор тестовых заказов. Такая организация связывает распределённые вычисления с предметной областью и позволяет наблюдать прохождение транзакции от ввода до получения чека.</w:t>
+        <w:t>входа собирает корзину, применяет купон и оформляет учебный заказ. В административной части доступны каталог, настройки купонов, аналитика, состояние воркеров и генератор тестовых заказов. Такая организация связывает распределённые вычисления с предметной областью и позволяет наблюдать прохождение транзакции от ввода до получения чека.</w:t>
       </w:r>
     </w:p>
     <w:p>
@@ -521,6 +533,11 @@
       <w:r>
         <w:t>В первом разделе рассмотрены подходы к распределённой обработке торговых транзакций, очереди заданий, сетевой обмен и методы анализа потребительской корзины. По результатам обзора обоснован выбор программных средств и сформулированы требования к проектируемой системе.</w:t>
       </w:r>
+    </w:p>
+    <w:p>
+      <w:pPr>
+        <w:keepNext/>
+      </w:pPr>
     </w:p>
     <w:p>
       <w:pPr>
@@ -538,6 +555,11 @@
     </w:p>
     <w:p>
       <w:pPr>
+        <w:keepNext/>
+      </w:pPr>
+    </w:p>
+    <w:p>
+      <w:pPr>
         <w:pStyle w:val="21"/>
       </w:pPr>
       <w:bookmarkStart w:id="2" w:name="ExcerptHeading2"/>
@@ -545,39 +567,65 @@
         <w:t>1.1 Архитектурные подходы к выполнению клиентских заданий</w:t>
       </w:r>
       <w:bookmarkEnd w:id="2"/>
-    </w:p>
-    <w:p>
-      <w:r>
-        <w:t>При проектировании системы необходимо определить, какой компонент принимает запрос и какой выполняет расчёт. В простейшем случае обе функции объединены в одном приложении: обработчик получает данные, вычисляет результат и удерживает соединение до окончания работы. Такая схема уменьшает число компонентов, но делает продолжительность запроса зависимой от самой длительной операции. Одновременные запросы начинают конкурировать за ресурсы обработчика.</w:t>
-      </w:r>
-    </w:p>
-    <w:p>
-      <w:r>
-        <w:t>Следующий вариант использует несколько потоков внутри сервера. Потоки позволяют обслуживать независимые соединения и ожидания ввода-вывода, однако разделяют память процесса и требуют синхронизации общего состояния. Для вычислительных задач на Python это также не равнозначно запуску независимых интерпретаторов. В книге М. Фаулера рассмотрены различия потоков, процессов и асинхронного исполнения; поэтому в BasketNet многопоточность используется преимущественно для сетевого обслуживания и управления [1].</w:t>
-      </w:r>
-    </w:p>
-    <w:p>
-      <w:r>
-        <w:t>В архитектуре с брокером клиент передаёт описание задания посреднику. Брокер проверяет запрос, помещает его в очередь и назначает исполнителя. Воркер получает данные, выполняет операцию и возвращает результат. Клиент может получать сведения о ходе работы независимо от продолжительности вычисления. Добавление исполнителя увеличивает доступный вычислительный ресурс без изменения формата запроса. Разделение компонентов, обмен сообщениями и обработка частичных отказов относятся к основным вопросам построения распределённых систем [2].</w:t>
-      </w:r>
-    </w:p>
-    <w:p>
-      <w:r>
-        <w:t>Для рассматриваемой задачи брокер является центром принятия решений о назначении работ. Он знает приоритет, состояние и номер попытки каждого задания, а также доступность исполнителей. Воркеры не выбирают произвольные задания из базы и не изменяют сведения о заказе напрямую. Это уменьшает число мест, в которых требуется разрешать конфликты состояния, и делает поведение при отказе наблюдаемым.</w:t>
-      </w:r>
-    </w:p>
-    <w:p>
-      <w:r>
-        <w:t>Сопоставление рассмотренных подходов приведено в таблице 1.1. Оценка относится к требованиям данного проекта: нескольким типам вычислений, обязательной приоритетной очереди и необходимости переназначения задания другому узлу. Она не означает универсального превосходства одного подхода во всех условиях применения.</w:t>
-      </w:r>
     </w:p>
     <w:p>
       <w:pPr>
         <w:keepNext/>
-        <w:spacing w:before="240"/>
       </w:pPr>
-      <w:r>
-        <w:lastRenderedPageBreak/>
+    </w:p>
+    <w:p>
+      <w:r>
+        <w:t>При проектировании системы необходимо определить, какой компонент принимает запрос и какой выполняет расчёт. В простейшем случае обе функции объединены в одном приложении: обработчик получает данные, вычисляет результат и удерживает соединение до окончания работы. Такая схема уменьшает число компонентов, но делает продолжительность запроса зависимой от самой длительной операции. Одновременные запросы начинают конкурировать за ресурсы обработчика.</w:t>
+      </w:r>
+    </w:p>
+    <w:p>
+      <w:r>
+        <w:t xml:space="preserve">Следующий вариант использует несколько потоков внутри сервера. Потоки позволяют обслуживать независимые соединения и ожидания ввода-вывода, однако разделяют память процесса и требуют синхронизации общего состояния. Для вычислительных задач на </w:t>
+      </w:r>
+      <w:r>
+        <w:rPr>
+          <w:i/>
+        </w:rPr>
+        <w:t>Python</w:t>
+      </w:r>
+      <w:r>
+        <w:t xml:space="preserve"> это также не равнозначно запуску независимых интерпретаторов. В книге М. Фаулера рассмотрены различия потоков, процессов и асинхронного исполнения; поэтому в </w:t>
+      </w:r>
+      <w:r>
+        <w:rPr>
+          <w:i/>
+        </w:rPr>
+        <w:t>BasketNet</w:t>
+      </w:r>
+      <w:r>
+        <w:t xml:space="preserve"> многопоточность используется преимущественно для сетевого обслуживания и управления [1].</w:t>
+      </w:r>
+    </w:p>
+    <w:p>
+      <w:r>
+        <w:t>В архитектуре с брокером клиент передаёт описание задания посреднику. Брокер проверяет запрос, помещает его в очередь и назначает исполнителя. Воркер получает данные, выполняет операцию и возвращает результат. Клиент может получать сведения о ходе работы независимо от продолжительности вычисления. Добавление исполнителя увеличивает доступный вычислительный ресурс без изменения формата запроса. Разделение компонентов, обмен сообщениями и обработка частичных отказов относятся к основным вопросам построения распределённых систем [2].</w:t>
+      </w:r>
+    </w:p>
+    <w:p>
+      <w:r>
+        <w:t>Для рассматриваемой задачи брокер является центром принятия решений о назначении работ. Он знает приоритет, состояние и номер попытки каждого задания, а также доступность исполнителей. Воркеры не выбирают произвольные задания из базы и не изменяют сведения о заказе напрямую. Это уменьшает число мест, в которых требуется разрешать конфликты состояния, и делает поведение при отказе наблюдаемым.</w:t>
+      </w:r>
+    </w:p>
+    <w:p>
+      <w:r>
+        <w:t>Сопоставление рассмотренных подходов приведено в таблице 1.1. Оценка относится к требованиям данного проекта: нескольким типам вычислений, обязательной приоритетной очереди и необходимости переназначения задания другому узлу. Она не означает универсального превосходства одного подхода во всех условиях применения.</w:t>
+      </w:r>
+    </w:p>
+    <w:p>
+      <w:pPr>
+        <w:keepNext/>
+      </w:pPr>
+    </w:p>
+    <w:p>
+      <w:pPr>
+        <w:keepNext/>
+      </w:pPr>
+      <w:r>
         <w:t>Таблица 1.1 - Сравнение способов организации обработки</w:t>
       </w:r>
     </w:p>
@@ -604,7 +652,6 @@
         <w:trPr>
           <w:cantSplit/>
           <w:trHeight w:val="454"/>
-          <w:tblHeader/>
         </w:trPr>
         <w:tc>
           <w:tcPr>
@@ -678,6 +725,65 @@
                 <w:b/>
               </w:rPr>
               <w:t>Ограничения</w:t>
+            </w:r>
+          </w:p>
+        </w:tc>
+      </w:tr>
+      <w:tr>
+        <w:trPr>
+          <w:trHeight w:val="454"/>
+        </w:trPr>
+        <w:tc>
+          <w:tcPr>
+            <w:tcW w:w="1984" w:type="dxa"/>
+          </w:tcPr>
+          <w:p>
+            <w:pPr>
+              <w:keepNext/>
+              <w:ind w:firstLine="0"/>
+              <w:jc w:val="center"/>
+            </w:pPr>
+            <w:r>
+              <w:rPr>
+                <w:sz w:val="24"/>
+              </w:rPr>
+              <w:t>1</w:t>
+            </w:r>
+          </w:p>
+        </w:tc>
+        <w:tc>
+          <w:tcPr>
+            <w:tcW w:w="3685" w:type="dxa"/>
+          </w:tcPr>
+          <w:p>
+            <w:pPr>
+              <w:keepNext/>
+              <w:ind w:firstLine="0"/>
+              <w:jc w:val="center"/>
+            </w:pPr>
+            <w:r>
+              <w:rPr>
+                <w:sz w:val="24"/>
+              </w:rPr>
+              <w:t>2</w:t>
+            </w:r>
+          </w:p>
+        </w:tc>
+        <w:tc>
+          <w:tcPr>
+            <w:tcW w:w="3969" w:type="dxa"/>
+          </w:tcPr>
+          <w:p>
+            <w:pPr>
+              <w:keepNext/>
+              <w:ind w:firstLine="0"/>
+              <w:jc w:val="center"/>
+            </w:pPr>
+            <w:r>
+              <w:rPr>
+                <w:sz w:val="24"/>
+              </w:rPr>
+              <w:t>3</w:t>
             </w:r>
           </w:p>
         </w:tc>
@@ -979,6 +1085,11 @@
     </w:p>
     <w:p>
       <w:pPr>
+        <w:keepNext/>
+      </w:pPr>
+    </w:p>
+    <w:p>
+      <w:pPr>
         <w:pStyle w:val="21"/>
       </w:pPr>
       <w:bookmarkStart w:id="3" w:name="ExcerptHeading3"/>
@@ -988,62 +1099,123 @@
       <w:bookmarkEnd w:id="3"/>
     </w:p>
     <w:p>
-      <w:r>
-        <w:t>В готовых системах очередей подтверждение доставки и выполнения является отдельным механизмом. В документации RabbitMQ различаются подтверждения от потребителя и подтверждения публикации. При отсутствии успешного завершения сообщение может быть возвращено для повторной обработки [3]. Для собственного брокера существенен тот же инженерный принцип: факт отправки по соединению не доказывает, что прикладной расчёт завершён.</w:t>
-      </w:r>
+      <w:pPr>
+        <w:keepNext/>
+      </w:pPr>
     </w:p>
     <w:p>
       <w:r>
-        <w:t>Celery представляет более высокий уровень организации фоновых работ: клиент отправляет описание задачи, а воркеры выполняют её с использованием брокера сообщений [4]. Применение такого средства сокращает объём самостоятельно разрабатываемой инфраструктуры. Однако учебное задание требует показать собственные алгоритмы TCP-обмена, UDP-контроля и многопоточного планирования. Поэтому готовые брокеры рассматриваются как аналоги, а не включаются в состав BasketNet.</w:t>
+        <w:t xml:space="preserve">В готовых системах очередей подтверждение доставки и выполнения является отдельным механизмом. В документации </w:t>
+      </w:r>
+      <w:r>
+        <w:rPr>
+          <w:i/>
+        </w:rPr>
+        <w:t>RabbitMQ</w:t>
+      </w:r>
+      <w:r>
+        <w:t xml:space="preserve"> различаются подтверждения от потребителя и подтверждения публикации. При отсутствии успешного завершения сообщение может быть возвращено для повторной обработки [3]. Для собственного брокера существенен тот же инженерный принцип: факт отправки по соединению не доказывает, что прикладной расчёт завершён.</w:t>
       </w:r>
     </w:p>
     <w:p>
       <w:r>
-        <w:t xml:space="preserve">Для очереди необходимо согласовать срочность и порядок поступления. Дисциплина </w:t>
-      </w:r>
-      <w:r>
-        <w:rPr>
-          <w:i/>
-        </w:rPr>
-        <w:t>FIFO</w:t>
-      </w:r>
-      <w:r>
-        <w:t xml:space="preserve"> сохраняет последовательность запросов, но не выделяет срочные транзакции. Строгий приоритет позволяет обрабатывать более важные задания раньше, однако при постоянном поступлении срочных запросов может задерживать менее важные. В проекте применяется строгий приоритет с </w:t>
-      </w:r>
-      <w:r>
-        <w:rPr>
-          <w:i/>
-        </w:rPr>
-        <w:t>FIFO</w:t>
-      </w:r>
-      <w:r>
-        <w:t xml:space="preserve"> внутри каждого уровня. Старение приоритета в текущей версии не реализовано.</w:t>
+        <w:rPr>
+          <w:i/>
+        </w:rPr>
+        <w:t>Celery</w:t>
+      </w:r>
+      <w:r>
+        <w:t xml:space="preserve"> представляет более высокий уровень организации фоновых работ: клиент отправляет описание задачи, а воркеры выполняют её с использованием брокера сообщений [4]. Применение такого средства сокращает объём самостоятельно разрабатываемой инфраструктуры. Однако учебное задание требует показать собственные алгоритмы </w:t>
+      </w:r>
+      <w:r>
+        <w:rPr>
+          <w:i/>
+        </w:rPr>
+        <w:t>TCP-</w:t>
+      </w:r>
+      <w:r>
+        <w:t xml:space="preserve">обмена, </w:t>
+      </w:r>
+      <w:r>
+        <w:rPr>
+          <w:i/>
+        </w:rPr>
+        <w:t>UDP-</w:t>
+      </w:r>
+      <w:r>
+        <w:t xml:space="preserve">контроля и многопоточного планирования. Поэтому готовые брокеры рассматриваются как аналоги, а не включаются в состав </w:t>
+      </w:r>
+      <w:r>
+        <w:rPr>
+          <w:i/>
+        </w:rPr>
+        <w:t>BasketNet.</w:t>
       </w:r>
     </w:p>
     <w:p>
       <w:r>
+        <w:t xml:space="preserve">Для очереди необходимо согласовать срочность и порядок поступления. Дисциплина </w:t>
+      </w:r>
+      <w:r>
+        <w:rPr>
+          <w:i/>
+        </w:rPr>
+        <w:t>FIFO</w:t>
+      </w:r>
+      <w:r>
+        <w:t xml:space="preserve"> сохраняет последовательность запросов, но не выделяет срочные транзакции. Строгий приоритет позволяет обрабатывать более важные </w:t>
+      </w:r>
+      <w:r>
         <w:lastRenderedPageBreak/>
-        <w:t>Хранение очереди в двоичной куче позволяет получать минимальный ключ без полной сортировки списка. Двоичные кучи и реализация очередей с приоритетами рассматриваются в учебнике Т. Кормена и соавторов [5]. В BasketNet ключ включает отрицательный приоритет, возрастающий номер поступления и идентификатор задания. Такая структура обеспечивает однозначное сравнение даже для сложных исходных данных.</w:t>
+        <w:t xml:space="preserve">задания раньше, однако при постоянном поступлении срочных запросов может задерживать менее важные. В проекте применяется строгий приоритет с </w:t>
+      </w:r>
+      <w:r>
+        <w:rPr>
+          <w:i/>
+        </w:rPr>
+        <w:t>FIFO</w:t>
+      </w:r>
+      <w:r>
+        <w:t xml:space="preserve"> внутри каждого уровня. Старение приоритета в текущей версии не реализовано.</w:t>
       </w:r>
     </w:p>
     <w:p>
       <w:r>
-        <w:t xml:space="preserve">Надёжность выполнения необходимо отделять от надёжности передачи байтов. </w:t>
-      </w:r>
-      <w:r>
-        <w:rPr>
-          <w:i/>
-        </w:rPr>
-        <w:t>TCP</w:t>
-      </w:r>
-      <w:r>
-        <w:t xml:space="preserve"> повторяет передачу потерянных сегментов, но при разрыве соединения после вычисления клиент может не знать, был ли результат принят. Если брокер выдаст работу повторно, фактическое вычисление может произойти несколько раз. Для проекта выбрана модель повторного исполнения с принятием только актуального результата. Она допустима, поскольку операции воркера не списывают деньги и не изменяют внешние остатки товаров.</w:t>
+        <w:t xml:space="preserve">Хранение очереди в двоичной куче позволяет получать минимальный ключ без полной сортировки списка. Двоичные кучи и реализация очередей с приоритетами рассматриваются в учебнике Т. Кормена и соавторов [5]. В </w:t>
+      </w:r>
+      <w:r>
+        <w:rPr>
+          <w:i/>
+        </w:rPr>
+        <w:t>BasketNet</w:t>
+      </w:r>
+      <w:r>
+        <w:t xml:space="preserve"> ключ включает отрицательный приоритет, возрастающий номер поступления и идентификатор задания. Такая структура обеспечивает однозначное сравнение даже для сложных исходных данных.</w:t>
       </w:r>
     </w:p>
     <w:p>
       <w:r>
+        <w:t xml:space="preserve">Надёжность выполнения необходимо отделять от надёжности передачи байтов. </w:t>
+      </w:r>
+      <w:r>
+        <w:rPr>
+          <w:i/>
+        </w:rPr>
+        <w:t>TCP</w:t>
+      </w:r>
+      <w:r>
+        <w:t xml:space="preserve"> повторяет передачу потерянных сегментов, но при разрыве соединения после вычисления клиент может не знать, был ли результат принят. Если брокер выдаст работу повторно, фактическое вычисление может произойти несколько раз. Для проекта выбрана модель повторного исполнения с принятием только актуального результата. Она допустима, поскольку операции воркера не списывают деньги и не изменяют внешние остатки товаров.</w:t>
+      </w:r>
+    </w:p>
+    <w:p>
+      <w:r>
         <w:t>Для каждой попытки формируется отдельный идентификатор. Подтверждение принимается только от назначенного воркера и только для текущей попытки до истечения срока исполнения. Это предотвращает перезапись результата запоздалым сообщением от прежнего узла. Ограничение числа попыток также защищает систему от бесконечного возврата неисправного задания в очередь.</w:t>
       </w:r>
+    </w:p>
+    <w:p>
+      <w:pPr>
+        <w:keepNext/>
+      </w:pPr>
     </w:p>
     <w:p>
       <w:pPr>
@@ -1056,65 +1228,175 @@
       <w:bookmarkEnd w:id="4"/>
     </w:p>
     <w:p>
-      <w:r>
-        <w:t>TCP обеспечивает упорядоченный поток байтов между приложениями [6]. Для передачи задания и результата это позволяет использовать одно соединение без самостоятельной реализации повторов отдельных пакетов. Однако поток не содержит границ прикладных сообщений. Один вызов чтения может вернуть часть сообщения либо сразу несколько сообщений. Следовательно, приложению необходим собственный способ выделения кадров.</w:t>
-      </w:r>
+      <w:pPr>
+        <w:keepNext/>
+      </w:pPr>
     </w:p>
     <w:p>
       <w:r>
-        <w:t>В проекте каждый кадр является JSON-объектом в UTF-8, за которым следует перевод строки. JSON используется как текстовое представление структурированных данных. Его применение удобно для массивов товаров, параметров расчёта и состояний задания. На принимающей стороне накапливается буфер, в котором ищется завершённая строка. Ограничение размера кадра не позволяет бесконечно наращивать буфер при некорректном запросе.</w:t>
+        <w:rPr>
+          <w:i/>
+        </w:rPr>
+        <w:t>TCP</w:t>
+      </w:r>
+      <w:r>
+        <w:t xml:space="preserve"> обеспечивает упорядоченный поток байтов между приложениями [6]. Для передачи задания и результата это позволяет использовать одно соединение без самостоятельной реализации повторов отдельных пакетов. Однако поток не содержит границ прикладных сообщений. Один вызов чтения может вернуть часть сообщения либо сразу несколько сообщений. Следовательно, приложению необходим собственный способ выделения кадров.</w:t>
       </w:r>
     </w:p>
     <w:p>
       <w:r>
-        <w:t>UDP передаёт отдельные датаграммы без установления соединения и не предоставляет гарантии доставки и порядка сообщений [6]. Эти свойства подходят для периодического heartbeat: каждое новое сообщение заменяет предыдущее свидетельство активности. Потеря одной датаграммы не должна немедленно объявлять узел неисправным, поэтому обнаружение отказа основано на превышении интервала с последнего корректного сообщения.</w:t>
+        <w:t xml:space="preserve">В проекте каждый кадр является </w:t>
+      </w:r>
+      <w:r>
+        <w:rPr>
+          <w:i/>
+        </w:rPr>
+        <w:t>JSON-</w:t>
+      </w:r>
+      <w:r>
+        <w:t xml:space="preserve">объектом в </w:t>
+      </w:r>
+      <w:r>
+        <w:rPr>
+          <w:i/>
+        </w:rPr>
+        <w:t>UTF-8</w:t>
+      </w:r>
+      <w:r>
+        <w:t xml:space="preserve">, за которым следует перевод строки. </w:t>
+      </w:r>
+      <w:r>
+        <w:rPr>
+          <w:i/>
+        </w:rPr>
+        <w:t>JSON</w:t>
+      </w:r>
+      <w:r>
+        <w:t xml:space="preserve"> используется как текстовое представление структурированных данных. Его применение удобно для массивов товаров, параметров расчёта и состояний задания. На принимающей стороне накапливается буфер, в котором ищется завершённая строка. Ограничение размера кадра не позволяет бесконечно наращивать буфер при некорректном запросе.</w:t>
       </w:r>
     </w:p>
     <w:p>
       <w:r>
+        <w:rPr>
+          <w:i/>
+        </w:rPr>
+        <w:t>UDP</w:t>
+      </w:r>
+      <w:r>
+        <w:t xml:space="preserve"> передаёт отдельные датаграммы без установления соединения и не предоставляет гарантии доставки и порядка сообщений [6]. Эти свойства подходят для периодического </w:t>
+      </w:r>
+      <w:r>
+        <w:rPr>
+          <w:i/>
+        </w:rPr>
+        <w:t>heartbeat:</w:t>
+      </w:r>
+      <w:r>
+        <w:t xml:space="preserve"> каждое новое сообщение заменяет предыдущее свидетельство активности. Потеря одной датаграммы не должна немед</w:t>
+      </w:r>
+      <w:r>
         <w:lastRenderedPageBreak/>
-        <w:t xml:space="preserve">Работоспособность контролируется двумя независимыми сроками. Первый ограничивает допустимое отсутствие </w:t>
-      </w:r>
-      <w:r>
-        <w:rPr>
-          <w:i/>
-        </w:rPr>
-        <w:t>heartbeat</w:t>
-      </w:r>
-      <w:r>
-        <w:t xml:space="preserve"> и относится к узлу в целом. Второй ограничивает длительность задания без прикладного подтверждения. Исполнитель может продолжать передавать </w:t>
-      </w:r>
-      <w:r>
-        <w:rPr>
-          <w:i/>
-        </w:rPr>
-        <w:t>heartbeat</w:t>
-      </w:r>
-      <w:r>
-        <w:t xml:space="preserve">, но зависнуть на расчёте; в таком случае обнаружить проблему позволяет именно таймаут </w:t>
-      </w:r>
-      <w:r>
-        <w:rPr>
-          <w:i/>
-        </w:rPr>
-        <w:t>ACK</w:t>
-      </w:r>
-      <w:r>
-        <w:t xml:space="preserve">. Разрыв </w:t>
-      </w:r>
-      <w:r>
-        <w:rPr>
-          <w:i/>
-        </w:rPr>
-        <w:t>TCP</w:t>
-      </w:r>
-      <w:r>
-        <w:t>-соединения является третьим основанием для возврата работы.</w:t>
+        <w:t>ленно объявлять узел неисправным, поэтому обнаружение отказа основано на превышении интервала с последнего корректного сообщения.</w:t>
       </w:r>
     </w:p>
     <w:p>
       <w:r>
-        <w:t>Клиентские уведомления передаются по отдельному TCP-соединению. Такое разделение исключает необходимость удерживать запрос отправки открытым до получения ответа. Браузер не работает напрямую с сокетами брокера, поэтому веб-сервер преобразует уведомления в Server-Sent Events. Спецификация HTML определяет EventSource и формат потока text/event-stream для поступающих от сервера событий [7].</w:t>
+        <w:t xml:space="preserve">Работоспособность контролируется двумя независимыми сроками. Первый ограничивает допустимое отсутствие </w:t>
+      </w:r>
+      <w:r>
+        <w:rPr>
+          <w:i/>
+        </w:rPr>
+        <w:t>heartbeat</w:t>
+      </w:r>
+      <w:r>
+        <w:t xml:space="preserve"> и относится к узлу в целом. Второй ограничивает длительность задания без прикладного подтверждения. Исполнитель может продолжать передавать </w:t>
+      </w:r>
+      <w:r>
+        <w:rPr>
+          <w:i/>
+        </w:rPr>
+        <w:t>heartbeat</w:t>
+      </w:r>
+      <w:r>
+        <w:t xml:space="preserve">, но зависнуть на расчёте; в таком случае обнаружить проблему позволяет именно таймаут </w:t>
+      </w:r>
+      <w:r>
+        <w:rPr>
+          <w:i/>
+        </w:rPr>
+        <w:t>ACK</w:t>
+      </w:r>
+      <w:r>
+        <w:t xml:space="preserve">. Разрыв </w:t>
+      </w:r>
+      <w:r>
+        <w:rPr>
+          <w:i/>
+        </w:rPr>
+        <w:t>TCP</w:t>
+      </w:r>
+      <w:r>
+        <w:t>-соединения является третьим основанием для возврата работы.</w:t>
+      </w:r>
+    </w:p>
+    <w:p>
+      <w:r>
+        <w:t xml:space="preserve">Клиентские уведомления передаются по отдельному </w:t>
+      </w:r>
+      <w:r>
+        <w:rPr>
+          <w:i/>
+        </w:rPr>
+        <w:t>TCP-</w:t>
+      </w:r>
+      <w:r>
+        <w:t xml:space="preserve">соединению. Такое разделение исключает необходимость удерживать запрос отправки открытым до получения ответа. Браузер не работает напрямую с сокетами брокера, поэтому веб-сервер преобразует уведомления в </w:t>
+      </w:r>
+      <w:r>
+        <w:rPr>
+          <w:i/>
+        </w:rPr>
+        <w:t>Server-Sent</w:t>
+      </w:r>
+      <w:r>
+        <w:t xml:space="preserve"> </w:t>
+      </w:r>
+      <w:r>
+        <w:rPr>
+          <w:i/>
+        </w:rPr>
+        <w:t>Events.</w:t>
+      </w:r>
+      <w:r>
+        <w:t xml:space="preserve"> Спецификация </w:t>
+      </w:r>
+      <w:r>
+        <w:rPr>
+          <w:i/>
+        </w:rPr>
+        <w:t>HTML</w:t>
+      </w:r>
+      <w:r>
+        <w:t xml:space="preserve"> определяет </w:t>
+      </w:r>
+      <w:r>
+        <w:rPr>
+          <w:i/>
+        </w:rPr>
+        <w:t>EventSource</w:t>
+      </w:r>
+      <w:r>
+        <w:t xml:space="preserve"> и формат потока </w:t>
+      </w:r>
+      <w:r>
+        <w:rPr>
+          <w:i/>
+        </w:rPr>
+        <w:t>text/event-stream</w:t>
+      </w:r>
+      <w:r>
+        <w:t xml:space="preserve"> для поступающих от сервера событий [7].</w:t>
       </w:r>
     </w:p>
     <w:p>
@@ -1143,7 +1425,11 @@
     <w:p>
       <w:pPr>
         <w:keepNext/>
-        <w:spacing w:before="240"/>
+      </w:pPr>
+    </w:p>
+    <w:p>
+      <w:pPr>
+        <w:keepNext/>
       </w:pPr>
       <w:r>
         <w:t xml:space="preserve">Таблица 1.2 - Сетевые каналы </w:t>
@@ -1179,7 +1465,6 @@
         <w:trPr>
           <w:cantSplit/>
           <w:trHeight w:val="454"/>
-          <w:tblHeader/>
         </w:trPr>
         <w:tc>
           <w:tcPr>
@@ -1278,6 +1563,83 @@
                 <w:b/>
               </w:rPr>
               <w:t>Участники</w:t>
+            </w:r>
+          </w:p>
+        </w:tc>
+      </w:tr>
+      <w:tr>
+        <w:trPr>
+          <w:trHeight w:val="454"/>
+        </w:trPr>
+        <w:tc>
+          <w:tcPr>
+            <w:tcW w:w="964" w:type="dxa"/>
+          </w:tcPr>
+          <w:p>
+            <w:pPr>
+              <w:keepNext/>
+              <w:ind w:firstLine="0"/>
+              <w:jc w:val="center"/>
+            </w:pPr>
+            <w:r>
+              <w:rPr>
+                <w:sz w:val="24"/>
+              </w:rPr>
+              <w:t>1</w:t>
+            </w:r>
+          </w:p>
+        </w:tc>
+        <w:tc>
+          <w:tcPr>
+            <w:tcW w:w="2041" w:type="dxa"/>
+          </w:tcPr>
+          <w:p>
+            <w:pPr>
+              <w:keepNext/>
+              <w:ind w:firstLine="0"/>
+              <w:jc w:val="center"/>
+            </w:pPr>
+            <w:r>
+              <w:rPr>
+                <w:sz w:val="24"/>
+              </w:rPr>
+              <w:t>2</w:t>
+            </w:r>
+          </w:p>
+        </w:tc>
+        <w:tc>
+          <w:tcPr>
+            <w:tcW w:w="3685" w:type="dxa"/>
+          </w:tcPr>
+          <w:p>
+            <w:pPr>
+              <w:keepNext/>
+              <w:ind w:firstLine="0"/>
+              <w:jc w:val="center"/>
+            </w:pPr>
+            <w:r>
+              <w:rPr>
+                <w:sz w:val="24"/>
+              </w:rPr>
+              <w:t>3</w:t>
+            </w:r>
+          </w:p>
+        </w:tc>
+        <w:tc>
+          <w:tcPr>
+            <w:tcW w:w="2948" w:type="dxa"/>
+          </w:tcPr>
+          <w:p>
+            <w:pPr>
+              <w:keepNext/>
+              <w:ind w:firstLine="0"/>
+              <w:jc w:val="center"/>
+            </w:pPr>
+            <w:r>
+              <w:rPr>
+                <w:sz w:val="24"/>
+              </w:rPr>
+              <w:t>4</w:t>
             </w:r>
           </w:p>
         </w:tc>
@@ -1833,54 +2195,137 @@
       <w:bookmarkEnd w:id="5"/>
     </w:p>
     <w:p>
-      <w:r>
-        <w:t>Для обработки одного чека требуется арифметическое агрегирование цен и скидок. При этом необходимо определить порядок округления. Суммирование двоичных чисел с плавающей точкой без явного денежного правила может давать нежелательные расхождения в копейках. В BasketNet для денежного расчёта используется модуль decimal с явным правилом округления ROUND_HALF_UP. В проекте денежные результаты формируются как строки с двумя знаками после запятой.</w:t>
-      </w:r>
+      <w:pPr>
+        <w:keepNext/>
+      </w:pPr>
     </w:p>
     <w:p>
       <w:r>
-        <w:t xml:space="preserve">Для анализа набора чеков полезен подсчёт совместных появлений товаров. В книге Дж. Лесковца, А. Раджарамана и Дж. Ульмана анализ частых </w:t>
-      </w:r>
-      <w:r>
+        <w:t xml:space="preserve">Для обработки одного чека требуется арифметическое агрегирование цен и скидок. При этом необходимо определить порядок округления. Суммирование двоичных чисел с плавающей точкой без явного денежного правила может давать нежелательные расхождения в копейках. В </w:t>
+      </w:r>
+      <w:r>
+        <w:rPr>
+          <w:i/>
+        </w:rPr>
+        <w:t>BasketNet</w:t>
+      </w:r>
+      <w:r>
+        <w:t xml:space="preserve"> для денежного расчёта используется модуль </w:t>
+      </w:r>
+      <w:r>
+        <w:rPr>
+          <w:i/>
+        </w:rPr>
+        <w:t>decimal</w:t>
+      </w:r>
+      <w:r>
+        <w:t xml:space="preserve"> с явным правилом округления </w:t>
+      </w:r>
+      <w:r>
+        <w:rPr>
+          <w:i/>
+        </w:rPr>
         <w:lastRenderedPageBreak/>
-        <w:t>наборов товаров рассматривается через поддержку сочетаний и достоверность ассоциативных правил [8]. Полный поиск наборов произвольной длины не является целью BasketNet. Реализован ограниченный анализ пар, достаточный для демонстрации сопутствующих покупок и удобный для проверки на небольших примерах.</w:t>
+        <w:t>ROUND_HALF_UP.</w:t>
+      </w:r>
+      <w:r>
+        <w:t xml:space="preserve"> В проекте денежные результаты формируются как строки с двумя знаками после запятой.</w:t>
       </w:r>
     </w:p>
     <w:p>
       <w:r>
-        <w:t xml:space="preserve">Каждый чек предварительно преобразуется во множество названий. Если один товар куплен в количестве нескольких единиц, это не увеличивает число его совместных появлений внутри того же чека. После этого подсчитываются одиночные товары и неупорядоченные пары. Для каждой пары вычисляются доля чеков с совместной покупкой, условные доли по обоим направлениям и коэффициент </w:t>
-      </w:r>
-      <w:r>
-        <w:rPr>
-          <w:i/>
-        </w:rPr>
-        <w:t>lift</w:t>
-      </w:r>
-      <w:r>
-        <w:t>. Эти показатели показывают структуру наблюдаемого набора, но сами по себе не доказывают причинную связь между покупками.</w:t>
+        <w:t xml:space="preserve">Для анализа набора чеков полезен подсчёт совместных появлений товаров. В книге Дж. Лесковца, А. Раджарамана и Дж. Ульмана анализ частых наборов товаров рассматривается через поддержку сочетаний и достоверность ассоциативных правил [8]. Полный поиск наборов произвольной длины не является целью </w:t>
+      </w:r>
+      <w:r>
+        <w:rPr>
+          <w:i/>
+        </w:rPr>
+        <w:t>BasketNet.</w:t>
+      </w:r>
+      <w:r>
+        <w:t xml:space="preserve"> Реализован ограниченный анализ пар, достаточный для демонстрации сопутствующих покупок и удобный для проверки на небольших примерах.</w:t>
       </w:r>
     </w:p>
     <w:p>
       <w:r>
-        <w:t xml:space="preserve">Сортировка позволяет упорядочить товары по цене либо другому числовому признаку. Частотный анализ текста подсчитывает слова в названиях и служит дополнительным способом агрегации. Он не заменяет учёт количества проданных единиц: словоформы не объединяются морфологически, а совпадение отдельных слов не гарантирует совпадения товарных позиций. Для точного структурированного анализа используется </w:t>
-      </w:r>
-      <w:r>
-        <w:rPr>
-          <w:i/>
-        </w:rPr>
-        <w:t>basket_affinity</w:t>
-      </w:r>
-      <w:r>
-        <w:t>.</w:t>
+        <w:t xml:space="preserve">Каждый чек предварительно преобразуется во множество названий. Если один товар куплен в количестве нескольких единиц, это не увеличивает число его совместных появлений внутри того же чека. После этого подсчитываются одиночные товары и неупорядоченные пары. Для каждой пары вычисляются доля чеков с совместной покупкой, условные доли по обоим направлениям и коэффициент </w:t>
+      </w:r>
+      <w:r>
+        <w:rPr>
+          <w:i/>
+        </w:rPr>
+        <w:t>lift</w:t>
+      </w:r>
+      <w:r>
+        <w:t>. Эти показатели показывают структуру наблюдаемого набора, но сами по себе не доказывают причинную связь между покупками.</w:t>
       </w:r>
     </w:p>
     <w:p>
       <w:r>
-        <w:t>Хеширование применяется для получения контрольной суммы документа чека. Свойства криптографических хеш-функций и их отличие от механизмов аутентификации рассматриваются в книге Ж.-Ф. Омассона [9]. В BasketNet функции SHA-256 и PBKDF2 вызываются через модуль hashlib. В проекте SHA-256 позволяет сопоставить сохранённый текст чека с его контрольной суммой. Наличие такого хеша не является электронной подписью, не подтверждает личность автора и не заменяет фискальную регистрацию.</w:t>
+        <w:t xml:space="preserve">Сортировка позволяет упорядочить товары по цене либо другому числовому признаку. Частотный анализ текста подсчитывает слова в названиях и служит дополнительным способом агрегации. Он не заменяет учёт количества проданных единиц: словоформы не объединяются морфологически, а совпадение отдельных слов не гарантирует совпадения товарных позиций. Для точного структурированного анализа используется </w:t>
+      </w:r>
+      <w:r>
+        <w:rPr>
+          <w:i/>
+        </w:rPr>
+        <w:t>basket_affinity</w:t>
+      </w:r>
+      <w:r>
+        <w:t>.</w:t>
       </w:r>
     </w:p>
     <w:p>
       <w:r>
+        <w:t xml:space="preserve">Хеширование применяется для получения контрольной суммы документа чека. Свойства криптографических хеш-функций и их отличие от механизмов аутентификации рассматриваются в книге Ж.-Ф. Омассона [9]. В </w:t>
+      </w:r>
+      <w:r>
+        <w:rPr>
+          <w:i/>
+        </w:rPr>
+        <w:t>BasketNet</w:t>
+      </w:r>
+      <w:r>
+        <w:t xml:space="preserve"> функции </w:t>
+      </w:r>
+      <w:r>
+        <w:rPr>
+          <w:i/>
+        </w:rPr>
+        <w:t>SHA-256</w:t>
+      </w:r>
+      <w:r>
+        <w:t xml:space="preserve"> и </w:t>
+      </w:r>
+      <w:r>
+        <w:rPr>
+          <w:i/>
+        </w:rPr>
+        <w:t>PBKDF2</w:t>
+      </w:r>
+      <w:r>
+        <w:t xml:space="preserve"> вызываются через модуль </w:t>
+      </w:r>
+      <w:r>
+        <w:rPr>
+          <w:i/>
+        </w:rPr>
+        <w:t>hashlib.</w:t>
+      </w:r>
+      <w:r>
+        <w:t xml:space="preserve"> В проекте </w:t>
+      </w:r>
+      <w:r>
+        <w:rPr>
+          <w:i/>
+        </w:rPr>
+        <w:t>SHA-256</w:t>
+      </w:r>
+      <w:r>
+        <w:t xml:space="preserve"> позволяет сопоставить сохранённый текст чека с его контрольной суммой. Наличие такого хеша не является электронной подписью, не подтверждает личность автора и не заменяет фискальную регистрацию.</w:t>
+      </w:r>
+    </w:p>
+    <w:p>
+      <w:r>
         <w:t xml:space="preserve">Операции </w:t>
       </w:r>
       <w:r>
@@ -1901,6 +2346,11 @@
       <w:r>
         <w:t xml:space="preserve"> сохраняются в составе вычислительного интерфейса в соответствии с заданием. Они используются в административной лаборатории для демонстрации выполнения параметризованных задач и выдачи больших целых чисел. В текущем магазине они не определяют стоимость реальной покупки и не вводят произвольные правила бонусной программы.</w:t>
       </w:r>
+    </w:p>
+    <w:p>
+      <w:pPr>
+        <w:keepNext/>
+      </w:pPr>
     </w:p>
     <w:p>
       <w:pPr>
@@ -1913,101 +2363,145 @@
       <w:bookmarkEnd w:id="6"/>
     </w:p>
     <w:p>
-      <w:r>
-        <w:rPr>
-          <w:i/>
-        </w:rPr>
-        <w:t>Python</w:t>
-      </w:r>
-      <w:r>
-        <w:t xml:space="preserve"> выбран благодаря наличию в стандартной библиотеке средств сокетного обмена, потоков, </w:t>
-      </w:r>
-      <w:r>
-        <w:rPr>
-          <w:i/>
-        </w:rPr>
-        <w:t>HTTP</w:t>
-      </w:r>
-      <w:r>
-        <w:t xml:space="preserve">-сервера, </w:t>
-      </w:r>
-      <w:r>
-        <w:rPr>
-          <w:i/>
-        </w:rPr>
-        <w:t>JSON</w:t>
-      </w:r>
-      <w:r>
-        <w:t xml:space="preserve">, криптографических функций и </w:t>
-      </w:r>
-      <w:r>
-        <w:rPr>
-          <w:i/>
-        </w:rPr>
-        <w:t>SQLite</w:t>
-      </w:r>
-      <w:r>
-        <w:t>. Это позволяет сосредоточить проект на алгоритмах взаимодействия, а не на настройке большого числа внешних зависимостей. При этом удобство языка не отменяет необходимости ограничивать размер входных данных и разделять сетевую координацию с тяжёлыми вычислениями.</w:t>
-      </w:r>
+      <w:pPr>
+        <w:keepNext/>
+      </w:pPr>
     </w:p>
     <w:p>
       <w:r>
-        <w:t xml:space="preserve">На стороне брокера создаются потоки приёма соединений, планировщика, контроля сроков и обработки </w:t>
-      </w:r>
-      <w:r>
-        <w:rPr>
-          <w:i/>
-        </w:rPr>
-        <w:t>heartbeat</w:t>
-      </w:r>
-      <w:r>
-        <w:t>. Состояние заданий и воркеров за</w:t>
+        <w:rPr>
+          <w:i/>
+        </w:rPr>
+        <w:t>Python</w:t>
+      </w:r>
+      <w:r>
+        <w:t xml:space="preserve"> выбран благодаря наличию в стандартной библиотеке средств сокетного обмена, потоков, </w:t>
+      </w:r>
+      <w:r>
+        <w:rPr>
+          <w:i/>
+        </w:rPr>
+        <w:t>HTTP</w:t>
+      </w:r>
+      <w:r>
+        <w:t xml:space="preserve">-сервера, </w:t>
+      </w:r>
+      <w:r>
+        <w:rPr>
+          <w:i/>
+        </w:rPr>
+        <w:t>JSON</w:t>
+      </w:r>
+      <w:r>
+        <w:t xml:space="preserve">, криптографических функций и </w:t>
+      </w:r>
+      <w:r>
+        <w:rPr>
+          <w:i/>
+        </w:rPr>
+        <w:t>SQLite</w:t>
+      </w:r>
+      <w:r>
+        <w:t xml:space="preserve">. Это позволяет сосредоточить проект на алгоритмах взаимодействия, а не на настройке большого числа внешних зависимостей. При этом удобство </w:t>
       </w:r>
       <w:r>
         <w:lastRenderedPageBreak/>
-        <w:t>щищено условной переменной с повторно входимой блокировкой. Исполнители запускаются отдельными процессами интерпретатора. Такая комбинация соответствует роли каждого механизма: потоки координируют ожидания, а процессы выполняют независимые задачи.</w:t>
+        <w:t>языка не отменяет необходимости ограничивать размер входных данных и разделять сетевую координацию с тяжёлыми вычислениями.</w:t>
       </w:r>
     </w:p>
     <w:p>
       <w:r>
-        <w:t xml:space="preserve">Для веб-интерфейса используются </w:t>
-      </w:r>
-      <w:r>
-        <w:rPr>
-          <w:i/>
-        </w:rPr>
-        <w:t>HTML</w:t>
-      </w:r>
-      <w:r>
-        <w:t xml:space="preserve">, </w:t>
-      </w:r>
-      <w:r>
-        <w:rPr>
-          <w:i/>
-        </w:rPr>
-        <w:t>CSS</w:t>
-      </w:r>
-      <w:r>
-        <w:t xml:space="preserve"> и </w:t>
-      </w:r>
-      <w:r>
-        <w:rPr>
-          <w:i/>
-        </w:rPr>
-        <w:t>JavaScript</w:t>
-      </w:r>
-      <w:r>
-        <w:t xml:space="preserve"> без внешнего клиентского фреймворка. Пользователю нужен браузер, а вычислительная часть остаётся на стороне воркеров. Каталог работает без входа, операции с корзиной и заказами привязаны к учётной записи. Административная роль предоставляет доступ к настройкам и диагностике через тот же сайт.</w:t>
+        <w:t xml:space="preserve">На стороне брокера создаются потоки приёма соединений, планировщика, контроля сроков и обработки </w:t>
+      </w:r>
+      <w:r>
+        <w:rPr>
+          <w:i/>
+        </w:rPr>
+        <w:t>heartbeat</w:t>
+      </w:r>
+      <w:r>
+        <w:t>. Состояние заданий и воркеров защищено условной переменной с повторно входимой блокировкой. Исполнители запускаются отдельными процессами интерпретатора. Такая комбинация соответствует роли каждого механизма: потоки координируют ожидания, а процессы выполняют независимые задачи.</w:t>
       </w:r>
     </w:p>
     <w:p>
       <w:r>
-        <w:t>SQLite используется для постоянного хранения прикладных данных. Это встроенная СУБД, поддерживающая транзакционное изменение базы. Принципы фиксации, отката и изоляции SQL-транзакций рассматриваются в книге А. Болье [10]. Для учебного варианта с одним процессом веб-сервера она не требует отдельной службы. Взаимодействующие обработчики используют одну защищённую блокировкой связь с базой; очередь брокера при этом хранится отдельно в памяти и не становится долговечной вследствие наличия SQLite.</w:t>
+        <w:t xml:space="preserve">Для веб-интерфейса используются </w:t>
+      </w:r>
+      <w:r>
+        <w:rPr>
+          <w:i/>
+        </w:rPr>
+        <w:t>HTML</w:t>
+      </w:r>
+      <w:r>
+        <w:t xml:space="preserve">, </w:t>
+      </w:r>
+      <w:r>
+        <w:rPr>
+          <w:i/>
+        </w:rPr>
+        <w:t>CSS</w:t>
+      </w:r>
+      <w:r>
+        <w:t xml:space="preserve"> и </w:t>
+      </w:r>
+      <w:r>
+        <w:rPr>
+          <w:i/>
+        </w:rPr>
+        <w:t>JavaScript</w:t>
+      </w:r>
+      <w:r>
+        <w:t xml:space="preserve"> без внешнего клиентского фреймворка. Пользователю нужен браузер, а вычислительная часть остаётся на стороне воркеров. Каталог работает без входа, операции с корзиной и заказами привязаны к учётной записи. Административная роль предоставляет доступ к настройкам и диагностике через тот же сайт.</w:t>
       </w:r>
     </w:p>
     <w:p>
       <w:r>
-        <w:t>Применение стандартного HTTP-сервера упрощает демонстрационное развёртывание, но ограничивает назначение стенда. В текущем проекте не реализована инфраструктура публичного сервиса с HTTPS, внешним прокси и промышленным сопровождением. Область применения стенда ограничивается доверенной локальной сетью. Публичный магазин с реальными платежами в текущую разработку не входит.</w:t>
+        <w:rPr>
+          <w:i/>
+        </w:rPr>
+        <w:t>SQLite</w:t>
+      </w:r>
+      <w:r>
+        <w:t xml:space="preserve"> используется для постоянного хранения прикладных данных. Это встроенная СУБД, поддерживающая транзакционное изменение базы. Принципы фиксации, отката и изоляции </w:t>
+      </w:r>
+      <w:r>
+        <w:rPr>
+          <w:i/>
+        </w:rPr>
+        <w:t>SQL-</w:t>
+      </w:r>
+      <w:r>
+        <w:t xml:space="preserve">транзакций рассматриваются в книге А. Болье [10]. Для учебного варианта с одним процессом веб-сервера она не требует отдельной службы. Взаимодействующие обработчики используют одну защищённую блокировкой связь с базой; очередь брокера при этом хранится отдельно в памяти и не становится долговечной вследствие наличия </w:t>
+      </w:r>
+      <w:r>
+        <w:rPr>
+          <w:i/>
+        </w:rPr>
+        <w:t>SQLite.</w:t>
+      </w:r>
+    </w:p>
+    <w:p>
+      <w:r>
+        <w:t xml:space="preserve">Применение стандартного </w:t>
+      </w:r>
+      <w:r>
+        <w:rPr>
+          <w:i/>
+        </w:rPr>
+        <w:t>HTTP-</w:t>
+      </w:r>
+      <w:r>
+        <w:t xml:space="preserve">сервера упрощает демонстрационное развёртывание, но ограничивает назначение стенда. В текущем проекте не реализована инфраструктура публичного сервиса с </w:t>
+      </w:r>
+      <w:r>
+        <w:rPr>
+          <w:i/>
+        </w:rPr>
+        <w:t>HTTPS</w:t>
+      </w:r>
+      <w:r>
+        <w:t>, внешним прокси и промышленным сопровождением. Область применения стенда ограничивается доверенной локальной сетью. Публичный магазин с реальными платежами в текущую разработку не входит.</w:t>
       </w:r>
     </w:p>
     <w:p>
@@ -2027,7 +2521,11 @@
     <w:p>
       <w:pPr>
         <w:keepNext/>
-        <w:spacing w:before="240"/>
+      </w:pPr>
+    </w:p>
+    <w:p>
+      <w:pPr>
+        <w:keepNext/>
       </w:pPr>
       <w:r>
         <w:t>Таблица 1.3 - Программные средства</w:t>
@@ -2056,7 +2554,6 @@
         <w:trPr>
           <w:cantSplit/>
           <w:trHeight w:val="454"/>
-          <w:tblHeader/>
         </w:trPr>
         <w:tc>
           <w:tcPr>
@@ -2130,6 +2627,65 @@
                 <w:b/>
               </w:rPr>
               <w:t>Причина выбора</w:t>
+            </w:r>
+          </w:p>
+        </w:tc>
+      </w:tr>
+      <w:tr>
+        <w:trPr>
+          <w:trHeight w:val="454"/>
+        </w:trPr>
+        <w:tc>
+          <w:tcPr>
+            <w:tcW w:w="1871" w:type="dxa"/>
+          </w:tcPr>
+          <w:p>
+            <w:pPr>
+              <w:keepNext/>
+              <w:ind w:firstLine="0"/>
+              <w:jc w:val="center"/>
+            </w:pPr>
+            <w:r>
+              <w:rPr>
+                <w:sz w:val="24"/>
+              </w:rPr>
+              <w:t>1</w:t>
+            </w:r>
+          </w:p>
+        </w:tc>
+        <w:tc>
+          <w:tcPr>
+            <w:tcW w:w="3402" w:type="dxa"/>
+          </w:tcPr>
+          <w:p>
+            <w:pPr>
+              <w:keepNext/>
+              <w:ind w:firstLine="0"/>
+              <w:jc w:val="center"/>
+            </w:pPr>
+            <w:r>
+              <w:rPr>
+                <w:sz w:val="24"/>
+              </w:rPr>
+              <w:t>2</w:t>
+            </w:r>
+          </w:p>
+        </w:tc>
+        <w:tc>
+          <w:tcPr>
+            <w:tcW w:w="4365" w:type="dxa"/>
+          </w:tcPr>
+          <w:p>
+            <w:pPr>
+              <w:keepNext/>
+              <w:ind w:firstLine="0"/>
+              <w:jc w:val="center"/>
+            </w:pPr>
+            <w:r>
+              <w:rPr>
+                <w:sz w:val="24"/>
+              </w:rPr>
+              <w:t>3</w:t>
             </w:r>
           </w:p>
         </w:tc>
@@ -2394,6 +2950,95 @@
             </w:pPr>
             <w:r>
               <w:t>Независимость вычислений и возможность разных ПК</w:t>
+            </w:r>
+          </w:p>
+        </w:tc>
+      </w:tr>
+    </w:tbl>
+    <w:p>
+      <w:pPr>
+        <w:keepNext/>
+        <w:pageBreakBefore/>
+      </w:pPr>
+      <w:r>
+        <w:lastRenderedPageBreak/>
+        <w:t>Продолжение таблицы 1.3</w:t>
+      </w:r>
+    </w:p>
+    <w:tbl>
+      <w:tblPr>
+        <w:tblW w:w="0" w:type="auto"/>
+        <w:tblBorders>
+          <w:top w:val="single" w:sz="5" w:space="0" w:color="777777"/>
+          <w:left w:val="single" w:sz="5" w:space="0" w:color="777777"/>
+          <w:bottom w:val="single" w:sz="5" w:space="0" w:color="777777"/>
+          <w:right w:val="single" w:sz="5" w:space="0" w:color="777777"/>
+          <w:insideH w:val="single" w:sz="5" w:space="0" w:color="777777"/>
+          <w:insideV w:val="single" w:sz="5" w:space="0" w:color="777777"/>
+        </w:tblBorders>
+        <w:tblLayout w:type="fixed"/>
+        <w:tblLook w:val="04A0" w:firstRow="1" w:lastRow="0" w:firstColumn="1" w:lastColumn="0" w:noHBand="0" w:noVBand="1"/>
+      </w:tblPr>
+      <w:tblGrid>
+        <w:gridCol w:w="1871"/>
+        <w:gridCol w:w="3402"/>
+        <w:gridCol w:w="4365"/>
+      </w:tblGrid>
+      <w:tr>
+        <w:trPr>
+          <w:trHeight w:val="454"/>
+        </w:trPr>
+        <w:tc>
+          <w:tcPr>
+            <w:tcW w:w="1871" w:type="dxa"/>
+          </w:tcPr>
+          <w:p>
+            <w:pPr>
+              <w:keepNext/>
+              <w:ind w:firstLine="0"/>
+              <w:jc w:val="center"/>
+            </w:pPr>
+            <w:r>
+              <w:rPr>
+                <w:sz w:val="24"/>
+              </w:rPr>
+              <w:t>1</w:t>
+            </w:r>
+          </w:p>
+        </w:tc>
+        <w:tc>
+          <w:tcPr>
+            <w:tcW w:w="3402" w:type="dxa"/>
+          </w:tcPr>
+          <w:p>
+            <w:pPr>
+              <w:keepNext/>
+              <w:ind w:firstLine="0"/>
+              <w:jc w:val="center"/>
+            </w:pPr>
+            <w:r>
+              <w:rPr>
+                <w:sz w:val="24"/>
+              </w:rPr>
+              <w:t>2</w:t>
+            </w:r>
+          </w:p>
+        </w:tc>
+        <w:tc>
+          <w:tcPr>
+            <w:tcW w:w="4365" w:type="dxa"/>
+          </w:tcPr>
+          <w:p>
+            <w:pPr>
+              <w:keepNext/>
+              <w:ind w:firstLine="0"/>
+              <w:jc w:val="center"/>
+            </w:pPr>
+            <w:r>
+              <w:rPr>
+                <w:sz w:val="24"/>
+              </w:rPr>
+              <w:t>3</w:t>
             </w:r>
           </w:p>
         </w:tc>
@@ -2681,10 +3326,14 @@
       </w:pPr>
       <w:bookmarkStart w:id="7" w:name="ExcerptHeading7"/>
       <w:r>
-        <w:lastRenderedPageBreak/>
         <w:t>1.6 Выводы и требования к проектируемой системе</w:t>
       </w:r>
       <w:bookmarkEnd w:id="7"/>
+    </w:p>
+    <w:p>
+      <w:pPr>
+        <w:keepNext/>
+      </w:pPr>
     </w:p>
     <w:p>
       <w:r>
@@ -2755,94 +3404,1436 @@
     </w:p>
     <w:p>
       <w:pPr>
-        <w:spacing w:after="140"/>
-        <w:rPr>
-          <w:lang w:val="en-US"/>
-        </w:rPr>
+        <w:keepNext/>
       </w:pPr>
-      <w:r>
-        <w:t>1. Fowler, M. Python Concurrency with asyncio / M. Fowler. - Shelter Island : Manning Publications, 2022. - 376 p. - ISBN 978-1-61729-866-0.</w:t>
-      </w:r>
     </w:p>
     <w:p>
       <w:pPr>
-        <w:spacing w:after="140"/>
         <w:rPr>
           <w:lang w:val="en-US"/>
         </w:rPr>
       </w:pPr>
       <w:r>
-        <w:t>2. Van Steen, M. Distributed Systems / M. van Steen, A. S. Tanenbaum. - 4th ed. - distributed-systems.net, 2023. - 684 p. - ISBN 978-90-815406-3-6.</w:t>
+        <w:t xml:space="preserve">1. </w:t>
+      </w:r>
+      <w:r>
+        <w:rPr>
+          <w:i/>
+        </w:rPr>
+        <w:t>Fowler</w:t>
+      </w:r>
+      <w:r>
+        <w:t xml:space="preserve">, </w:t>
+      </w:r>
+      <w:r>
+        <w:rPr>
+          <w:i/>
+        </w:rPr>
+        <w:t>M.</w:t>
+      </w:r>
+      <w:r>
+        <w:t xml:space="preserve"> </w:t>
+      </w:r>
+      <w:r>
+        <w:rPr>
+          <w:i/>
+        </w:rPr>
+        <w:t>Python</w:t>
+      </w:r>
+      <w:r>
+        <w:t xml:space="preserve"> </w:t>
+      </w:r>
+      <w:r>
+        <w:rPr>
+          <w:i/>
+        </w:rPr>
+        <w:t>Concurrency</w:t>
+      </w:r>
+      <w:r>
+        <w:t xml:space="preserve"> </w:t>
+      </w:r>
+      <w:r>
+        <w:rPr>
+          <w:i/>
+        </w:rPr>
+        <w:t>with</w:t>
+      </w:r>
+      <w:r>
+        <w:t xml:space="preserve"> </w:t>
+      </w:r>
+      <w:r>
+        <w:rPr>
+          <w:i/>
+        </w:rPr>
+        <w:t>asyncio</w:t>
+      </w:r>
+      <w:r>
+        <w:t xml:space="preserve"> / </w:t>
+      </w:r>
+      <w:r>
+        <w:rPr>
+          <w:i/>
+        </w:rPr>
+        <w:t>M.</w:t>
+      </w:r>
+      <w:r>
+        <w:t xml:space="preserve"> </w:t>
+      </w:r>
+      <w:r>
+        <w:rPr>
+          <w:i/>
+        </w:rPr>
+        <w:t>Fowler.</w:t>
+      </w:r>
+      <w:r>
+        <w:t xml:space="preserve"> - </w:t>
+      </w:r>
+      <w:r>
+        <w:rPr>
+          <w:i/>
+        </w:rPr>
+        <w:t>Shelter</w:t>
+      </w:r>
+      <w:r>
+        <w:t xml:space="preserve"> </w:t>
+      </w:r>
+      <w:r>
+        <w:rPr>
+          <w:i/>
+        </w:rPr>
+        <w:t>Island</w:t>
+      </w:r>
+      <w:r>
+        <w:t xml:space="preserve"> : </w:t>
+      </w:r>
+      <w:r>
+        <w:rPr>
+          <w:i/>
+        </w:rPr>
+        <w:t>Manning</w:t>
+      </w:r>
+      <w:r>
+        <w:t xml:space="preserve"> </w:t>
+      </w:r>
+      <w:r>
+        <w:rPr>
+          <w:i/>
+        </w:rPr>
+        <w:t>Publications</w:t>
+      </w:r>
+      <w:r>
+        <w:t xml:space="preserve">, 2022. - 376 </w:t>
+      </w:r>
+      <w:r>
+        <w:rPr>
+          <w:i/>
+        </w:rPr>
+        <w:t>p.</w:t>
+      </w:r>
+      <w:r>
+        <w:t xml:space="preserve"> - </w:t>
+      </w:r>
+      <w:r>
+        <w:rPr>
+          <w:i/>
+        </w:rPr>
+        <w:t>ISBN</w:t>
+      </w:r>
+      <w:r>
+        <w:t xml:space="preserve"> 978-1-61729-866-0.</w:t>
       </w:r>
     </w:p>
     <w:p>
       <w:pPr>
-        <w:spacing w:after="140"/>
+        <w:rPr>
+          <w:lang w:val="en-US"/>
+        </w:rPr>
       </w:pPr>
       <w:r>
-        <w:t>3. Consumer Acknowledgements and Publisher Confirms [Электронный ресурс] / RabbitMQ. - Режим доступа: https://www.rabbitmq.com/docs/confirms. - Дата доступа: 21.10.2026.</w:t>
+        <w:t xml:space="preserve">2. </w:t>
+      </w:r>
+      <w:r>
+        <w:rPr>
+          <w:i/>
+        </w:rPr>
+        <w:t>Van</w:t>
+      </w:r>
+      <w:r>
+        <w:t xml:space="preserve"> </w:t>
+      </w:r>
+      <w:r>
+        <w:rPr>
+          <w:i/>
+        </w:rPr>
+        <w:t>Steen</w:t>
+      </w:r>
+      <w:r>
+        <w:t xml:space="preserve">, </w:t>
+      </w:r>
+      <w:r>
+        <w:rPr>
+          <w:i/>
+        </w:rPr>
+        <w:t>M.</w:t>
+      </w:r>
+      <w:r>
+        <w:t xml:space="preserve"> </w:t>
+      </w:r>
+      <w:r>
+        <w:rPr>
+          <w:i/>
+        </w:rPr>
+        <w:t>Distributed</w:t>
+      </w:r>
+      <w:r>
+        <w:t xml:space="preserve"> </w:t>
+      </w:r>
+      <w:r>
+        <w:rPr>
+          <w:i/>
+        </w:rPr>
+        <w:t>Systems</w:t>
+      </w:r>
+      <w:r>
+        <w:t xml:space="preserve"> / </w:t>
+      </w:r>
+      <w:r>
+        <w:rPr>
+          <w:i/>
+        </w:rPr>
+        <w:t>M.</w:t>
+      </w:r>
+      <w:r>
+        <w:t xml:space="preserve"> </w:t>
+      </w:r>
+      <w:r>
+        <w:rPr>
+          <w:i/>
+        </w:rPr>
+        <w:t>van</w:t>
+      </w:r>
+      <w:r>
+        <w:t xml:space="preserve"> </w:t>
+      </w:r>
+      <w:r>
+        <w:rPr>
+          <w:i/>
+        </w:rPr>
+        <w:t>Steen</w:t>
+      </w:r>
+      <w:r>
+        <w:t xml:space="preserve">, </w:t>
+      </w:r>
+      <w:r>
+        <w:rPr>
+          <w:i/>
+        </w:rPr>
+        <w:t>A.</w:t>
+      </w:r>
+      <w:r>
+        <w:t xml:space="preserve"> </w:t>
+      </w:r>
+      <w:r>
+        <w:rPr>
+          <w:i/>
+        </w:rPr>
+        <w:t>S.</w:t>
+      </w:r>
+      <w:r>
+        <w:t xml:space="preserve"> </w:t>
+      </w:r>
+      <w:r>
+        <w:rPr>
+          <w:i/>
+        </w:rPr>
+        <w:t>Tanenbaum.</w:t>
+      </w:r>
+      <w:r>
+        <w:t xml:space="preserve"> - 4</w:t>
+      </w:r>
+      <w:r>
+        <w:rPr>
+          <w:i/>
+        </w:rPr>
+        <w:t>th</w:t>
+      </w:r>
+      <w:r>
+        <w:t xml:space="preserve"> </w:t>
+      </w:r>
+      <w:r>
+        <w:rPr>
+          <w:i/>
+        </w:rPr>
+        <w:t>ed.</w:t>
+      </w:r>
+      <w:r>
+        <w:t xml:space="preserve"> - </w:t>
+      </w:r>
+      <w:r>
+        <w:rPr>
+          <w:i/>
+        </w:rPr>
+        <w:t>distributed-systems.net</w:t>
+      </w:r>
+      <w:r>
+        <w:t xml:space="preserve">, 2023. - 684 </w:t>
+      </w:r>
+      <w:r>
+        <w:rPr>
+          <w:i/>
+        </w:rPr>
+        <w:t>p.</w:t>
+      </w:r>
+      <w:r>
+        <w:t xml:space="preserve"> - </w:t>
+      </w:r>
+      <w:r>
+        <w:rPr>
+          <w:i/>
+        </w:rPr>
+        <w:t>ISBN</w:t>
+      </w:r>
+      <w:r>
+        <w:t xml:space="preserve"> 978-90-815406-3-6.</w:t>
+      </w:r>
+    </w:p>
+    <w:p>
+      <w:r>
+        <w:t xml:space="preserve">3. </w:t>
+      </w:r>
+      <w:r>
+        <w:rPr>
+          <w:i/>
+        </w:rPr>
+        <w:t>Consumer</w:t>
+      </w:r>
+      <w:r>
+        <w:t xml:space="preserve"> </w:t>
+      </w:r>
+      <w:r>
+        <w:rPr>
+          <w:i/>
+        </w:rPr>
+        <w:t>Acknowledgements</w:t>
+      </w:r>
+      <w:r>
+        <w:t xml:space="preserve"> </w:t>
+      </w:r>
+      <w:r>
+        <w:rPr>
+          <w:i/>
+        </w:rPr>
+        <w:t>and</w:t>
+      </w:r>
+      <w:r>
+        <w:t xml:space="preserve"> </w:t>
+      </w:r>
+      <w:r>
+        <w:rPr>
+          <w:i/>
+        </w:rPr>
+        <w:t>Publisher</w:t>
+      </w:r>
+      <w:r>
+        <w:t xml:space="preserve"> </w:t>
+      </w:r>
+      <w:r>
+        <w:rPr>
+          <w:i/>
+        </w:rPr>
+        <w:t>Confirms</w:t>
+      </w:r>
+      <w:r>
+        <w:t xml:space="preserve"> [Электронный ресурс] / </w:t>
+      </w:r>
+      <w:r>
+        <w:rPr>
+          <w:i/>
+        </w:rPr>
+        <w:t>RabbitMQ.</w:t>
+      </w:r>
+      <w:r>
+        <w:t xml:space="preserve"> - Режим доступа: </w:t>
+      </w:r>
+      <w:r>
+        <w:rPr>
+          <w:i/>
+        </w:rPr>
+        <w:t>https://www.rabbitmq.com/docs/confirms.</w:t>
+      </w:r>
+      <w:r>
+        <w:t xml:space="preserve"> - Дата доступа: 21.10.2026.</w:t>
+      </w:r>
+    </w:p>
+    <w:p>
+      <w:r>
+        <w:t xml:space="preserve">4. </w:t>
+      </w:r>
+      <w:r>
+        <w:rPr>
+          <w:i/>
+        </w:rPr>
+        <w:t>Introduction</w:t>
+      </w:r>
+      <w:r>
+        <w:t xml:space="preserve"> </w:t>
+      </w:r>
+      <w:r>
+        <w:rPr>
+          <w:i/>
+        </w:rPr>
+        <w:t>to</w:t>
+      </w:r>
+      <w:r>
+        <w:t xml:space="preserve"> </w:t>
+      </w:r>
+      <w:r>
+        <w:rPr>
+          <w:i/>
+        </w:rPr>
+        <w:t>Celery</w:t>
+      </w:r>
+      <w:r>
+        <w:t xml:space="preserve"> [Электронный ресурс] / </w:t>
+      </w:r>
+      <w:r>
+        <w:rPr>
+          <w:i/>
+        </w:rPr>
+        <w:t>Celery.</w:t>
+      </w:r>
+      <w:r>
+        <w:t xml:space="preserve"> - Режим доступа: </w:t>
+      </w:r>
+      <w:r>
+        <w:rPr>
+          <w:i/>
+        </w:rPr>
+        <w:t>https://docs.celeryq.dev/en/stable/getting-started/introduction.html.</w:t>
+      </w:r>
+      <w:r>
+        <w:t xml:space="preserve"> - Дата доступа: 21.10.2026.</w:t>
+      </w:r>
+    </w:p>
+    <w:p>
+      <w:r>
+        <w:t xml:space="preserve">5. </w:t>
+      </w:r>
+      <w:r>
+        <w:rPr>
+          <w:i/>
+        </w:rPr>
+        <w:t>Introduction</w:t>
+      </w:r>
+      <w:r>
+        <w:t xml:space="preserve"> </w:t>
+      </w:r>
+      <w:r>
+        <w:rPr>
+          <w:i/>
+        </w:rPr>
+        <w:t>to</w:t>
+      </w:r>
+      <w:r>
+        <w:t xml:space="preserve"> </w:t>
+      </w:r>
+      <w:r>
+        <w:rPr>
+          <w:i/>
+        </w:rPr>
+        <w:t>Algorithms</w:t>
+      </w:r>
+      <w:r>
+        <w:t xml:space="preserve"> / </w:t>
+      </w:r>
+      <w:r>
+        <w:rPr>
+          <w:i/>
+        </w:rPr>
+        <w:t>T.</w:t>
+      </w:r>
+      <w:r>
+        <w:t xml:space="preserve"> </w:t>
+      </w:r>
+      <w:r>
+        <w:rPr>
+          <w:i/>
+        </w:rPr>
+        <w:t>H.</w:t>
+      </w:r>
+      <w:r>
+        <w:t xml:space="preserve"> </w:t>
+      </w:r>
+      <w:r>
+        <w:rPr>
+          <w:i/>
+        </w:rPr>
+        <w:t>Cormen</w:t>
+      </w:r>
+      <w:r>
+        <w:t xml:space="preserve">, </w:t>
+      </w:r>
+      <w:r>
+        <w:rPr>
+          <w:i/>
+        </w:rPr>
+        <w:t>C.</w:t>
+      </w:r>
+      <w:r>
+        <w:t xml:space="preserve"> </w:t>
+      </w:r>
+      <w:r>
+        <w:rPr>
+          <w:i/>
+        </w:rPr>
+        <w:t>E.</w:t>
+      </w:r>
+      <w:r>
+        <w:t xml:space="preserve"> </w:t>
+      </w:r>
+      <w:r>
+        <w:rPr>
+          <w:i/>
+        </w:rPr>
+        <w:t>Leiserson</w:t>
+      </w:r>
+      <w:r>
+        <w:t xml:space="preserve">, </w:t>
+      </w:r>
+      <w:r>
+        <w:rPr>
+          <w:i/>
+        </w:rPr>
+        <w:t>R.</w:t>
+      </w:r>
+      <w:r>
+        <w:t xml:space="preserve"> </w:t>
+      </w:r>
+      <w:r>
+        <w:rPr>
+          <w:i/>
+        </w:rPr>
+        <w:t>L.</w:t>
+      </w:r>
+      <w:r>
+        <w:t xml:space="preserve"> </w:t>
+      </w:r>
+      <w:r>
+        <w:rPr>
+          <w:i/>
+        </w:rPr>
+        <w:t>Rivest</w:t>
+      </w:r>
+      <w:r>
+        <w:t xml:space="preserve">, </w:t>
+      </w:r>
+      <w:r>
+        <w:rPr>
+          <w:i/>
+        </w:rPr>
+        <w:t>C.</w:t>
+      </w:r>
+      <w:r>
+        <w:t xml:space="preserve"> </w:t>
+      </w:r>
+      <w:r>
+        <w:rPr>
+          <w:i/>
+        </w:rPr>
+        <w:t>Stein.</w:t>
+      </w:r>
+      <w:r>
+        <w:t xml:space="preserve"> - 4</w:t>
+      </w:r>
+      <w:r>
+        <w:rPr>
+          <w:i/>
+        </w:rPr>
+        <w:t>th</w:t>
+      </w:r>
+      <w:r>
+        <w:t xml:space="preserve"> </w:t>
+      </w:r>
+      <w:r>
+        <w:rPr>
+          <w:i/>
+        </w:rPr>
+        <w:t>ed.</w:t>
+      </w:r>
+      <w:r>
+        <w:t xml:space="preserve"> - </w:t>
+      </w:r>
+      <w:r>
+        <w:rPr>
+          <w:i/>
+        </w:rPr>
+        <w:t>Cambridge</w:t>
+      </w:r>
+      <w:r>
+        <w:t xml:space="preserve">, </w:t>
+      </w:r>
+      <w:r>
+        <w:rPr>
+          <w:i/>
+        </w:rPr>
+        <w:t>Massachusetts</w:t>
+      </w:r>
+      <w:r>
+        <w:t xml:space="preserve"> : </w:t>
+      </w:r>
+      <w:r>
+        <w:rPr>
+          <w:i/>
+        </w:rPr>
+        <w:t>The</w:t>
+      </w:r>
+      <w:r>
+        <w:t xml:space="preserve"> </w:t>
+      </w:r>
+      <w:r>
+        <w:rPr>
+          <w:i/>
+        </w:rPr>
+        <w:t>MIT</w:t>
+      </w:r>
+      <w:r>
+        <w:t xml:space="preserve"> </w:t>
+      </w:r>
+      <w:r>
+        <w:rPr>
+          <w:i/>
+        </w:rPr>
+        <w:t>Press</w:t>
+      </w:r>
+      <w:r>
+        <w:t xml:space="preserve">, 2022. - 1312 </w:t>
+      </w:r>
+      <w:r>
+        <w:rPr>
+          <w:i/>
+        </w:rPr>
+        <w:t>p.</w:t>
+      </w:r>
+      <w:r>
+        <w:t xml:space="preserve"> - </w:t>
+      </w:r>
+      <w:r>
+        <w:rPr>
+          <w:i/>
+        </w:rPr>
+        <w:t>ISBN</w:t>
+      </w:r>
+      <w:r>
+        <w:t xml:space="preserve"> 978-0-262-04630-5.</w:t>
+      </w:r>
+    </w:p>
+    <w:p>
+      <w:r>
+        <w:t xml:space="preserve">6. </w:t>
+      </w:r>
+      <w:r>
+        <w:rPr>
+          <w:i/>
+        </w:rPr>
+        <w:t>Kurose</w:t>
+      </w:r>
+      <w:r>
+        <w:t xml:space="preserve">, </w:t>
+      </w:r>
+      <w:r>
+        <w:rPr>
+          <w:i/>
+        </w:rPr>
+        <w:t>J.</w:t>
+      </w:r>
+      <w:r>
+        <w:t xml:space="preserve"> </w:t>
+      </w:r>
+      <w:r>
+        <w:rPr>
+          <w:i/>
+        </w:rPr>
+        <w:t>F.</w:t>
+      </w:r>
+      <w:r>
+        <w:t xml:space="preserve"> </w:t>
+      </w:r>
+      <w:r>
+        <w:rPr>
+          <w:i/>
+        </w:rPr>
+        <w:t>Computer</w:t>
+      </w:r>
+      <w:r>
+        <w:t xml:space="preserve"> </w:t>
+      </w:r>
+      <w:r>
+        <w:rPr>
+          <w:i/>
+        </w:rPr>
+        <w:t>Networking:</w:t>
+      </w:r>
+      <w:r>
+        <w:t xml:space="preserve"> </w:t>
+      </w:r>
+      <w:r>
+        <w:rPr>
+          <w:i/>
+        </w:rPr>
+        <w:t>A</w:t>
+      </w:r>
+      <w:r>
+        <w:t xml:space="preserve"> </w:t>
+      </w:r>
+      <w:r>
+        <w:rPr>
+          <w:i/>
+        </w:rPr>
+        <w:t>Top-Down</w:t>
+      </w:r>
+      <w:r>
+        <w:t xml:space="preserve"> </w:t>
+      </w:r>
+      <w:r>
+        <w:rPr>
+          <w:i/>
+        </w:rPr>
+        <w:t>Approach</w:t>
+      </w:r>
+      <w:r>
+        <w:t xml:space="preserve"> / </w:t>
+      </w:r>
+      <w:r>
+        <w:rPr>
+          <w:i/>
+        </w:rPr>
+        <w:t>J.</w:t>
+      </w:r>
+      <w:r>
+        <w:t xml:space="preserve"> </w:t>
+      </w:r>
+      <w:r>
+        <w:rPr>
+          <w:i/>
+        </w:rPr>
+        <w:t>F.</w:t>
+      </w:r>
+      <w:r>
+        <w:t xml:space="preserve"> </w:t>
+      </w:r>
+      <w:r>
+        <w:rPr>
+          <w:i/>
+        </w:rPr>
+        <w:t>Kurose</w:t>
+      </w:r>
+      <w:r>
+        <w:t xml:space="preserve">, </w:t>
+      </w:r>
+      <w:r>
+        <w:rPr>
+          <w:i/>
+        </w:rPr>
+        <w:t>K.</w:t>
+      </w:r>
+      <w:r>
+        <w:t xml:space="preserve"> </w:t>
+      </w:r>
+      <w:r>
+        <w:rPr>
+          <w:i/>
+        </w:rPr>
+        <w:t>W.</w:t>
+      </w:r>
+      <w:r>
+        <w:t xml:space="preserve"> </w:t>
+      </w:r>
+      <w:r>
+        <w:rPr>
+          <w:i/>
+        </w:rPr>
+        <w:t>Ross.</w:t>
+      </w:r>
+      <w:r>
+        <w:t xml:space="preserve"> - 8</w:t>
+      </w:r>
+      <w:r>
+        <w:rPr>
+          <w:i/>
+        </w:rPr>
+        <w:t>th</w:t>
+      </w:r>
+      <w:r>
+        <w:t xml:space="preserve"> </w:t>
+      </w:r>
+      <w:r>
+        <w:rPr>
+          <w:i/>
+        </w:rPr>
+        <w:t>ed.</w:t>
+      </w:r>
+      <w:r>
+        <w:t xml:space="preserve"> - </w:t>
+      </w:r>
+      <w:r>
+        <w:rPr>
+          <w:i/>
+        </w:rPr>
+        <w:t>Pearson</w:t>
+      </w:r>
+      <w:r>
+        <w:t xml:space="preserve">, 2021. - 764 </w:t>
+      </w:r>
+      <w:r>
+        <w:rPr>
+          <w:i/>
+        </w:rPr>
+        <w:t>p.</w:t>
+      </w:r>
+      <w:r>
+        <w:t xml:space="preserve"> - </w:t>
+      </w:r>
+      <w:r>
+        <w:rPr>
+          <w:i/>
+        </w:rPr>
+        <w:t>ISBN</w:t>
+      </w:r>
+      <w:r>
+        <w:t xml:space="preserve"> 978-0-13-668155-7.</w:t>
+      </w:r>
+    </w:p>
+    <w:p>
+      <w:r>
+        <w:t xml:space="preserve">7. </w:t>
+      </w:r>
+      <w:r>
+        <w:rPr>
+          <w:i/>
+        </w:rPr>
+        <w:t>HTML</w:t>
+      </w:r>
+      <w:r>
+        <w:t xml:space="preserve"> </w:t>
+      </w:r>
+      <w:r>
+        <w:rPr>
+          <w:i/>
+        </w:rPr>
+        <w:t>Living</w:t>
+      </w:r>
+      <w:r>
+        <w:t xml:space="preserve"> </w:t>
+      </w:r>
+      <w:r>
+        <w:rPr>
+          <w:i/>
+        </w:rPr>
+        <w:t>Standard.</w:t>
+      </w:r>
+      <w:r>
+        <w:t xml:space="preserve"> </w:t>
+      </w:r>
+      <w:r>
+        <w:rPr>
+          <w:i/>
+        </w:rPr>
+        <w:t>Server-sent</w:t>
+      </w:r>
+      <w:r>
+        <w:t xml:space="preserve"> </w:t>
+      </w:r>
+      <w:r>
+        <w:rPr>
+          <w:i/>
+        </w:rPr>
+        <w:t>events</w:t>
+      </w:r>
+      <w:r>
+        <w:t xml:space="preserve"> [Электронный ресурс] / </w:t>
+      </w:r>
+      <w:r>
+        <w:rPr>
+          <w:i/>
+        </w:rPr>
+        <w:t>WHATWG.</w:t>
+      </w:r>
+      <w:r>
+        <w:t xml:space="preserve"> - Режим доступа: </w:t>
+      </w:r>
+      <w:r>
+        <w:rPr>
+          <w:i/>
+        </w:rPr>
+        <w:t>https://html.spec.whatwg.org/multipage/server-sent-events.html.</w:t>
+      </w:r>
+      <w:r>
+        <w:t xml:space="preserve"> - Дата доступа: 21.10.2026.</w:t>
+      </w:r>
+    </w:p>
+    <w:p>
+      <w:r>
+        <w:t xml:space="preserve">8. </w:t>
+      </w:r>
+      <w:r>
+        <w:rPr>
+          <w:i/>
+        </w:rPr>
+        <w:t>Leskovec</w:t>
+      </w:r>
+      <w:r>
+        <w:t xml:space="preserve">, </w:t>
+      </w:r>
+      <w:r>
+        <w:rPr>
+          <w:i/>
+        </w:rPr>
+        <w:t>J.</w:t>
+      </w:r>
+      <w:r>
+        <w:t xml:space="preserve"> </w:t>
+      </w:r>
+      <w:r>
+        <w:rPr>
+          <w:i/>
+        </w:rPr>
+        <w:t>Mining</w:t>
+      </w:r>
+      <w:r>
+        <w:t xml:space="preserve"> </w:t>
+      </w:r>
+      <w:r>
+        <w:rPr>
+          <w:i/>
+        </w:rPr>
+        <w:t>of</w:t>
+      </w:r>
+      <w:r>
+        <w:t xml:space="preserve"> </w:t>
+      </w:r>
+      <w:r>
+        <w:rPr>
+          <w:i/>
+        </w:rPr>
+        <w:t>Massive</w:t>
+      </w:r>
+      <w:r>
+        <w:t xml:space="preserve"> </w:t>
+      </w:r>
+      <w:r>
+        <w:rPr>
+          <w:i/>
+        </w:rPr>
+        <w:t>Datasets</w:t>
+      </w:r>
+      <w:r>
+        <w:t xml:space="preserve"> / </w:t>
+      </w:r>
+      <w:r>
+        <w:rPr>
+          <w:i/>
+        </w:rPr>
+        <w:t>J.</w:t>
+      </w:r>
+      <w:r>
+        <w:t xml:space="preserve"> </w:t>
+      </w:r>
+      <w:r>
+        <w:rPr>
+          <w:i/>
+        </w:rPr>
+        <w:t>Leskovec</w:t>
+      </w:r>
+      <w:r>
+        <w:t xml:space="preserve">, </w:t>
+      </w:r>
+      <w:r>
+        <w:rPr>
+          <w:i/>
+        </w:rPr>
+        <w:t>A.</w:t>
+      </w:r>
+      <w:r>
+        <w:t xml:space="preserve"> </w:t>
+      </w:r>
+      <w:r>
+        <w:rPr>
+          <w:i/>
+        </w:rPr>
+        <w:t>Rajaraman</w:t>
+      </w:r>
+      <w:r>
+        <w:t xml:space="preserve">, </w:t>
+      </w:r>
+      <w:r>
+        <w:rPr>
+          <w:i/>
+        </w:rPr>
+        <w:t>J.</w:t>
+      </w:r>
+      <w:r>
+        <w:t xml:space="preserve"> </w:t>
+      </w:r>
+      <w:r>
+        <w:rPr>
+          <w:i/>
+        </w:rPr>
+        <w:t>D.</w:t>
+      </w:r>
+      <w:r>
+        <w:t xml:space="preserve"> </w:t>
+      </w:r>
+      <w:r>
+        <w:rPr>
+          <w:i/>
+        </w:rPr>
+        <w:t>Ullman.</w:t>
+      </w:r>
+      <w:r>
+        <w:t xml:space="preserve"> - 3</w:t>
+      </w:r>
+      <w:r>
+        <w:rPr>
+          <w:i/>
+        </w:rPr>
+        <w:t>rd</w:t>
+      </w:r>
+      <w:r>
+        <w:t xml:space="preserve"> </w:t>
+      </w:r>
+      <w:r>
+        <w:rPr>
+          <w:i/>
+        </w:rPr>
+        <w:t>ed.</w:t>
+      </w:r>
+      <w:r>
+        <w:t xml:space="preserve"> - </w:t>
+      </w:r>
+      <w:r>
+        <w:rPr>
+          <w:i/>
+        </w:rPr>
+        <w:t>Cambridge</w:t>
+      </w:r>
+      <w:r>
+        <w:t xml:space="preserve"> : </w:t>
+      </w:r>
+      <w:r>
+        <w:rPr>
+          <w:i/>
+        </w:rPr>
+        <w:t>Cambridge</w:t>
+      </w:r>
+      <w:r>
+        <w:t xml:space="preserve"> </w:t>
+      </w:r>
+      <w:r>
+        <w:rPr>
+          <w:i/>
+        </w:rPr>
+        <w:t>University</w:t>
+      </w:r>
+      <w:r>
+        <w:t xml:space="preserve"> </w:t>
+      </w:r>
+      <w:r>
+        <w:rPr>
+          <w:i/>
+        </w:rPr>
+        <w:t>Press</w:t>
+      </w:r>
+      <w:r>
+        <w:t xml:space="preserve">, 2020. - 566 </w:t>
+      </w:r>
+      <w:r>
+        <w:rPr>
+          <w:i/>
+        </w:rPr>
+        <w:t>p.</w:t>
+      </w:r>
+      <w:r>
+        <w:t xml:space="preserve"> - </w:t>
+      </w:r>
+      <w:r>
+        <w:rPr>
+          <w:i/>
+        </w:rPr>
+        <w:t>ISBN</w:t>
+      </w:r>
+      <w:r>
+        <w:t xml:space="preserve"> 978-1-108-47634-8.</w:t>
       </w:r>
     </w:p>
     <w:p>
       <w:pPr>
-        <w:spacing w:after="140"/>
+        <w:rPr>
+          <w:lang w:val="en-US"/>
+        </w:rPr>
       </w:pPr>
       <w:r>
-        <w:t>4. Introduction to Celery [Электронный ресурс] / Celery. - Режим доступа: https://docs.celeryq.dev/en/stable/getting-started/introduction.html. - Дата доступа: 21.10.2026.</w:t>
+        <w:t xml:space="preserve">9. </w:t>
+      </w:r>
+      <w:r>
+        <w:rPr>
+          <w:i/>
+        </w:rPr>
+        <w:t>Aumasson</w:t>
+      </w:r>
+      <w:r>
+        <w:t xml:space="preserve">, </w:t>
+      </w:r>
+      <w:r>
+        <w:rPr>
+          <w:i/>
+        </w:rPr>
+        <w:t>J.-P.</w:t>
+      </w:r>
+      <w:r>
+        <w:t xml:space="preserve"> </w:t>
+      </w:r>
+      <w:r>
+        <w:rPr>
+          <w:i/>
+        </w:rPr>
+        <w:t>Serious</w:t>
+      </w:r>
+      <w:r>
+        <w:t xml:space="preserve"> </w:t>
+      </w:r>
+      <w:r>
+        <w:rPr>
+          <w:i/>
+        </w:rPr>
+        <w:t>Cryptography:</w:t>
+      </w:r>
+      <w:r>
+        <w:t xml:space="preserve"> </w:t>
+      </w:r>
+      <w:r>
+        <w:rPr>
+          <w:i/>
+        </w:rPr>
+        <w:t>A</w:t>
+      </w:r>
+      <w:r>
+        <w:t xml:space="preserve"> </w:t>
+      </w:r>
+      <w:r>
+        <w:rPr>
+          <w:i/>
+        </w:rPr>
+        <w:t>Practical</w:t>
+      </w:r>
+      <w:r>
+        <w:t xml:space="preserve"> </w:t>
+      </w:r>
+      <w:r>
+        <w:rPr>
+          <w:i/>
+        </w:rPr>
+        <w:t>Introduction</w:t>
+      </w:r>
+      <w:r>
+        <w:t xml:space="preserve"> </w:t>
+      </w:r>
+      <w:r>
+        <w:rPr>
+          <w:i/>
+        </w:rPr>
+        <w:t>to</w:t>
+      </w:r>
+      <w:r>
+        <w:t xml:space="preserve"> </w:t>
+      </w:r>
+      <w:r>
+        <w:rPr>
+          <w:i/>
+        </w:rPr>
+        <w:t>Modern</w:t>
+      </w:r>
+      <w:r>
+        <w:t xml:space="preserve"> </w:t>
+      </w:r>
+      <w:r>
+        <w:rPr>
+          <w:i/>
+        </w:rPr>
+        <w:t>Encryption</w:t>
+      </w:r>
+      <w:r>
+        <w:t xml:space="preserve"> / </w:t>
+      </w:r>
+      <w:r>
+        <w:rPr>
+          <w:i/>
+        </w:rPr>
+        <w:t>J.-P.</w:t>
+      </w:r>
+      <w:r>
+        <w:t xml:space="preserve"> </w:t>
+      </w:r>
+      <w:r>
+        <w:rPr>
+          <w:i/>
+        </w:rPr>
+        <w:t>Aumasson.</w:t>
+      </w:r>
+      <w:r>
+        <w:t xml:space="preserve"> - 2</w:t>
+      </w:r>
+      <w:r>
+        <w:rPr>
+          <w:i/>
+        </w:rPr>
+        <w:t>nd</w:t>
+      </w:r>
+      <w:r>
+        <w:t xml:space="preserve"> </w:t>
+      </w:r>
+      <w:r>
+        <w:rPr>
+          <w:i/>
+        </w:rPr>
+        <w:t>ed.</w:t>
+      </w:r>
+      <w:r>
+        <w:t xml:space="preserve"> - </w:t>
+      </w:r>
+      <w:r>
+        <w:rPr>
+          <w:i/>
+        </w:rPr>
+        <w:t>San</w:t>
+      </w:r>
+      <w:r>
+        <w:t xml:space="preserve"> </w:t>
+      </w:r>
+      <w:r>
+        <w:rPr>
+          <w:i/>
+        </w:rPr>
+        <w:t>Francisco</w:t>
+      </w:r>
+      <w:r>
+        <w:t xml:space="preserve"> : </w:t>
+      </w:r>
+      <w:r>
+        <w:rPr>
+          <w:i/>
+        </w:rPr>
+        <w:t>No</w:t>
+      </w:r>
+      <w:r>
+        <w:t xml:space="preserve"> </w:t>
+      </w:r>
+      <w:r>
+        <w:rPr>
+          <w:i/>
+        </w:rPr>
+        <w:t>Starch</w:t>
+      </w:r>
+      <w:r>
+        <w:t xml:space="preserve"> </w:t>
+      </w:r>
+      <w:r>
+        <w:rPr>
+          <w:i/>
+        </w:rPr>
+        <w:t>Press</w:t>
+      </w:r>
+      <w:r>
+        <w:t xml:space="preserve">, 2024. - 376 </w:t>
+      </w:r>
+      <w:r>
+        <w:rPr>
+          <w:i/>
+        </w:rPr>
+        <w:t>p.</w:t>
+      </w:r>
+      <w:r>
+        <w:t xml:space="preserve"> - </w:t>
+      </w:r>
+      <w:r>
+        <w:rPr>
+          <w:i/>
+        </w:rPr>
+        <w:t>ISBN</w:t>
+      </w:r>
+      <w:r>
+        <w:t xml:space="preserve"> 978-1-71850-384-7.</w:t>
       </w:r>
     </w:p>
     <w:p>
       <w:pPr>
-        <w:spacing w:after="140"/>
+        <w:rPr>
+          <w:lang w:val="en-US"/>
+        </w:rPr>
       </w:pPr>
       <w:r>
-        <w:t>5. Introduction to Algorithms / T. H. Cormen, C. E. Leiserson, R. L. Rivest, C. Stein. - 4th ed. - Cambridge, Massachusetts : The MIT Press, 2022. - 1312 p. - ISBN 978-0-262-04630-5.</w:t>
-      </w:r>
-    </w:p>
-    <w:p>
-      <w:pPr>
-        <w:spacing w:after="140"/>
-      </w:pPr>
-      <w:r>
-        <w:t>6. Kurose, J. F. Computer Networking: A Top-Down Approach / J. F. Kurose, K. W. Ross. - 8th ed. - Pearson, 2021. - 764 p. - ISBN 978-0-13-668155-7.</w:t>
-      </w:r>
-    </w:p>
-    <w:p>
-      <w:pPr>
-        <w:spacing w:after="140"/>
-      </w:pPr>
-      <w:r>
-        <w:t>7. HTML Living Standard. Server-sent events [Электронный ресурс] / WHATWG. - Режим доступа: https://html.spec.whatwg.org/multipage/server-sent-events.html. - Дата доступа: 21.10.2026.</w:t>
-      </w:r>
-    </w:p>
-    <w:p>
-      <w:pPr>
-        <w:spacing w:after="140"/>
-      </w:pPr>
-      <w:r>
-        <w:t>8. Leskovec, J. Mining of Massive Datasets / J. Leskovec, A. Rajaraman, J. D. Ullman. - 3rd ed. - Cambridge : Cambridge University Press, 2020. - 566 p. - ISBN 978-1-108-47634-8.</w:t>
-      </w:r>
-    </w:p>
-    <w:p>
-      <w:pPr>
-        <w:spacing w:after="140"/>
-        <w:rPr>
-          <w:lang w:val="en-US"/>
-        </w:rPr>
-      </w:pPr>
-      <w:r>
-        <w:t>9. Aumasson, J.-P. Serious Cryptography: A Practical Introduction to Modern Encryption / J.-P. Aumasson. - 2nd ed. - San Francisco : No Starch Press, 2024. - 376 p. - ISBN 978-1-71850-384-7.</w:t>
-      </w:r>
-    </w:p>
-    <w:p>
-      <w:pPr>
-        <w:spacing w:after="140"/>
-        <w:rPr>
-          <w:lang w:val="en-US"/>
-        </w:rPr>
-      </w:pPr>
-      <w:r>
-        <w:t>10. Beaulieu, A. Learning SQL: Generate, Manipulate, and Retrieve Data / A. Beaulieu. - 3rd ed. - Sebastopol : O’Reilly Media, 2020. - 380 p. - ISBN 978-1-492-05761-1.</w:t>
+        <w:t xml:space="preserve">10. </w:t>
+      </w:r>
+      <w:r>
+        <w:rPr>
+          <w:i/>
+        </w:rPr>
+        <w:t>Beaulieu</w:t>
+      </w:r>
+      <w:r>
+        <w:t xml:space="preserve">, </w:t>
+      </w:r>
+      <w:r>
+        <w:rPr>
+          <w:i/>
+        </w:rPr>
+        <w:t>A.</w:t>
+      </w:r>
+      <w:r>
+        <w:t xml:space="preserve"> </w:t>
+      </w:r>
+      <w:r>
+        <w:rPr>
+          <w:i/>
+        </w:rPr>
+        <w:t>Learning</w:t>
+      </w:r>
+      <w:r>
+        <w:t xml:space="preserve"> </w:t>
+      </w:r>
+      <w:r>
+        <w:rPr>
+          <w:i/>
+        </w:rPr>
+        <w:t>SQL:</w:t>
+      </w:r>
+      <w:r>
+        <w:t xml:space="preserve"> </w:t>
+      </w:r>
+      <w:r>
+        <w:rPr>
+          <w:i/>
+        </w:rPr>
+        <w:t>Generate</w:t>
+      </w:r>
+      <w:r>
+        <w:t xml:space="preserve">, </w:t>
+      </w:r>
+      <w:r>
+        <w:rPr>
+          <w:i/>
+        </w:rPr>
+        <w:t>Manipulate</w:t>
+      </w:r>
+      <w:r>
+        <w:t xml:space="preserve">, </w:t>
+      </w:r>
+      <w:r>
+        <w:rPr>
+          <w:i/>
+        </w:rPr>
+        <w:t>and</w:t>
+      </w:r>
+      <w:r>
+        <w:t xml:space="preserve"> </w:t>
+      </w:r>
+      <w:r>
+        <w:rPr>
+          <w:i/>
+        </w:rPr>
+        <w:t>Retrieve</w:t>
+      </w:r>
+      <w:r>
+        <w:t xml:space="preserve"> </w:t>
+      </w:r>
+      <w:r>
+        <w:rPr>
+          <w:i/>
+        </w:rPr>
+        <w:t>Data</w:t>
+      </w:r>
+      <w:r>
+        <w:t xml:space="preserve"> / </w:t>
+      </w:r>
+      <w:r>
+        <w:rPr>
+          <w:i/>
+        </w:rPr>
+        <w:t>A.</w:t>
+      </w:r>
+      <w:r>
+        <w:t xml:space="preserve"> </w:t>
+      </w:r>
+      <w:r>
+        <w:rPr>
+          <w:i/>
+        </w:rPr>
+        <w:t>Beaulieu.</w:t>
+      </w:r>
+      <w:r>
+        <w:t xml:space="preserve"> - 3</w:t>
+      </w:r>
+      <w:r>
+        <w:rPr>
+          <w:i/>
+        </w:rPr>
+        <w:t>rd</w:t>
+      </w:r>
+      <w:r>
+        <w:t xml:space="preserve"> </w:t>
+      </w:r>
+      <w:r>
+        <w:rPr>
+          <w:i/>
+        </w:rPr>
+        <w:t>ed.</w:t>
+      </w:r>
+      <w:r>
+        <w:t xml:space="preserve"> - </w:t>
+      </w:r>
+      <w:r>
+        <w:rPr>
+          <w:i/>
+        </w:rPr>
+        <w:t>Sebastopol</w:t>
+      </w:r>
+      <w:r>
+        <w:t xml:space="preserve"> : </w:t>
+      </w:r>
+      <w:r>
+        <w:rPr>
+          <w:i/>
+        </w:rPr>
+        <w:t>O’Reilly</w:t>
+      </w:r>
+      <w:r>
+        <w:t xml:space="preserve"> </w:t>
+      </w:r>
+      <w:r>
+        <w:rPr>
+          <w:i/>
+        </w:rPr>
+        <w:t>Media</w:t>
+      </w:r>
+      <w:r>
+        <w:t xml:space="preserve">, 2020. - 380 </w:t>
+      </w:r>
+      <w:r>
+        <w:rPr>
+          <w:i/>
+        </w:rPr>
+        <w:t>p.</w:t>
+      </w:r>
+      <w:r>
+        <w:t xml:space="preserve"> - </w:t>
+      </w:r>
+      <w:r>
+        <w:rPr>
+          <w:i/>
+        </w:rPr>
+        <w:t>ISBN</w:t>
+      </w:r>
+      <w:r>
+        <w:t xml:space="preserve"> 978-1-492-05761-1.</w:t>
       </w:r>
     </w:p>
     <w:sectPr>
@@ -3562,7 +5553,6 @@
       <w:keepLines/>
       <w:pageBreakBefore/>
       <w:suppressAutoHyphens/>
-      <w:spacing w:before="280" w:after="280"/>
       <w:ind w:left="919" w:hanging="210"/>
       <w:jc w:val="left"/>
       <w:outlineLvl w:val="0"/>
@@ -3587,7 +5577,6 @@
       <w:keepNext/>
       <w:keepLines/>
       <w:suppressAutoHyphens/>
-      <w:spacing w:before="280" w:after="280"/>
       <w:ind w:left="1129" w:hanging="420"/>
       <w:jc w:val="left"/>
       <w:outlineLvl w:val="1"/>
@@ -3612,7 +5601,6 @@
       <w:keepNext/>
       <w:keepLines/>
       <w:suppressAutoHyphens/>
-      <w:spacing w:before="280" w:after="280"/>
       <w:outlineLvl w:val="2"/>
     </w:pPr>
     <w:rPr>
@@ -3634,7 +5622,6 @@
     <w:pPr>
       <w:keepNext/>
       <w:keepLines/>
-      <w:spacing w:before="200"/>
       <w:outlineLvl w:val="3"/>
     </w:pPr>
     <w:rPr>
@@ -3659,7 +5646,6 @@
     <w:pPr>
       <w:keepNext/>
       <w:keepLines/>
-      <w:spacing w:before="200"/>
       <w:outlineLvl w:val="4"/>
     </w:pPr>
     <w:rPr>
@@ -3680,7 +5666,6 @@
     <w:pPr>
       <w:keepNext/>
       <w:keepLines/>
-      <w:spacing w:before="200"/>
       <w:outlineLvl w:val="5"/>
     </w:pPr>
     <w:rPr>
@@ -3703,7 +5688,6 @@
     <w:pPr>
       <w:keepNext/>
       <w:keepLines/>
-      <w:spacing w:before="200"/>
       <w:outlineLvl w:val="6"/>
     </w:pPr>
     <w:rPr>
@@ -3726,7 +5710,6 @@
     <w:pPr>
       <w:keepNext/>
       <w:keepLines/>
-      <w:spacing w:before="200"/>
       <w:outlineLvl w:val="7"/>
     </w:pPr>
     <w:rPr>
@@ -3749,7 +5732,6 @@
     <w:pPr>
       <w:keepNext/>
       <w:keepLines/>
-      <w:spacing w:before="200"/>
       <w:outlineLvl w:val="8"/>
     </w:pPr>
     <w:rPr>
@@ -3895,7 +5877,6 @@
     <w:pPr>
       <w:keepNext/>
       <w:suppressAutoHyphens/>
-      <w:spacing w:before="280" w:after="280"/>
       <w:contextualSpacing/>
     </w:pPr>
     <w:rPr>
@@ -3979,9 +5960,6 @@
     <w:uiPriority w:val="99"/>
     <w:unhideWhenUsed/>
     <w:rsid w:val="00AA1D8D"/>
-    <w:pPr>
-      <w:spacing w:after="120"/>
-    </w:pPr>
   </w:style>
   <w:style w:type="character" w:customStyle="1" w:styleId="af0">
     <w:name w:val="Основной текст Знак"/>
@@ -3998,7 +5976,7 @@
     <w:unhideWhenUsed/>
     <w:rsid w:val="00AA1D8D"/>
     <w:pPr>
-      <w:spacing w:after="120" w:line="480" w:lineRule="auto"/>
+      <w:spacing w:line="480" w:lineRule="auto"/>
     </w:pPr>
   </w:style>
   <w:style w:type="character" w:customStyle="1" w:styleId="24">
@@ -4015,9 +5993,6 @@
     <w:uiPriority w:val="99"/>
     <w:unhideWhenUsed/>
     <w:rsid w:val="00AA1D8D"/>
-    <w:pPr>
-      <w:spacing w:after="120"/>
-    </w:pPr>
     <w:rPr>
       <w:sz w:val="16"/>
       <w:szCs w:val="16"/>
@@ -4152,7 +6127,6 @@
     <w:unhideWhenUsed/>
     <w:rsid w:val="0029639D"/>
     <w:pPr>
-      <w:spacing w:after="120"/>
       <w:ind w:left="360"/>
       <w:contextualSpacing/>
     </w:pPr>
@@ -4164,7 +6138,6 @@
     <w:unhideWhenUsed/>
     <w:rsid w:val="0029639D"/>
     <w:pPr>
-      <w:spacing w:after="120"/>
       <w:ind w:left="720"/>
       <w:contextualSpacing/>
     </w:pPr>
@@ -4176,7 +6149,6 @@
     <w:unhideWhenUsed/>
     <w:rsid w:val="0029639D"/>
     <w:pPr>
-      <w:spacing w:after="120"/>
       <w:ind w:left="1080"/>
       <w:contextualSpacing/>
     </w:pPr>
@@ -4197,6 +6169,7 @@
         <w:tab w:val="left" w:pos="3456"/>
         <w:tab w:val="left" w:pos="4032"/>
       </w:tabs>
+      <w:spacing w:after="0"/>
     </w:pPr>
     <w:rPr>
       <w:rFonts w:ascii="Courier" w:hAnsi="Courier"/>
@@ -4338,7 +6311,6 @@
     <w:qFormat/>
     <w:rsid w:val="00FC693F"/>
     <w:pPr>
-      <w:spacing w:before="160" w:after="280"/>
       <w:ind w:firstLine="0"/>
       <w:jc w:val="center"/>
     </w:pPr>
@@ -4378,7 +6350,6 @@
     <w:qFormat/>
     <w:rsid w:val="00FC693F"/>
     <w:pPr>
-      <w:spacing w:before="200" w:after="280"/>
       <w:ind w:left="936" w:right="936"/>
     </w:pPr>
     <w:rPr>
@@ -14542,7 +16513,7 @@
       <w:keepNext/>
       <w:pageBreakBefore/>
       <w:suppressAutoHyphens/>
-      <w:spacing w:after="280" w:line="264" w:lineRule="auto"/>
+      <w:spacing w:after="0" w:line="264" w:lineRule="auto"/>
       <w:jc w:val="center"/>
     </w:pPr>
     <w:rPr>
@@ -14600,7 +16571,7 @@
   <w:style w:type="paragraph" w:customStyle="1" w:styleId="Small">
     <w:name w:val="Small"/>
     <w:pPr>
-      <w:spacing w:after="80" w:line="240" w:lineRule="auto"/>
+      <w:spacing w:after="0" w:line="240" w:lineRule="auto"/>
     </w:pPr>
     <w:rPr>
       <w:rFonts w:ascii="Times New Roman" w:eastAsia="Times New Roman" w:hAnsi="Times New Roman" w:cs="Times New Roman"/>
@@ -14628,7 +16599,7 @@
         <w:tab w:val="right" w:leader="dot" w:pos="9638"/>
       </w:tabs>
       <w:suppressAutoHyphens/>
-      <w:spacing w:after="20" w:line="240" w:lineRule="auto"/>
+      <w:spacing w:after="0" w:line="240" w:lineRule="auto"/>
     </w:pPr>
     <w:rPr>
       <w:rFonts w:ascii="Times New Roman" w:eastAsia="Times New Roman" w:hAnsi="Times New Roman" w:cs="Times New Roman"/>
@@ -14644,7 +16615,7 @@
         <w:tab w:val="right" w:leader="dot" w:pos="9638"/>
       </w:tabs>
       <w:suppressAutoHyphens/>
-      <w:spacing w:after="20" w:line="240" w:lineRule="auto"/>
+      <w:spacing w:after="0" w:line="240" w:lineRule="auto"/>
       <w:ind w:left="709"/>
     </w:pPr>
     <w:rPr>

</xml_diff>

<commit_message>
docs: preserve author's table caption and numbering corrections
</commit_message>
<xml_diff>
--- a/docs/coursework/ПЗ_Белковец.docx
+++ b/docs/coursework/ПЗ_Белковец.docx
@@ -406,7 +406,15 @@
         <w:ind w:left="709" w:firstLine="0"/>
       </w:pPr>
       <w:r>
-        <w:t xml:space="preserve">- организовать контроль работоспособности воркеров по </w:t>
+        <w:t xml:space="preserve">- организовать контроль работоспособности </w:t>
+      </w:r>
+      <w:proofErr w:type="spellStart"/>
+      <w:r>
+        <w:t>воркеров</w:t>
+      </w:r>
+      <w:proofErr w:type="spellEnd"/>
+      <w:r>
+        <w:t xml:space="preserve"> по </w:t>
       </w:r>
       <w:r>
         <w:rPr>
@@ -447,18 +455,28 @@
       <w:r>
         <w:t xml:space="preserve">Программный комплекс получил название </w:t>
       </w:r>
+      <w:proofErr w:type="spellStart"/>
       <w:r>
         <w:rPr>
           <w:i/>
         </w:rPr>
         <w:t>BasketNet</w:t>
       </w:r>
+      <w:proofErr w:type="spellEnd"/>
       <w:r>
         <w:t xml:space="preserve">. Пользовательская часть представлена веб-магазином: посетитель просматривает каталог, после </w:t>
       </w:r>
       <w:r>
         <w:lastRenderedPageBreak/>
-        <w:t>входа собирает корзину, применяет купон и оформляет учебный заказ. В административной части доступны каталог, настройки купонов, аналитика, состояние воркеров и генератор тестовых заказов. Такая организация связывает распределённые вычисления с предметной областью и позволяет наблюдать прохождение транзакции от ввода до получения чека.</w:t>
+        <w:t xml:space="preserve">входа собирает корзину, применяет купон и оформляет учебный заказ. В административной части доступны каталог, настройки купонов, аналитика, состояние </w:t>
+      </w:r>
+      <w:proofErr w:type="spellStart"/>
+      <w:r>
+        <w:t>воркеров</w:t>
+      </w:r>
+      <w:proofErr w:type="spellEnd"/>
+      <w:r>
+        <w:t xml:space="preserve"> и генератор тестовых заказов. Такая организация связывает распределённые вычисления с предметной областью и позволяет наблюдать прохождение транзакции от ввода до получения чека.</w:t>
       </w:r>
     </w:p>
     <w:p>
@@ -492,12 +510,14 @@
       <w:r>
         <w:t xml:space="preserve">, стандартные средства многопоточности, </w:t>
       </w:r>
+      <w:proofErr w:type="spellStart"/>
       <w:r>
         <w:rPr>
           <w:i/>
         </w:rPr>
         <w:t>SQLite</w:t>
       </w:r>
+      <w:proofErr w:type="spellEnd"/>
       <w:r>
         <w:t xml:space="preserve">, </w:t>
       </w:r>
@@ -589,26 +609,52 @@
         <w:t>Python</w:t>
       </w:r>
       <w:r>
-        <w:t xml:space="preserve"> это также не равнозначно запуску независимых интерпретаторов. В книге М. Фаулера рассмотрены различия потоков, процессов и асинхронного исполнения; поэтому в </w:t>
-      </w:r>
+        <w:t xml:space="preserve"> это также не равнозначно запуску независимых интерпретаторов. В книге М. </w:t>
+      </w:r>
+      <w:proofErr w:type="spellStart"/>
+      <w:r>
+        <w:t>Фаулера</w:t>
+      </w:r>
+      <w:proofErr w:type="spellEnd"/>
+      <w:r>
+        <w:t xml:space="preserve"> рассмотрены различия потоков, процессов и асинхронного исполнения; поэтому в </w:t>
+      </w:r>
+      <w:proofErr w:type="spellStart"/>
       <w:r>
         <w:rPr>
           <w:i/>
         </w:rPr>
         <w:t>BasketNet</w:t>
       </w:r>
+      <w:proofErr w:type="spellEnd"/>
       <w:r>
         <w:t xml:space="preserve"> многопоточность используется преимущественно для сетевого обслуживания и управления [1].</w:t>
       </w:r>
     </w:p>
     <w:p>
       <w:r>
-        <w:t>В архитектуре с брокером клиент передаёт описание задания посреднику. Брокер проверяет запрос, помещает его в очередь и назначает исполнителя. Воркер получает данные, выполняет операцию и возвращает результат. Клиент может получать сведения о ходе работы независимо от продолжительности вычисления. Добавление исполнителя увеличивает доступный вычислительный ресурс без изменения формата запроса. Разделение компонентов, обмен сообщениями и обработка частичных отказов относятся к основным вопросам построения распределённых систем [2].</w:t>
+        <w:t xml:space="preserve">В архитектуре с брокером клиент передаёт описание задания посреднику. Брокер проверяет запрос, помещает его в очередь и назначает исполнителя. </w:t>
+      </w:r>
+      <w:proofErr w:type="spellStart"/>
+      <w:r>
+        <w:t>Воркер</w:t>
+      </w:r>
+      <w:proofErr w:type="spellEnd"/>
+      <w:r>
+        <w:t xml:space="preserve"> получает данные, выполняет операцию и возвращает результат. Клиент может получать сведения о ходе работы независимо от продолжительности вычисления. Добавление исполнителя увеличивает доступный вычислительный ресурс без изменения формата запроса. Разделение компонентов, обмен сообщениями и обработка частичных отказов относятся к основным вопросам построения распределённых систем [2].</w:t>
       </w:r>
     </w:p>
     <w:p>
       <w:r>
-        <w:t>Для рассматриваемой задачи брокер является центром принятия решений о назначении работ. Он знает приоритет, состояние и номер попытки каждого задания, а также доступность исполнителей. Воркеры не выбирают произвольные задания из базы и не изменяют сведения о заказе напрямую. Это уменьшает число мест, в которых требуется разрешать конфликты состояния, и делает поведение при отказе наблюдаемым.</w:t>
+        <w:t xml:space="preserve">Для рассматриваемой задачи брокер является центром принятия решений о назначении работ. Он знает приоритет, состояние и номер попытки каждого задания, а также доступность исполнителей. </w:t>
+      </w:r>
+      <w:proofErr w:type="spellStart"/>
+      <w:r>
+        <w:t>Воркеры</w:t>
+      </w:r>
+      <w:proofErr w:type="spellEnd"/>
+      <w:r>
+        <w:t xml:space="preserve"> не выбирают произвольные задания из базы и не изменяют сведения о заказе напрямую. Это уменьшает число мест, в которых требуется разрешать конфликты состояния, и делает поведение при отказе наблюдаемым.</w:t>
       </w:r>
     </w:p>
     <w:p>
@@ -626,7 +672,13 @@
         <w:keepNext/>
       </w:pPr>
       <w:r>
-        <w:t>Таблица 1.1 - Сравнение способов организации обработки</w:t>
+        <w:t xml:space="preserve">Таблица 1.1 </w:t>
+      </w:r>
+      <w:r>
+        <w:t xml:space="preserve">– Сравнение </w:t>
+      </w:r>
+      <w:r>
+        <w:t>способов организации обработки</w:t>
       </w:r>
     </w:p>
     <w:tbl>
@@ -725,65 +777,6 @@
                 <w:b/>
               </w:rPr>
               <w:t>Ограничения</w:t>
-            </w:r>
-          </w:p>
-        </w:tc>
-      </w:tr>
-      <w:tr>
-        <w:trPr>
-          <w:trHeight w:val="454"/>
-        </w:trPr>
-        <w:tc>
-          <w:tcPr>
-            <w:tcW w:w="1984" w:type="dxa"/>
-          </w:tcPr>
-          <w:p>
-            <w:pPr>
-              <w:keepNext/>
-              <w:ind w:firstLine="0"/>
-              <w:jc w:val="center"/>
-            </w:pPr>
-            <w:r>
-              <w:rPr>
-                <w:sz w:val="24"/>
-              </w:rPr>
-              <w:t>1</w:t>
-            </w:r>
-          </w:p>
-        </w:tc>
-        <w:tc>
-          <w:tcPr>
-            <w:tcW w:w="3685" w:type="dxa"/>
-          </w:tcPr>
-          <w:p>
-            <w:pPr>
-              <w:keepNext/>
-              <w:ind w:firstLine="0"/>
-              <w:jc w:val="center"/>
-            </w:pPr>
-            <w:r>
-              <w:rPr>
-                <w:sz w:val="24"/>
-              </w:rPr>
-              <w:t>2</w:t>
-            </w:r>
-          </w:p>
-        </w:tc>
-        <w:tc>
-          <w:tcPr>
-            <w:tcW w:w="3969" w:type="dxa"/>
-          </w:tcPr>
-          <w:p>
-            <w:pPr>
-              <w:keepNext/>
-              <w:ind w:firstLine="0"/>
-              <w:jc w:val="center"/>
-            </w:pPr>
-            <w:r>
-              <w:rPr>
-                <w:sz w:val="24"/>
-              </w:rPr>
-              <w:t>3</w:t>
             </w:r>
           </w:p>
         </w:tc>
@@ -956,8 +949,13 @@
               <w:pStyle w:val="TableText"/>
             </w:pPr>
             <w:r>
-              <w:t>Брокер и процессы-воркеры</w:t>
+              <w:t>Брокер и процессы-</w:t>
             </w:r>
+            <w:proofErr w:type="spellStart"/>
+            <w:r>
+              <w:t>воркеры</w:t>
+            </w:r>
+            <w:proofErr w:type="spellEnd"/>
           </w:p>
         </w:tc>
         <w:tc>
@@ -1073,14 +1071,32 @@
       <w:r>
         <w:t xml:space="preserve">Для </w:t>
       </w:r>
+      <w:proofErr w:type="spellStart"/>
       <w:r>
         <w:rPr>
           <w:i/>
         </w:rPr>
         <w:t>BasketNet</w:t>
       </w:r>
-      <w:r>
-        <w:t xml:space="preserve"> выбран централизованный брокер с отдельными процессами-воркерами. Централизация упрощает реализацию очереди и подтверждений, а процессы обеспечивают независимое выполнение вычислений. При этом сам брокер становится единой точкой отказа. В проекте это ограничение зафиксировано: восстановление после отказа воркера реализовано, автоматическое резервирование брокера не заявляется.</w:t>
+      <w:proofErr w:type="spellEnd"/>
+      <w:r>
+        <w:t xml:space="preserve"> выбран централизованный брокер с отдельными процессами-</w:t>
+      </w:r>
+      <w:proofErr w:type="spellStart"/>
+      <w:r>
+        <w:t>воркерами</w:t>
+      </w:r>
+      <w:proofErr w:type="spellEnd"/>
+      <w:r>
+        <w:t xml:space="preserve">. Централизация упрощает реализацию очереди и подтверждений, а процессы обеспечивают независимое выполнение вычислений. При этом сам брокер становится единой точкой отказа. В проекте это ограничение зафиксировано: восстановление после отказа </w:t>
+      </w:r>
+      <w:proofErr w:type="spellStart"/>
+      <w:r>
+        <w:t>воркера</w:t>
+      </w:r>
+      <w:proofErr w:type="spellEnd"/>
+      <w:r>
+        <w:t xml:space="preserve"> реализовано, автоматическое резервирование брокера не заявляется.</w:t>
       </w:r>
     </w:p>
     <w:p>
@@ -1107,25 +1123,37 @@
       <w:r>
         <w:t xml:space="preserve">В готовых системах очередей подтверждение доставки и выполнения является отдельным механизмом. В документации </w:t>
       </w:r>
+      <w:proofErr w:type="spellStart"/>
       <w:r>
         <w:rPr>
           <w:i/>
         </w:rPr>
         <w:t>RabbitMQ</w:t>
       </w:r>
+      <w:proofErr w:type="spellEnd"/>
       <w:r>
         <w:t xml:space="preserve"> различаются подтверждения от потребителя и подтверждения публикации. При отсутствии успешного завершения сообщение может быть возвращено для повторной обработки [3]. Для собственного брокера существенен тот же инженерный принцип: факт отправки по соединению не доказывает, что прикладной расчёт завершён.</w:t>
       </w:r>
     </w:p>
     <w:p>
+      <w:proofErr w:type="spellStart"/>
       <w:r>
         <w:rPr>
           <w:i/>
         </w:rPr>
         <w:t>Celery</w:t>
       </w:r>
-      <w:r>
-        <w:t xml:space="preserve"> представляет более высокий уровень организации фоновых работ: клиент отправляет описание задачи, а воркеры выполняют её с использованием брокера сообщений [4]. Применение такого средства сокращает объём самостоятельно разрабатываемой инфраструктуры. Однако учебное задание требует показать собственные алгоритмы </w:t>
+      <w:proofErr w:type="spellEnd"/>
+      <w:r>
+        <w:t xml:space="preserve"> представляет более высокий уровень организации фоновых работ: клиент отправляет описание задачи, а </w:t>
+      </w:r>
+      <w:proofErr w:type="spellStart"/>
+      <w:r>
+        <w:t>воркеры</w:t>
+      </w:r>
+      <w:proofErr w:type="spellEnd"/>
+      <w:r>
+        <w:t xml:space="preserve"> выполняют её с использованием брокера сообщений [4]. Применение такого средства сокращает объём самостоятельно разрабатываемой инфраструктуры. Однако учебное задание требует показать собственные алгоритмы </w:t>
       </w:r>
       <w:r>
         <w:rPr>
@@ -1145,11 +1173,19 @@
       <w:r>
         <w:t xml:space="preserve">контроля и многопоточного планирования. Поэтому готовые брокеры рассматриваются как аналоги, а не включаются в состав </w:t>
       </w:r>
-      <w:r>
-        <w:rPr>
-          <w:i/>
-        </w:rPr>
-        <w:t>BasketNet.</w:t>
+      <w:proofErr w:type="spellStart"/>
+      <w:r>
+        <w:rPr>
+          <w:i/>
+        </w:rPr>
+        <w:t>BasketNet</w:t>
+      </w:r>
+      <w:proofErr w:type="spellEnd"/>
+      <w:r>
+        <w:rPr>
+          <w:i/>
+        </w:rPr>
+        <w:t>.</w:t>
       </w:r>
     </w:p>
     <w:p>
@@ -1163,11 +1199,11 @@
         <w:t>FIFO</w:t>
       </w:r>
       <w:r>
-        <w:t xml:space="preserve"> сохраняет последовательность запросов, но не выделяет срочные транзакции. Строгий приоритет позволяет обрабатывать более важные </w:t>
+        <w:t xml:space="preserve"> сохраняет последовательность запросов, но не выделяет срочные транзакции. Строгий приоритет позволяет обрабатывать более важные задания раньше, однако при постоянном поступлении срочных запросов может </w:t>
       </w:r>
       <w:r>
         <w:lastRenderedPageBreak/>
-        <w:t xml:space="preserve">задания раньше, однако при постоянном поступлении срочных запросов может задерживать менее важные. В проекте применяется строгий приоритет с </w:t>
+        <w:t xml:space="preserve">задерживать менее важные. В проекте применяется строгий приоритет с </w:t>
       </w:r>
       <w:r>
         <w:rPr>
@@ -1181,14 +1217,24 @@
     </w:p>
     <w:p>
       <w:r>
-        <w:t xml:space="preserve">Хранение очереди в двоичной куче позволяет получать минимальный ключ без полной сортировки списка. Двоичные кучи и реализация очередей с приоритетами рассматриваются в учебнике Т. Кормена и соавторов [5]. В </w:t>
-      </w:r>
+        <w:t xml:space="preserve">Хранение очереди в двоичной куче позволяет получать минимальный ключ без полной сортировки списка. Двоичные кучи и реализация очередей с приоритетами рассматриваются в учебнике Т. </w:t>
+      </w:r>
+      <w:proofErr w:type="spellStart"/>
+      <w:r>
+        <w:t>Кормена</w:t>
+      </w:r>
+      <w:proofErr w:type="spellEnd"/>
+      <w:r>
+        <w:t xml:space="preserve"> и соавторов [5]. В </w:t>
+      </w:r>
+      <w:proofErr w:type="spellStart"/>
       <w:r>
         <w:rPr>
           <w:i/>
         </w:rPr>
         <w:t>BasketNet</w:t>
       </w:r>
+      <w:proofErr w:type="spellEnd"/>
       <w:r>
         <w:t xml:space="preserve"> ключ включает отрицательный приоритет, возрастающий номер поступления и идентификатор задания. Такая структура обеспечивает однозначное сравнение даже для сложных исходных данных.</w:t>
       </w:r>
@@ -1204,12 +1250,28 @@
         <w:t>TCP</w:t>
       </w:r>
       <w:r>
-        <w:t xml:space="preserve"> повторяет передачу потерянных сегментов, но при разрыве соединения после вычисления клиент может не знать, был ли результат принят. Если брокер выдаст работу повторно, фактическое вычисление может произойти несколько раз. Для проекта выбрана модель повторного исполнения с принятием только актуального результата. Она допустима, поскольку операции воркера не списывают деньги и не изменяют внешние остатки товаров.</w:t>
+        <w:t xml:space="preserve"> повторяет передачу потерянных сегментов, но при разрыве соединения после вычисления клиент может не знать, был ли результат принят. Если брокер выдаст работу повторно, фактическое вычисление может произойти несколько раз. Для проекта выбрана модель повторного исполнения с принятием только актуального результата. Она допустима, поскольку операции </w:t>
+      </w:r>
+      <w:proofErr w:type="spellStart"/>
+      <w:r>
+        <w:t>воркера</w:t>
+      </w:r>
+      <w:proofErr w:type="spellEnd"/>
+      <w:r>
+        <w:t xml:space="preserve"> не списывают деньги и не изменяют внешние остатки товаров.</w:t>
       </w:r>
     </w:p>
     <w:p>
       <w:r>
-        <w:t>Для каждой попытки формируется отдельный идентификатор. Подтверждение принимается только от назначенного воркера и только для текущей попытки до истечения срока исполнения. Это предотвращает перезапись результата запоздалым сообщением от прежнего узла. Ограничение числа попыток также защищает систему от бесконечного возврата неисправного задания в очередь.</w:t>
+        <w:t xml:space="preserve">Для каждой попытки формируется отдельный идентификатор. Подтверждение принимается только от назначенного </w:t>
+      </w:r>
+      <w:proofErr w:type="spellStart"/>
+      <w:r>
+        <w:t>воркера</w:t>
+      </w:r>
+      <w:proofErr w:type="spellEnd"/>
+      <w:r>
+        <w:t xml:space="preserve"> и только для текущей попытки до истечения срока исполнения. Это предотвращает перезапись результата запоздалым сообщением от прежнего узла. Ограничение числа попыток также защищает систему от бесконечного возврата неисправного задания в очередь.</w:t>
       </w:r>
     </w:p>
     <w:p>
@@ -1283,16 +1345,40 @@
         <w:t>UDP</w:t>
       </w:r>
       <w:r>
-        <w:t xml:space="preserve"> передаёт отдельные датаграммы без установления соединения и не предоставляет гарантии доставки и порядка сообщений [6]. Эти свойства подходят для периодического </w:t>
-      </w:r>
-      <w:r>
-        <w:rPr>
-          <w:i/>
-        </w:rPr>
-        <w:t>heartbeat:</w:t>
-      </w:r>
-      <w:r>
-        <w:t xml:space="preserve"> каждое новое сообщение заменяет предыдущее свидетельство активности. Потеря одной датаграммы не должна немед</w:t>
+        <w:t xml:space="preserve"> передаёт отдельные </w:t>
+      </w:r>
+      <w:proofErr w:type="spellStart"/>
+      <w:r>
+        <w:t>датаграммы</w:t>
+      </w:r>
+      <w:proofErr w:type="spellEnd"/>
+      <w:r>
+        <w:t xml:space="preserve"> без установления соединения и не предоставляет гарантии доставки и порядка сообщений [6]. Эти свойства подходят для периодического </w:t>
+      </w:r>
+      <w:proofErr w:type="spellStart"/>
+      <w:r>
+        <w:rPr>
+          <w:i/>
+        </w:rPr>
+        <w:t>heartbeat</w:t>
+      </w:r>
+      <w:proofErr w:type="spellEnd"/>
+      <w:r>
+        <w:rPr>
+          <w:i/>
+        </w:rPr>
+        <w:t>:</w:t>
+      </w:r>
+      <w:r>
+        <w:t xml:space="preserve"> каждое новое сообщение заменяет предыдущее свидетельство активности. Потеря одной </w:t>
+      </w:r>
+      <w:proofErr w:type="spellStart"/>
+      <w:r>
+        <w:t>датаграммы</w:t>
+      </w:r>
+      <w:proofErr w:type="spellEnd"/>
+      <w:r>
+        <w:t xml:space="preserve"> не должна немед</w:t>
       </w:r>
       <w:r>
         <w:lastRenderedPageBreak/>
@@ -1303,21 +1389,25 @@
       <w:r>
         <w:t xml:space="preserve">Работоспособность контролируется двумя независимыми сроками. Первый ограничивает допустимое отсутствие </w:t>
       </w:r>
+      <w:proofErr w:type="spellStart"/>
       <w:r>
         <w:rPr>
           <w:i/>
         </w:rPr>
         <w:t>heartbeat</w:t>
       </w:r>
+      <w:proofErr w:type="spellEnd"/>
       <w:r>
         <w:t xml:space="preserve"> и относится к узлу в целом. Второй ограничивает длительность задания без прикладного подтверждения. Исполнитель может продолжать передавать </w:t>
       </w:r>
+      <w:proofErr w:type="spellStart"/>
       <w:r>
         <w:rPr>
           <w:i/>
         </w:rPr>
         <w:t>heartbeat</w:t>
       </w:r>
+      <w:proofErr w:type="spellEnd"/>
       <w:r>
         <w:t xml:space="preserve">, но зависнуть на расчёте; в таком случае обнаружить проблему позволяет именно таймаут </w:t>
       </w:r>
@@ -1357,16 +1447,32 @@
         <w:rPr>
           <w:i/>
         </w:rPr>
-        <w:t>Server-Sent</w:t>
-      </w:r>
+        <w:t>Server-</w:t>
+      </w:r>
+      <w:proofErr w:type="spellStart"/>
+      <w:r>
+        <w:rPr>
+          <w:i/>
+        </w:rPr>
+        <w:t>Sent</w:t>
+      </w:r>
+      <w:proofErr w:type="spellEnd"/>
       <w:r>
         <w:t xml:space="preserve"> </w:t>
       </w:r>
-      <w:r>
-        <w:rPr>
-          <w:i/>
-        </w:rPr>
-        <w:t>Events.</w:t>
+      <w:proofErr w:type="spellStart"/>
+      <w:r>
+        <w:rPr>
+          <w:i/>
+        </w:rPr>
+        <w:t>Events</w:t>
+      </w:r>
+      <w:proofErr w:type="spellEnd"/>
+      <w:r>
+        <w:rPr>
+          <w:i/>
+        </w:rPr>
+        <w:t>.</w:t>
       </w:r>
       <w:r>
         <w:t xml:space="preserve"> Спецификация </w:t>
@@ -1380,21 +1486,39 @@
       <w:r>
         <w:t xml:space="preserve"> определяет </w:t>
       </w:r>
+      <w:proofErr w:type="spellStart"/>
       <w:r>
         <w:rPr>
           <w:i/>
         </w:rPr>
         <w:t>EventSource</w:t>
       </w:r>
+      <w:proofErr w:type="spellEnd"/>
       <w:r>
         <w:t xml:space="preserve"> и формат потока </w:t>
       </w:r>
-      <w:r>
-        <w:rPr>
-          <w:i/>
-        </w:rPr>
-        <w:t>text/event-stream</w:t>
-      </w:r>
+      <w:proofErr w:type="spellStart"/>
+      <w:r>
+        <w:rPr>
+          <w:i/>
+        </w:rPr>
+        <w:t>text</w:t>
+      </w:r>
+      <w:proofErr w:type="spellEnd"/>
+      <w:r>
+        <w:rPr>
+          <w:i/>
+        </w:rPr>
+        <w:t>/</w:t>
+      </w:r>
+      <w:proofErr w:type="spellStart"/>
+      <w:r>
+        <w:rPr>
+          <w:i/>
+        </w:rPr>
+        <w:t>event-stream</w:t>
+      </w:r>
+      <w:proofErr w:type="spellEnd"/>
       <w:r>
         <w:t xml:space="preserve"> для поступающих от сервера событий [7].</w:t>
       </w:r>
@@ -1432,14 +1556,22 @@
         <w:keepNext/>
       </w:pPr>
       <w:r>
-        <w:t xml:space="preserve">Таблица 1.2 - Сетевые каналы </w:t>
-      </w:r>
+        <w:t xml:space="preserve">Таблица 1.2 </w:t>
+      </w:r>
+      <w:r>
+        <w:t xml:space="preserve">– Сетевые </w:t>
+      </w:r>
+      <w:r>
+        <w:t xml:space="preserve">каналы </w:t>
+      </w:r>
+      <w:proofErr w:type="spellStart"/>
       <w:r>
         <w:rPr>
           <w:i/>
         </w:rPr>
         <w:t>BasketNet</w:t>
       </w:r>
+      <w:proofErr w:type="spellEnd"/>
     </w:p>
     <w:tbl>
       <w:tblPr>
@@ -1569,83 +1701,6 @@
       </w:tr>
       <w:tr>
         <w:trPr>
-          <w:trHeight w:val="454"/>
-        </w:trPr>
-        <w:tc>
-          <w:tcPr>
-            <w:tcW w:w="964" w:type="dxa"/>
-          </w:tcPr>
-          <w:p>
-            <w:pPr>
-              <w:keepNext/>
-              <w:ind w:firstLine="0"/>
-              <w:jc w:val="center"/>
-            </w:pPr>
-            <w:r>
-              <w:rPr>
-                <w:sz w:val="24"/>
-              </w:rPr>
-              <w:t>1</w:t>
-            </w:r>
-          </w:p>
-        </w:tc>
-        <w:tc>
-          <w:tcPr>
-            <w:tcW w:w="2041" w:type="dxa"/>
-          </w:tcPr>
-          <w:p>
-            <w:pPr>
-              <w:keepNext/>
-              <w:ind w:firstLine="0"/>
-              <w:jc w:val="center"/>
-            </w:pPr>
-            <w:r>
-              <w:rPr>
-                <w:sz w:val="24"/>
-              </w:rPr>
-              <w:t>2</w:t>
-            </w:r>
-          </w:p>
-        </w:tc>
-        <w:tc>
-          <w:tcPr>
-            <w:tcW w:w="3685" w:type="dxa"/>
-          </w:tcPr>
-          <w:p>
-            <w:pPr>
-              <w:keepNext/>
-              <w:ind w:firstLine="0"/>
-              <w:jc w:val="center"/>
-            </w:pPr>
-            <w:r>
-              <w:rPr>
-                <w:sz w:val="24"/>
-              </w:rPr>
-              <w:t>3</w:t>
-            </w:r>
-          </w:p>
-        </w:tc>
-        <w:tc>
-          <w:tcPr>
-            <w:tcW w:w="2948" w:type="dxa"/>
-          </w:tcPr>
-          <w:p>
-            <w:pPr>
-              <w:keepNext/>
-              <w:ind w:firstLine="0"/>
-              <w:jc w:val="center"/>
-            </w:pPr>
-            <w:r>
-              <w:rPr>
-                <w:sz w:val="24"/>
-              </w:rPr>
-              <w:t>4</w:t>
-            </w:r>
-          </w:p>
-        </w:tc>
-      </w:tr>
-      <w:tr>
-        <w:trPr>
           <w:cantSplit/>
           <w:trHeight w:val="454"/>
         </w:trPr>
@@ -1736,12 +1791,14 @@
             <w:r>
               <w:t xml:space="preserve"> - </w:t>
             </w:r>
+            <w:proofErr w:type="spellStart"/>
             <w:r>
               <w:rPr>
                 <w:i/>
               </w:rPr>
               <w:t>Broker</w:t>
             </w:r>
+            <w:proofErr w:type="spellEnd"/>
           </w:p>
         </w:tc>
       </w:tr>
@@ -1834,21 +1891,25 @@
             <w:pPr>
               <w:pStyle w:val="TableText"/>
             </w:pPr>
+            <w:proofErr w:type="spellStart"/>
             <w:r>
               <w:rPr>
                 <w:i/>
               </w:rPr>
               <w:t>WorkerClient</w:t>
             </w:r>
+            <w:proofErr w:type="spellEnd"/>
             <w:r>
               <w:t xml:space="preserve"> - </w:t>
             </w:r>
+            <w:proofErr w:type="spellStart"/>
             <w:r>
               <w:rPr>
                 <w:i/>
               </w:rPr>
               <w:t>Broker</w:t>
             </w:r>
+            <w:proofErr w:type="spellEnd"/>
           </w:p>
         </w:tc>
       </w:tr>
@@ -1944,12 +2005,14 @@
             <w:r>
               <w:t xml:space="preserve"> - </w:t>
             </w:r>
+            <w:proofErr w:type="spellStart"/>
             <w:r>
               <w:rPr>
                 <w:i/>
               </w:rPr>
               <w:t>Broker</w:t>
             </w:r>
+            <w:proofErr w:type="spellEnd"/>
           </w:p>
         </w:tc>
       </w:tr>
@@ -2016,12 +2079,14 @@
             <w:pPr>
               <w:pStyle w:val="TableText"/>
             </w:pPr>
+            <w:proofErr w:type="spellStart"/>
             <w:r>
               <w:rPr>
                 <w:i/>
               </w:rPr>
               <w:t>Heartbeat</w:t>
             </w:r>
+            <w:proofErr w:type="spellEnd"/>
             <w:r>
               <w:t xml:space="preserve"> текущей сессии</w:t>
             </w:r>
@@ -2042,21 +2107,25 @@
             <w:pPr>
               <w:pStyle w:val="TableText"/>
             </w:pPr>
+            <w:proofErr w:type="spellStart"/>
             <w:r>
               <w:rPr>
                 <w:i/>
               </w:rPr>
               <w:t>WorkerClient</w:t>
             </w:r>
+            <w:proofErr w:type="spellEnd"/>
             <w:r>
               <w:t xml:space="preserve"> - </w:t>
             </w:r>
+            <w:proofErr w:type="spellStart"/>
             <w:r>
               <w:rPr>
                 <w:i/>
               </w:rPr>
               <w:t>Broker</w:t>
             </w:r>
+            <w:proofErr w:type="spellEnd"/>
           </w:p>
         </w:tc>
       </w:tr>
@@ -2173,12 +2242,14 @@
             <w:r>
               <w:t xml:space="preserve">Браузер - </w:t>
             </w:r>
+            <w:proofErr w:type="spellStart"/>
             <w:r>
               <w:rPr>
                 <w:i/>
               </w:rPr>
               <w:t>WebServer</w:t>
             </w:r>
+            <w:proofErr w:type="spellEnd"/>
           </w:p>
         </w:tc>
       </w:tr>
@@ -2203,21 +2274,25 @@
       <w:r>
         <w:t xml:space="preserve">Для обработки одного чека требуется арифметическое агрегирование цен и скидок. При этом необходимо определить порядок округления. Суммирование двоичных чисел с плавающей точкой без явного денежного правила может давать нежелательные расхождения в копейках. В </w:t>
       </w:r>
+      <w:proofErr w:type="spellStart"/>
       <w:r>
         <w:rPr>
           <w:i/>
         </w:rPr>
         <w:t>BasketNet</w:t>
       </w:r>
+      <w:proofErr w:type="spellEnd"/>
       <w:r>
         <w:t xml:space="preserve"> для денежного расчёта используется модуль </w:t>
       </w:r>
+      <w:proofErr w:type="spellStart"/>
       <w:r>
         <w:rPr>
           <w:i/>
         </w:rPr>
         <w:t>decimal</w:t>
       </w:r>
+      <w:proofErr w:type="spellEnd"/>
       <w:r>
         <w:t xml:space="preserve"> с явным правилом округления </w:t>
       </w:r>
@@ -2225,7 +2300,6 @@
         <w:rPr>
           <w:i/>
         </w:rPr>
-        <w:lastRenderedPageBreak/>
         <w:t>ROUND_HALF_UP.</w:t>
       </w:r>
       <w:r>
@@ -2234,13 +2308,38 @@
     </w:p>
     <w:p>
       <w:r>
-        <w:t xml:space="preserve">Для анализа набора чеков полезен подсчёт совместных появлений товаров. В книге Дж. Лесковца, А. Раджарамана и Дж. Ульмана анализ частых наборов товаров рассматривается через поддержку сочетаний и достоверность ассоциативных правил [8]. Полный поиск наборов произвольной длины не является целью </w:t>
-      </w:r>
-      <w:r>
-        <w:rPr>
-          <w:i/>
-        </w:rPr>
-        <w:t>BasketNet.</w:t>
+        <w:lastRenderedPageBreak/>
+        <w:t xml:space="preserve">Для анализа набора чеков полезен подсчёт совместных появлений товаров. В книге Дж. </w:t>
+      </w:r>
+      <w:proofErr w:type="spellStart"/>
+      <w:r>
+        <w:t>Лесковца</w:t>
+      </w:r>
+      <w:proofErr w:type="spellEnd"/>
+      <w:r>
+        <w:t xml:space="preserve">, А. </w:t>
+      </w:r>
+      <w:proofErr w:type="spellStart"/>
+      <w:r>
+        <w:t>Раджарамана</w:t>
+      </w:r>
+      <w:proofErr w:type="spellEnd"/>
+      <w:r>
+        <w:t xml:space="preserve"> и Дж. Ульмана анализ частых наборов товаров рассматривается через поддержку сочетаний и достоверность ассоциативных правил [8]. Полный поиск наборов произвольной длины не является целью </w:t>
+      </w:r>
+      <w:proofErr w:type="spellStart"/>
+      <w:r>
+        <w:rPr>
+          <w:i/>
+        </w:rPr>
+        <w:t>BasketNet</w:t>
+      </w:r>
+      <w:proofErr w:type="spellEnd"/>
+      <w:r>
+        <w:rPr>
+          <w:i/>
+        </w:rPr>
+        <w:t>.</w:t>
       </w:r>
       <w:r>
         <w:t xml:space="preserve"> Реализован ограниченный анализ пар, достаточный для демонстрации сопутствующих покупок и удобный для проверки на небольших примерах.</w:t>
@@ -2250,12 +2349,14 @@
       <w:r>
         <w:t xml:space="preserve">Каждый чек предварительно преобразуется во множество названий. Если один товар куплен в количестве нескольких единиц, это не увеличивает число его совместных появлений внутри того же чека. После этого подсчитываются одиночные товары и неупорядоченные пары. Для каждой пары вычисляются доля чеков с совместной покупкой, условные доли по обоим направлениям и коэффициент </w:t>
       </w:r>
+      <w:proofErr w:type="spellStart"/>
       <w:r>
         <w:rPr>
           <w:i/>
         </w:rPr>
         <w:t>lift</w:t>
       </w:r>
+      <w:proofErr w:type="spellEnd"/>
       <w:r>
         <w:t>. Эти показатели показывают структуру наблюдаемого набора, но сами по себе не доказывают причинную связь между покупками.</w:t>
       </w:r>
@@ -2264,26 +2365,38 @@
       <w:r>
         <w:t xml:space="preserve">Сортировка позволяет упорядочить товары по цене либо другому числовому признаку. Частотный анализ текста подсчитывает слова в названиях и служит дополнительным способом агрегации. Он не заменяет учёт количества проданных единиц: словоформы не объединяются морфологически, а совпадение отдельных слов не гарантирует совпадения товарных позиций. Для точного структурированного анализа используется </w:t>
       </w:r>
+      <w:proofErr w:type="spellStart"/>
       <w:r>
         <w:rPr>
           <w:i/>
         </w:rPr>
         <w:t>basket_affinity</w:t>
       </w:r>
+      <w:proofErr w:type="spellEnd"/>
       <w:r>
         <w:t>.</w:t>
       </w:r>
     </w:p>
     <w:p>
       <w:r>
-        <w:t xml:space="preserve">Хеширование применяется для получения контрольной суммы документа чека. Свойства криптографических хеш-функций и их отличие от механизмов аутентификации рассматриваются в книге Ж.-Ф. Омассона [9]. В </w:t>
-      </w:r>
+        <w:t xml:space="preserve">Хеширование применяется для получения контрольной суммы документа чека. Свойства криптографических хеш-функций и их отличие от механизмов аутентификации рассматриваются в книге Ж.-Ф. </w:t>
+      </w:r>
+      <w:proofErr w:type="spellStart"/>
+      <w:r>
+        <w:t>Омассона</w:t>
+      </w:r>
+      <w:proofErr w:type="spellEnd"/>
+      <w:r>
+        <w:t xml:space="preserve"> [9]. В </w:t>
+      </w:r>
+      <w:proofErr w:type="spellStart"/>
       <w:r>
         <w:rPr>
           <w:i/>
         </w:rPr>
         <w:t>BasketNet</w:t>
       </w:r>
+      <w:proofErr w:type="spellEnd"/>
       <w:r>
         <w:t xml:space="preserve"> функции </w:t>
       </w:r>
@@ -2305,11 +2418,19 @@
       <w:r>
         <w:t xml:space="preserve"> вызываются через модуль </w:t>
       </w:r>
-      <w:r>
-        <w:rPr>
-          <w:i/>
-        </w:rPr>
-        <w:t>hashlib.</w:t>
+      <w:proofErr w:type="spellStart"/>
+      <w:r>
+        <w:rPr>
+          <w:i/>
+        </w:rPr>
+        <w:t>hashlib</w:t>
+      </w:r>
+      <w:proofErr w:type="spellEnd"/>
+      <w:r>
+        <w:rPr>
+          <w:i/>
+        </w:rPr>
+        <w:t>.</w:t>
       </w:r>
       <w:r>
         <w:t xml:space="preserve"> В проекте </w:t>
@@ -2321,28 +2442,40 @@
         <w:t>SHA-256</w:t>
       </w:r>
       <w:r>
-        <w:t xml:space="preserve"> позволяет сопоставить сохранённый текст чека с его контрольной суммой. Наличие такого хеша не является электронной подписью, не подтверждает личность автора и не заменяет фискальную регистрацию.</w:t>
+        <w:t xml:space="preserve"> позволяет сопоставить сохранённый текст чека с его контрольной суммой. Наличие такого </w:t>
+      </w:r>
+      <w:proofErr w:type="spellStart"/>
+      <w:r>
+        <w:t>хеша</w:t>
+      </w:r>
+      <w:proofErr w:type="spellEnd"/>
+      <w:r>
+        <w:t xml:space="preserve"> не является электронной подписью, не подтверждает личность автора и не заменяет фискальную регистрацию.</w:t>
       </w:r>
     </w:p>
     <w:p>
       <w:r>
         <w:t xml:space="preserve">Операции </w:t>
       </w:r>
+      <w:proofErr w:type="spellStart"/>
       <w:r>
         <w:rPr>
           <w:i/>
         </w:rPr>
         <w:t>fib</w:t>
       </w:r>
+      <w:proofErr w:type="spellEnd"/>
       <w:r>
         <w:t xml:space="preserve"> и </w:t>
       </w:r>
+      <w:proofErr w:type="spellStart"/>
       <w:r>
         <w:rPr>
           <w:i/>
         </w:rPr>
         <w:t>factorial</w:t>
       </w:r>
+      <w:proofErr w:type="spellEnd"/>
       <w:r>
         <w:t xml:space="preserve"> сохраняются в составе вычислительного интерфейса в соответствии с заданием. Они используются в административной лаборатории для демонстрации выполнения параметризованных задач и выдачи больших целых чисел. В текущем магазине они не определяют стоимость реальной покупки и не вводят произвольные правила бонусной программы.</w:t>
       </w:r>
@@ -2375,7 +2508,15 @@
         <w:t>Python</w:t>
       </w:r>
       <w:r>
-        <w:t xml:space="preserve"> выбран благодаря наличию в стандартной библиотеке средств сокетного обмена, потоков, </w:t>
+        <w:t xml:space="preserve"> выбран благодаря наличию в стандартной библиотеке средств </w:t>
+      </w:r>
+      <w:proofErr w:type="spellStart"/>
+      <w:r>
+        <w:t>сокетного</w:t>
+      </w:r>
+      <w:proofErr w:type="spellEnd"/>
+      <w:r>
+        <w:t xml:space="preserve"> обмена, потоков, </w:t>
       </w:r>
       <w:r>
         <w:rPr>
@@ -2395,32 +2536,49 @@
       <w:r>
         <w:t xml:space="preserve">, криптографических функций и </w:t>
       </w:r>
+      <w:proofErr w:type="spellStart"/>
       <w:r>
         <w:rPr>
           <w:i/>
         </w:rPr>
         <w:t>SQLite</w:t>
       </w:r>
-      <w:r>
-        <w:t xml:space="preserve">. Это позволяет сосредоточить проект на алгоритмах взаимодействия, а не на настройке большого числа внешних зависимостей. При этом удобство </w:t>
-      </w:r>
-      <w:r>
-        <w:lastRenderedPageBreak/>
-        <w:t>языка не отменяет необходимости ограничивать размер входных данных и разделять сетевую координацию с тяжёлыми вычислениями.</w:t>
+      <w:proofErr w:type="spellEnd"/>
+      <w:r>
+        <w:t>. Это позволяет сосредоточить проект на алгоритмах взаимодействия, а не на настройке большого числа внешних зависимостей. При этом удобство языка не отменяет необходимости ограничивать размер входных данных и разделять сетевую координацию с тяжёлыми вычислениями.</w:t>
       </w:r>
     </w:p>
     <w:p>
       <w:r>
+        <w:lastRenderedPageBreak/>
         <w:t xml:space="preserve">На стороне брокера создаются потоки приёма соединений, планировщика, контроля сроков и обработки </w:t>
       </w:r>
+      <w:proofErr w:type="spellStart"/>
       <w:r>
         <w:rPr>
           <w:i/>
         </w:rPr>
         <w:t>heartbeat</w:t>
       </w:r>
-      <w:r>
-        <w:t>. Состояние заданий и воркеров защищено условной переменной с повторно входимой блокировкой. Исполнители запускаются отдельными процессами интерпретатора. Такая комбинация соответствует роли каждого механизма: потоки координируют ожидания, а процессы выполняют независимые задачи.</w:t>
+      <w:proofErr w:type="spellEnd"/>
+      <w:r>
+        <w:t xml:space="preserve">. Состояние заданий и </w:t>
+      </w:r>
+      <w:proofErr w:type="spellStart"/>
+      <w:r>
+        <w:t>воркеров</w:t>
+      </w:r>
+      <w:proofErr w:type="spellEnd"/>
+      <w:r>
+        <w:t xml:space="preserve"> защищено условной переменной с повторно </w:t>
+      </w:r>
+      <w:proofErr w:type="spellStart"/>
+      <w:r>
+        <w:t>входимой</w:t>
+      </w:r>
+      <w:proofErr w:type="spellEnd"/>
+      <w:r>
+        <w:t xml:space="preserve"> блокировкой. Исполнители запускаются отдельными процессами интерпретатора. Такая комбинация соответствует роли каждого механизма: потоки координируют ожидания, а процессы выполняют независимые задачи.</w:t>
       </w:r>
     </w:p>
     <w:p>
@@ -2452,16 +2610,26 @@
         <w:t>JavaScript</w:t>
       </w:r>
       <w:r>
-        <w:t xml:space="preserve"> без внешнего клиентского фреймворка. Пользователю нужен браузер, а вычислительная часть остаётся на стороне воркеров. Каталог работает без входа, операции с корзиной и заказами привязаны к учётной записи. Административная роль предоставляет доступ к настройкам и диагностике через тот же сайт.</w:t>
+        <w:t xml:space="preserve"> без внешнего клиентского фреймворка. Пользователю нужен браузер, а вычислительная часть остаётся на стороне </w:t>
+      </w:r>
+      <w:proofErr w:type="spellStart"/>
+      <w:r>
+        <w:t>воркеров</w:t>
+      </w:r>
+      <w:proofErr w:type="spellEnd"/>
+      <w:r>
+        <w:t>. Каталог работает без входа, операции с корзиной и заказами привязаны к учётной записи. Административная роль предоставляет доступ к настройкам и диагностике через тот же сайт.</w:t>
       </w:r>
     </w:p>
     <w:p>
+      <w:proofErr w:type="spellStart"/>
       <w:r>
         <w:rPr>
           <w:i/>
         </w:rPr>
         <w:t>SQLite</w:t>
       </w:r>
+      <w:proofErr w:type="spellEnd"/>
       <w:r>
         <w:t xml:space="preserve"> используется для постоянного хранения прикладных данных. Это встроенная СУБД, поддерживающая транзакционное изменение базы. Принципы фиксации, отката и изоляции </w:t>
       </w:r>
@@ -2472,13 +2640,29 @@
         <w:t>SQL-</w:t>
       </w:r>
       <w:r>
-        <w:t xml:space="preserve">транзакций рассматриваются в книге А. Болье [10]. Для учебного варианта с одним процессом веб-сервера она не требует отдельной службы. Взаимодействующие обработчики используют одну защищённую блокировкой связь с базой; очередь брокера при этом хранится отдельно в памяти и не становится долговечной вследствие наличия </w:t>
-      </w:r>
-      <w:r>
-        <w:rPr>
-          <w:i/>
-        </w:rPr>
-        <w:t>SQLite.</w:t>
+        <w:t xml:space="preserve">транзакций рассматриваются в книге А. </w:t>
+      </w:r>
+      <w:proofErr w:type="spellStart"/>
+      <w:r>
+        <w:t>Болье</w:t>
+      </w:r>
+      <w:proofErr w:type="spellEnd"/>
+      <w:r>
+        <w:t xml:space="preserve"> [10]. Для учебного варианта с одним процессом веб-сервера она не требует отдельной службы. Взаимодействующие обработчики используют одну защищённую блокировкой связь с базой; очередь брокера при этом хранится отдельно в памяти и не становится долговечной вследствие наличия </w:t>
+      </w:r>
+      <w:proofErr w:type="spellStart"/>
+      <w:r>
+        <w:rPr>
+          <w:i/>
+        </w:rPr>
+        <w:t>SQLite</w:t>
+      </w:r>
+      <w:proofErr w:type="spellEnd"/>
+      <w:r>
+        <w:rPr>
+          <w:i/>
+        </w:rPr>
+        <w:t>.</w:t>
       </w:r>
     </w:p>
     <w:p>
@@ -2528,7 +2712,13 @@
         <w:keepNext/>
       </w:pPr>
       <w:r>
-        <w:t>Таблица 1.3 - Программные средства</w:t>
+        <w:t xml:space="preserve">Таблица 1.3 </w:t>
+      </w:r>
+      <w:r>
+        <w:t xml:space="preserve">– Программные </w:t>
+      </w:r>
+      <w:r>
+        <w:t>средства</w:t>
       </w:r>
     </w:p>
     <w:tbl>
@@ -2638,15 +2828,22 @@
         <w:tc>
           <w:tcPr>
             <w:tcW w:w="1871" w:type="dxa"/>
+            <w:vAlign w:val="center"/>
           </w:tcPr>
           <w:p>
             <w:pPr>
               <w:keepNext/>
               <w:ind w:firstLine="0"/>
               <w:jc w:val="center"/>
+              <w:rPr>
+                <w:b/>
+                <w:bCs/>
+              </w:rPr>
             </w:pPr>
             <w:r>
               <w:rPr>
+                <w:b/>
+                <w:bCs/>
                 <w:sz w:val="24"/>
               </w:rPr>
               <w:t>1</w:t>
@@ -2656,15 +2853,22 @@
         <w:tc>
           <w:tcPr>
             <w:tcW w:w="3402" w:type="dxa"/>
+            <w:vAlign w:val="center"/>
           </w:tcPr>
           <w:p>
             <w:pPr>
               <w:keepNext/>
               <w:ind w:firstLine="0"/>
               <w:jc w:val="center"/>
+              <w:rPr>
+                <w:b/>
+                <w:bCs/>
+              </w:rPr>
             </w:pPr>
             <w:r>
               <w:rPr>
+                <w:b/>
+                <w:bCs/>
                 <w:sz w:val="24"/>
               </w:rPr>
               <w:t>2</w:t>
@@ -2674,15 +2878,22 @@
         <w:tc>
           <w:tcPr>
             <w:tcW w:w="4365" w:type="dxa"/>
+            <w:vAlign w:val="center"/>
           </w:tcPr>
           <w:p>
             <w:pPr>
               <w:keepNext/>
               <w:ind w:firstLine="0"/>
               <w:jc w:val="center"/>
+              <w:rPr>
+                <w:b/>
+                <w:bCs/>
+              </w:rPr>
             </w:pPr>
             <w:r>
               <w:rPr>
+                <w:b/>
+                <w:bCs/>
                 <w:sz w:val="24"/>
               </w:rPr>
               <w:t>3</w:t>
@@ -2739,12 +2950,14 @@
             <w:r>
               <w:t xml:space="preserve">, </w:t>
             </w:r>
+            <w:proofErr w:type="spellStart"/>
             <w:r>
               <w:rPr>
                 <w:i/>
               </w:rPr>
               <w:t>socket</w:t>
             </w:r>
+            <w:proofErr w:type="spellEnd"/>
             <w:r>
               <w:t xml:space="preserve">, </w:t>
             </w:r>
@@ -2835,30 +3048,36 @@
             <w:pPr>
               <w:pStyle w:val="TableText"/>
             </w:pPr>
+            <w:proofErr w:type="spellStart"/>
             <w:r>
               <w:rPr>
                 <w:i/>
               </w:rPr>
               <w:t>threading</w:t>
             </w:r>
+            <w:proofErr w:type="spellEnd"/>
             <w:r>
               <w:t xml:space="preserve">, </w:t>
             </w:r>
+            <w:proofErr w:type="spellStart"/>
             <w:r>
               <w:rPr>
                 <w:i/>
               </w:rPr>
               <w:t>Condition</w:t>
             </w:r>
+            <w:proofErr w:type="spellEnd"/>
             <w:r>
               <w:t xml:space="preserve">, </w:t>
             </w:r>
+            <w:proofErr w:type="spellStart"/>
             <w:r>
               <w:rPr>
                 <w:i/>
               </w:rPr>
               <w:t>RLock</w:t>
             </w:r>
+            <w:proofErr w:type="spellEnd"/>
           </w:p>
         </w:tc>
         <w:tc>
@@ -2991,15 +3210,22 @@
         <w:tc>
           <w:tcPr>
             <w:tcW w:w="1871" w:type="dxa"/>
+            <w:vAlign w:val="center"/>
           </w:tcPr>
           <w:p>
             <w:pPr>
               <w:keepNext/>
               <w:ind w:firstLine="0"/>
               <w:jc w:val="center"/>
+              <w:rPr>
+                <w:b/>
+                <w:bCs/>
+              </w:rPr>
             </w:pPr>
             <w:r>
               <w:rPr>
+                <w:b/>
+                <w:bCs/>
                 <w:sz w:val="24"/>
               </w:rPr>
               <w:t>1</w:t>
@@ -3009,15 +3235,22 @@
         <w:tc>
           <w:tcPr>
             <w:tcW w:w="3402" w:type="dxa"/>
+            <w:vAlign w:val="center"/>
           </w:tcPr>
           <w:p>
             <w:pPr>
               <w:keepNext/>
               <w:ind w:firstLine="0"/>
               <w:jc w:val="center"/>
+              <w:rPr>
+                <w:b/>
+                <w:bCs/>
+              </w:rPr>
             </w:pPr>
             <w:r>
               <w:rPr>
+                <w:b/>
+                <w:bCs/>
                 <w:sz w:val="24"/>
               </w:rPr>
               <w:t>2</w:t>
@@ -3027,15 +3260,22 @@
         <w:tc>
           <w:tcPr>
             <w:tcW w:w="4365" w:type="dxa"/>
+            <w:vAlign w:val="center"/>
           </w:tcPr>
           <w:p>
             <w:pPr>
               <w:keepNext/>
               <w:ind w:firstLine="0"/>
               <w:jc w:val="center"/>
+              <w:rPr>
+                <w:b/>
+                <w:bCs/>
+              </w:rPr>
             </w:pPr>
             <w:r>
               <w:rPr>
+                <w:b/>
+                <w:bCs/>
                 <w:sz w:val="24"/>
               </w:rPr>
               <w:t>3</w:t>
@@ -3086,6 +3326,7 @@
                 <w:lang w:val="en-US"/>
               </w:rPr>
             </w:pPr>
+            <w:proofErr w:type="spellStart"/>
             <w:r>
               <w:rPr>
                 <w:i/>
@@ -3106,6 +3347,7 @@
               </w:rPr>
               <w:t>server</w:t>
             </w:r>
+            <w:proofErr w:type="spellEnd"/>
             <w:r>
               <w:rPr>
                 <w:lang w:val="en-US"/>
@@ -3208,12 +3450,14 @@
             <w:pPr>
               <w:pStyle w:val="TableText"/>
             </w:pPr>
+            <w:proofErr w:type="spellStart"/>
             <w:r>
               <w:rPr>
                 <w:i/>
               </w:rPr>
               <w:t>SQLite</w:t>
             </w:r>
+            <w:proofErr w:type="spellEnd"/>
             <w:r>
               <w:t xml:space="preserve">, </w:t>
             </w:r>
@@ -3289,12 +3533,14 @@
             <w:pPr>
               <w:pStyle w:val="TableText"/>
             </w:pPr>
+            <w:proofErr w:type="spellStart"/>
             <w:r>
               <w:rPr>
                 <w:i/>
               </w:rPr>
               <w:t>unittest</w:t>
             </w:r>
+            <w:proofErr w:type="spellEnd"/>
           </w:p>
         </w:tc>
         <w:tc>
@@ -3362,12 +3608,14 @@
       <w:r>
         <w:t xml:space="preserve"> с результатом, повторная выдача после отказа и контроль </w:t>
       </w:r>
+      <w:proofErr w:type="spellStart"/>
       <w:r>
         <w:rPr>
           <w:i/>
         </w:rPr>
         <w:t>heartbeat</w:t>
       </w:r>
+      <w:proofErr w:type="spellEnd"/>
       <w:r>
         <w:t xml:space="preserve"> по </w:t>
       </w:r>
@@ -3378,7 +3626,15 @@
         <w:t>UDP</w:t>
       </w:r>
       <w:r>
-        <w:t>. Клиент должен видеть изменение состояния задания и получать итог либо сообщение об ошибке. Повторная попытка должна назначаться другому идентификатору воркера, чтобы демонстрировать именно переназначение узлу.</w:t>
+        <w:t xml:space="preserve">. Клиент должен видеть изменение состояния задания и получать итог либо сообщение об ошибке. Повторная попытка должна назначаться другому идентификатору </w:t>
+      </w:r>
+      <w:proofErr w:type="spellStart"/>
+      <w:r>
+        <w:t>воркера</w:t>
+      </w:r>
+      <w:proofErr w:type="spellEnd"/>
+      <w:r>
+        <w:t>, чтобы демонстрировать именно переназначение узлу.</w:t>
       </w:r>
     </w:p>
     <w:p>
@@ -3394,17 +3650,47 @@
     <w:p>
       <w:pPr>
         <w:pStyle w:val="Unnumbered"/>
+        <w:rPr>
+          <w:lang w:val="en-US"/>
+        </w:rPr>
       </w:pPr>
       <w:bookmarkStart w:id="8" w:name="ExcerptHeading8"/>
       <w:r>
         <w:lastRenderedPageBreak/>
-        <w:t>Источники к разделу 1</w:t>
+        <w:t>Источники</w:t>
+      </w:r>
+      <w:r>
+        <w:rPr>
+          <w:lang w:val="en-US"/>
+        </w:rPr>
+        <w:t xml:space="preserve"> </w:t>
+      </w:r>
+      <w:r>
+        <w:t>к</w:t>
+      </w:r>
+      <w:r>
+        <w:rPr>
+          <w:lang w:val="en-US"/>
+        </w:rPr>
+        <w:t xml:space="preserve"> </w:t>
+      </w:r>
+      <w:r>
+        <w:t>разделу</w:t>
+      </w:r>
+      <w:r>
+        <w:rPr>
+          <w:lang w:val="en-US"/>
+        </w:rPr>
+        <w:t xml:space="preserve"> 1</w:t>
       </w:r>
       <w:bookmarkEnd w:id="8"/>
     </w:p>
     <w:p>
       <w:pPr>
         <w:keepNext/>
+        <w:rPr>
+          <w:lang w:val="en-US"/>
+        </w:rPr>
       </w:pPr>
     </w:p>
     <w:p>
@@ -3414,132 +3700,193 @@
         </w:rPr>
       </w:pPr>
       <w:r>
+        <w:rPr>
+          <w:lang w:val="en-US"/>
+        </w:rPr>
         <w:t xml:space="preserve">1. </w:t>
       </w:r>
       <w:r>
         <w:rPr>
           <w:i/>
+          <w:lang w:val="en-US"/>
         </w:rPr>
         <w:t>Fowler</w:t>
       </w:r>
       <w:r>
+        <w:rPr>
+          <w:lang w:val="en-US"/>
+        </w:rPr>
         <w:t xml:space="preserve">, </w:t>
       </w:r>
       <w:r>
         <w:rPr>
           <w:i/>
+          <w:lang w:val="en-US"/>
         </w:rPr>
         <w:t>M.</w:t>
       </w:r>
       <w:r>
+        <w:rPr>
+          <w:lang w:val="en-US"/>
+        </w:rPr>
         <w:t xml:space="preserve"> </w:t>
       </w:r>
       <w:r>
         <w:rPr>
           <w:i/>
+          <w:lang w:val="en-US"/>
         </w:rPr>
         <w:t>Python</w:t>
       </w:r>
       <w:r>
+        <w:rPr>
+          <w:lang w:val="en-US"/>
+        </w:rPr>
         <w:t xml:space="preserve"> </w:t>
       </w:r>
       <w:r>
         <w:rPr>
           <w:i/>
+          <w:lang w:val="en-US"/>
         </w:rPr>
         <w:t>Concurrency</w:t>
       </w:r>
       <w:r>
+        <w:rPr>
+          <w:lang w:val="en-US"/>
+        </w:rPr>
         <w:t xml:space="preserve"> </w:t>
       </w:r>
       <w:r>
         <w:rPr>
           <w:i/>
+          <w:lang w:val="en-US"/>
         </w:rPr>
         <w:t>with</w:t>
       </w:r>
       <w:r>
+        <w:rPr>
+          <w:lang w:val="en-US"/>
+        </w:rPr>
         <w:t xml:space="preserve"> </w:t>
       </w:r>
-      <w:r>
-        <w:rPr>
-          <w:i/>
+      <w:proofErr w:type="spellStart"/>
+      <w:r>
+        <w:rPr>
+          <w:i/>
+          <w:lang w:val="en-US"/>
         </w:rPr>
         <w:t>asyncio</w:t>
       </w:r>
-      <w:r>
+      <w:proofErr w:type="spellEnd"/>
+      <w:r>
+        <w:rPr>
+          <w:lang w:val="en-US"/>
+        </w:rPr>
         <w:t xml:space="preserve"> / </w:t>
       </w:r>
       <w:r>
         <w:rPr>
           <w:i/>
+          <w:lang w:val="en-US"/>
         </w:rPr>
         <w:t>M.</w:t>
       </w:r>
       <w:r>
+        <w:rPr>
+          <w:lang w:val="en-US"/>
+        </w:rPr>
         <w:t xml:space="preserve"> </w:t>
       </w:r>
       <w:r>
         <w:rPr>
           <w:i/>
+          <w:lang w:val="en-US"/>
         </w:rPr>
         <w:t>Fowler.</w:t>
       </w:r>
       <w:r>
+        <w:rPr>
+          <w:lang w:val="en-US"/>
+        </w:rPr>
         <w:t xml:space="preserve"> - </w:t>
       </w:r>
       <w:r>
         <w:rPr>
           <w:i/>
+          <w:lang w:val="en-US"/>
         </w:rPr>
         <w:t>Shelter</w:t>
       </w:r>
       <w:r>
+        <w:rPr>
+          <w:lang w:val="en-US"/>
+        </w:rPr>
         <w:t xml:space="preserve"> </w:t>
       </w:r>
       <w:r>
         <w:rPr>
           <w:i/>
+          <w:lang w:val="en-US"/>
         </w:rPr>
         <w:t>Island</w:t>
       </w:r>
       <w:r>
+        <w:rPr>
+          <w:lang w:val="en-US"/>
+        </w:rPr>
         <w:t xml:space="preserve"> : </w:t>
       </w:r>
       <w:r>
         <w:rPr>
           <w:i/>
+          <w:lang w:val="en-US"/>
         </w:rPr>
         <w:t>Manning</w:t>
       </w:r>
       <w:r>
+        <w:rPr>
+          <w:lang w:val="en-US"/>
+        </w:rPr>
         <w:t xml:space="preserve"> </w:t>
       </w:r>
       <w:r>
         <w:rPr>
           <w:i/>
+          <w:lang w:val="en-US"/>
         </w:rPr>
         <w:t>Publications</w:t>
       </w:r>
       <w:r>
+        <w:rPr>
+          <w:lang w:val="en-US"/>
+        </w:rPr>
         <w:t xml:space="preserve">, 2022. - 376 </w:t>
       </w:r>
       <w:r>
         <w:rPr>
           <w:i/>
+          <w:lang w:val="en-US"/>
         </w:rPr>
         <w:t>p.</w:t>
       </w:r>
       <w:r>
+        <w:rPr>
+          <w:lang w:val="en-US"/>
+        </w:rPr>
         <w:t xml:space="preserve"> - </w:t>
       </w:r>
       <w:r>
         <w:rPr>
           <w:i/>
+          <w:lang w:val="en-US"/>
         </w:rPr>
         <w:t>ISBN</w:t>
       </w:r>
       <w:r>
+        <w:rPr>
+          <w:lang w:val="en-US"/>
+        </w:rPr>
         <w:t xml:space="preserve"> 978-1-61729-866-0.</w:t>
       </w:r>
     </w:p>
@@ -3550,919 +3897,218 @@
         </w:rPr>
       </w:pPr>
       <w:r>
+        <w:rPr>
+          <w:lang w:val="en-US"/>
+        </w:rPr>
         <w:t xml:space="preserve">2. </w:t>
       </w:r>
       <w:r>
         <w:rPr>
           <w:i/>
+          <w:lang w:val="en-US"/>
         </w:rPr>
         <w:t>Van</w:t>
       </w:r>
       <w:r>
+        <w:rPr>
+          <w:lang w:val="en-US"/>
+        </w:rPr>
         <w:t xml:space="preserve"> </w:t>
       </w:r>
       <w:r>
         <w:rPr>
           <w:i/>
+          <w:lang w:val="en-US"/>
         </w:rPr>
         <w:t>Steen</w:t>
       </w:r>
       <w:r>
+        <w:rPr>
+          <w:lang w:val="en-US"/>
+        </w:rPr>
         <w:t xml:space="preserve">, </w:t>
       </w:r>
       <w:r>
         <w:rPr>
           <w:i/>
+          <w:lang w:val="en-US"/>
         </w:rPr>
         <w:t>M.</w:t>
       </w:r>
       <w:r>
+        <w:rPr>
+          <w:lang w:val="en-US"/>
+        </w:rPr>
         <w:t xml:space="preserve"> </w:t>
       </w:r>
       <w:r>
         <w:rPr>
           <w:i/>
+          <w:lang w:val="en-US"/>
         </w:rPr>
         <w:t>Distributed</w:t>
       </w:r>
       <w:r>
+        <w:rPr>
+          <w:lang w:val="en-US"/>
+        </w:rPr>
         <w:t xml:space="preserve"> </w:t>
       </w:r>
       <w:r>
         <w:rPr>
           <w:i/>
+          <w:lang w:val="en-US"/>
         </w:rPr>
         <w:t>Systems</w:t>
       </w:r>
       <w:r>
+        <w:rPr>
+          <w:lang w:val="en-US"/>
+        </w:rPr>
         <w:t xml:space="preserve"> / </w:t>
       </w:r>
       <w:r>
         <w:rPr>
           <w:i/>
+          <w:lang w:val="en-US"/>
         </w:rPr>
         <w:t>M.</w:t>
       </w:r>
       <w:r>
+        <w:rPr>
+          <w:lang w:val="en-US"/>
+        </w:rPr>
         <w:t xml:space="preserve"> </w:t>
       </w:r>
       <w:r>
         <w:rPr>
           <w:i/>
+          <w:lang w:val="en-US"/>
         </w:rPr>
         <w:t>van</w:t>
       </w:r>
       <w:r>
+        <w:rPr>
+          <w:lang w:val="en-US"/>
+        </w:rPr>
         <w:t xml:space="preserve"> </w:t>
       </w:r>
       <w:r>
         <w:rPr>
           <w:i/>
+          <w:lang w:val="en-US"/>
         </w:rPr>
         <w:t>Steen</w:t>
       </w:r>
       <w:r>
+        <w:rPr>
+          <w:lang w:val="en-US"/>
+        </w:rPr>
         <w:t xml:space="preserve">, </w:t>
       </w:r>
       <w:r>
         <w:rPr>
           <w:i/>
+          <w:lang w:val="en-US"/>
         </w:rPr>
         <w:t>A.</w:t>
       </w:r>
       <w:r>
+        <w:rPr>
+          <w:lang w:val="en-US"/>
+        </w:rPr>
         <w:t xml:space="preserve"> </w:t>
       </w:r>
       <w:r>
         <w:rPr>
           <w:i/>
+          <w:lang w:val="en-US"/>
         </w:rPr>
         <w:t>S.</w:t>
       </w:r>
       <w:r>
+        <w:rPr>
+          <w:lang w:val="en-US"/>
+        </w:rPr>
         <w:t xml:space="preserve"> </w:t>
       </w:r>
       <w:r>
         <w:rPr>
           <w:i/>
+          <w:lang w:val="en-US"/>
         </w:rPr>
         <w:t>Tanenbaum.</w:t>
       </w:r>
       <w:r>
+        <w:rPr>
+          <w:lang w:val="en-US"/>
+        </w:rPr>
         <w:t xml:space="preserve"> - 4</w:t>
       </w:r>
       <w:r>
         <w:rPr>
           <w:i/>
+          <w:lang w:val="en-US"/>
         </w:rPr>
         <w:t>th</w:t>
       </w:r>
       <w:r>
+        <w:rPr>
+          <w:lang w:val="en-US"/>
+        </w:rPr>
         <w:t xml:space="preserve"> </w:t>
       </w:r>
       <w:r>
         <w:rPr>
           <w:i/>
+          <w:lang w:val="en-US"/>
         </w:rPr>
         <w:t>ed.</w:t>
       </w:r>
       <w:r>
+        <w:rPr>
+          <w:lang w:val="en-US"/>
+        </w:rPr>
         <w:t xml:space="preserve"> - </w:t>
       </w:r>
       <w:r>
         <w:rPr>
           <w:i/>
+          <w:lang w:val="en-US"/>
         </w:rPr>
         <w:t>distributed-systems.net</w:t>
       </w:r>
       <w:r>
+        <w:rPr>
+          <w:lang w:val="en-US"/>
+        </w:rPr>
         <w:t xml:space="preserve">, 2023. - 684 </w:t>
       </w:r>
       <w:r>
         <w:rPr>
           <w:i/>
+          <w:lang w:val="en-US"/>
         </w:rPr>
         <w:t>p.</w:t>
       </w:r>
       <w:r>
+        <w:rPr>
+          <w:lang w:val="en-US"/>
+        </w:rPr>
         <w:t xml:space="preserve"> - </w:t>
       </w:r>
       <w:r>
         <w:rPr>
           <w:i/>
+          <w:lang w:val="en-US"/>
         </w:rPr>
         <w:t>ISBN</w:t>
       </w:r>
       <w:r>
+        <w:rPr>
+          <w:lang w:val="en-US"/>
+        </w:rPr>
         <w:t xml:space="preserve"> 978-90-815406-3-6.</w:t>
-      </w:r>
-    </w:p>
-    <w:p>
-      <w:r>
-        <w:t xml:space="preserve">3. </w:t>
-      </w:r>
-      <w:r>
-        <w:rPr>
-          <w:i/>
-        </w:rPr>
-        <w:t>Consumer</w:t>
-      </w:r>
-      <w:r>
-        <w:t xml:space="preserve"> </w:t>
-      </w:r>
-      <w:r>
-        <w:rPr>
-          <w:i/>
-        </w:rPr>
-        <w:t>Acknowledgements</w:t>
-      </w:r>
-      <w:r>
-        <w:t xml:space="preserve"> </w:t>
-      </w:r>
-      <w:r>
-        <w:rPr>
-          <w:i/>
-        </w:rPr>
-        <w:t>and</w:t>
-      </w:r>
-      <w:r>
-        <w:t xml:space="preserve"> </w:t>
-      </w:r>
-      <w:r>
-        <w:rPr>
-          <w:i/>
-        </w:rPr>
-        <w:t>Publisher</w:t>
-      </w:r>
-      <w:r>
-        <w:t xml:space="preserve"> </w:t>
-      </w:r>
-      <w:r>
-        <w:rPr>
-          <w:i/>
-        </w:rPr>
-        <w:t>Confirms</w:t>
-      </w:r>
-      <w:r>
-        <w:t xml:space="preserve"> [Электронный ресурс] / </w:t>
-      </w:r>
-      <w:r>
-        <w:rPr>
-          <w:i/>
-        </w:rPr>
-        <w:t>RabbitMQ.</w:t>
-      </w:r>
-      <w:r>
-        <w:t xml:space="preserve"> - Режим доступа: </w:t>
-      </w:r>
-      <w:r>
-        <w:rPr>
-          <w:i/>
-        </w:rPr>
-        <w:t>https://www.rabbitmq.com/docs/confirms.</w:t>
-      </w:r>
-      <w:r>
-        <w:t xml:space="preserve"> - Дата доступа: 21.10.2026.</w:t>
-      </w:r>
-    </w:p>
-    <w:p>
-      <w:r>
-        <w:t xml:space="preserve">4. </w:t>
-      </w:r>
-      <w:r>
-        <w:rPr>
-          <w:i/>
-        </w:rPr>
-        <w:t>Introduction</w:t>
-      </w:r>
-      <w:r>
-        <w:t xml:space="preserve"> </w:t>
-      </w:r>
-      <w:r>
-        <w:rPr>
-          <w:i/>
-        </w:rPr>
-        <w:t>to</w:t>
-      </w:r>
-      <w:r>
-        <w:t xml:space="preserve"> </w:t>
-      </w:r>
-      <w:r>
-        <w:rPr>
-          <w:i/>
-        </w:rPr>
-        <w:t>Celery</w:t>
-      </w:r>
-      <w:r>
-        <w:t xml:space="preserve"> [Электронный ресурс] / </w:t>
-      </w:r>
-      <w:r>
-        <w:rPr>
-          <w:i/>
-        </w:rPr>
-        <w:t>Celery.</w:t>
-      </w:r>
-      <w:r>
-        <w:t xml:space="preserve"> - Режим доступа: </w:t>
-      </w:r>
-      <w:r>
-        <w:rPr>
-          <w:i/>
-        </w:rPr>
-        <w:t>https://docs.celeryq.dev/en/stable/getting-started/introduction.html.</w:t>
-      </w:r>
-      <w:r>
-        <w:t xml:space="preserve"> - Дата доступа: 21.10.2026.</w:t>
-      </w:r>
-    </w:p>
-    <w:p>
-      <w:r>
-        <w:t xml:space="preserve">5. </w:t>
-      </w:r>
-      <w:r>
-        <w:rPr>
-          <w:i/>
-        </w:rPr>
-        <w:t>Introduction</w:t>
-      </w:r>
-      <w:r>
-        <w:t xml:space="preserve"> </w:t>
-      </w:r>
-      <w:r>
-        <w:rPr>
-          <w:i/>
-        </w:rPr>
-        <w:t>to</w:t>
-      </w:r>
-      <w:r>
-        <w:t xml:space="preserve"> </w:t>
-      </w:r>
-      <w:r>
-        <w:rPr>
-          <w:i/>
-        </w:rPr>
-        <w:t>Algorithms</w:t>
-      </w:r>
-      <w:r>
-        <w:t xml:space="preserve"> / </w:t>
-      </w:r>
-      <w:r>
-        <w:rPr>
-          <w:i/>
-        </w:rPr>
-        <w:t>T.</w:t>
-      </w:r>
-      <w:r>
-        <w:t xml:space="preserve"> </w:t>
-      </w:r>
-      <w:r>
-        <w:rPr>
-          <w:i/>
-        </w:rPr>
-        <w:t>H.</w:t>
-      </w:r>
-      <w:r>
-        <w:t xml:space="preserve"> </w:t>
-      </w:r>
-      <w:r>
-        <w:rPr>
-          <w:i/>
-        </w:rPr>
-        <w:t>Cormen</w:t>
-      </w:r>
-      <w:r>
-        <w:t xml:space="preserve">, </w:t>
-      </w:r>
-      <w:r>
-        <w:rPr>
-          <w:i/>
-        </w:rPr>
-        <w:t>C.</w:t>
-      </w:r>
-      <w:r>
-        <w:t xml:space="preserve"> </w:t>
-      </w:r>
-      <w:r>
-        <w:rPr>
-          <w:i/>
-        </w:rPr>
-        <w:t>E.</w:t>
-      </w:r>
-      <w:r>
-        <w:t xml:space="preserve"> </w:t>
-      </w:r>
-      <w:r>
-        <w:rPr>
-          <w:i/>
-        </w:rPr>
-        <w:t>Leiserson</w:t>
-      </w:r>
-      <w:r>
-        <w:t xml:space="preserve">, </w:t>
-      </w:r>
-      <w:r>
-        <w:rPr>
-          <w:i/>
-        </w:rPr>
-        <w:t>R.</w:t>
-      </w:r>
-      <w:r>
-        <w:t xml:space="preserve"> </w:t>
-      </w:r>
-      <w:r>
-        <w:rPr>
-          <w:i/>
-        </w:rPr>
-        <w:t>L.</w:t>
-      </w:r>
-      <w:r>
-        <w:t xml:space="preserve"> </w:t>
-      </w:r>
-      <w:r>
-        <w:rPr>
-          <w:i/>
-        </w:rPr>
-        <w:t>Rivest</w:t>
-      </w:r>
-      <w:r>
-        <w:t xml:space="preserve">, </w:t>
-      </w:r>
-      <w:r>
-        <w:rPr>
-          <w:i/>
-        </w:rPr>
-        <w:t>C.</w:t>
-      </w:r>
-      <w:r>
-        <w:t xml:space="preserve"> </w:t>
-      </w:r>
-      <w:r>
-        <w:rPr>
-          <w:i/>
-        </w:rPr>
-        <w:t>Stein.</w:t>
-      </w:r>
-      <w:r>
-        <w:t xml:space="preserve"> - 4</w:t>
-      </w:r>
-      <w:r>
-        <w:rPr>
-          <w:i/>
-        </w:rPr>
-        <w:t>th</w:t>
-      </w:r>
-      <w:r>
-        <w:t xml:space="preserve"> </w:t>
-      </w:r>
-      <w:r>
-        <w:rPr>
-          <w:i/>
-        </w:rPr>
-        <w:t>ed.</w:t>
-      </w:r>
-      <w:r>
-        <w:t xml:space="preserve"> - </w:t>
-      </w:r>
-      <w:r>
-        <w:rPr>
-          <w:i/>
-        </w:rPr>
-        <w:t>Cambridge</w:t>
-      </w:r>
-      <w:r>
-        <w:t xml:space="preserve">, </w:t>
-      </w:r>
-      <w:r>
-        <w:rPr>
-          <w:i/>
-        </w:rPr>
-        <w:t>Massachusetts</w:t>
-      </w:r>
-      <w:r>
-        <w:t xml:space="preserve"> : </w:t>
-      </w:r>
-      <w:r>
-        <w:rPr>
-          <w:i/>
-        </w:rPr>
-        <w:t>The</w:t>
-      </w:r>
-      <w:r>
-        <w:t xml:space="preserve"> </w:t>
-      </w:r>
-      <w:r>
-        <w:rPr>
-          <w:i/>
-        </w:rPr>
-        <w:t>MIT</w:t>
-      </w:r>
-      <w:r>
-        <w:t xml:space="preserve"> </w:t>
-      </w:r>
-      <w:r>
-        <w:rPr>
-          <w:i/>
-        </w:rPr>
-        <w:t>Press</w:t>
-      </w:r>
-      <w:r>
-        <w:t xml:space="preserve">, 2022. - 1312 </w:t>
-      </w:r>
-      <w:r>
-        <w:rPr>
-          <w:i/>
-        </w:rPr>
-        <w:t>p.</w:t>
-      </w:r>
-      <w:r>
-        <w:t xml:space="preserve"> - </w:t>
-      </w:r>
-      <w:r>
-        <w:rPr>
-          <w:i/>
-        </w:rPr>
-        <w:t>ISBN</w:t>
-      </w:r>
-      <w:r>
-        <w:t xml:space="preserve"> 978-0-262-04630-5.</w:t>
-      </w:r>
-    </w:p>
-    <w:p>
-      <w:r>
-        <w:t xml:space="preserve">6. </w:t>
-      </w:r>
-      <w:r>
-        <w:rPr>
-          <w:i/>
-        </w:rPr>
-        <w:t>Kurose</w:t>
-      </w:r>
-      <w:r>
-        <w:t xml:space="preserve">, </w:t>
-      </w:r>
-      <w:r>
-        <w:rPr>
-          <w:i/>
-        </w:rPr>
-        <w:t>J.</w:t>
-      </w:r>
-      <w:r>
-        <w:t xml:space="preserve"> </w:t>
-      </w:r>
-      <w:r>
-        <w:rPr>
-          <w:i/>
-        </w:rPr>
-        <w:t>F.</w:t>
-      </w:r>
-      <w:r>
-        <w:t xml:space="preserve"> </w:t>
-      </w:r>
-      <w:r>
-        <w:rPr>
-          <w:i/>
-        </w:rPr>
-        <w:t>Computer</w:t>
-      </w:r>
-      <w:r>
-        <w:t xml:space="preserve"> </w:t>
-      </w:r>
-      <w:r>
-        <w:rPr>
-          <w:i/>
-        </w:rPr>
-        <w:t>Networking:</w:t>
-      </w:r>
-      <w:r>
-        <w:t xml:space="preserve"> </w:t>
-      </w:r>
-      <w:r>
-        <w:rPr>
-          <w:i/>
-        </w:rPr>
-        <w:t>A</w:t>
-      </w:r>
-      <w:r>
-        <w:t xml:space="preserve"> </w:t>
-      </w:r>
-      <w:r>
-        <w:rPr>
-          <w:i/>
-        </w:rPr>
-        <w:t>Top-Down</w:t>
-      </w:r>
-      <w:r>
-        <w:t xml:space="preserve"> </w:t>
-      </w:r>
-      <w:r>
-        <w:rPr>
-          <w:i/>
-        </w:rPr>
-        <w:t>Approach</w:t>
-      </w:r>
-      <w:r>
-        <w:t xml:space="preserve"> / </w:t>
-      </w:r>
-      <w:r>
-        <w:rPr>
-          <w:i/>
-        </w:rPr>
-        <w:t>J.</w:t>
-      </w:r>
-      <w:r>
-        <w:t xml:space="preserve"> </w:t>
-      </w:r>
-      <w:r>
-        <w:rPr>
-          <w:i/>
-        </w:rPr>
-        <w:t>F.</w:t>
-      </w:r>
-      <w:r>
-        <w:t xml:space="preserve"> </w:t>
-      </w:r>
-      <w:r>
-        <w:rPr>
-          <w:i/>
-        </w:rPr>
-        <w:t>Kurose</w:t>
-      </w:r>
-      <w:r>
-        <w:t xml:space="preserve">, </w:t>
-      </w:r>
-      <w:r>
-        <w:rPr>
-          <w:i/>
-        </w:rPr>
-        <w:t>K.</w:t>
-      </w:r>
-      <w:r>
-        <w:t xml:space="preserve"> </w:t>
-      </w:r>
-      <w:r>
-        <w:rPr>
-          <w:i/>
-        </w:rPr>
-        <w:t>W.</w:t>
-      </w:r>
-      <w:r>
-        <w:t xml:space="preserve"> </w:t>
-      </w:r>
-      <w:r>
-        <w:rPr>
-          <w:i/>
-        </w:rPr>
-        <w:t>Ross.</w:t>
-      </w:r>
-      <w:r>
-        <w:t xml:space="preserve"> - 8</w:t>
-      </w:r>
-      <w:r>
-        <w:rPr>
-          <w:i/>
-        </w:rPr>
-        <w:t>th</w:t>
-      </w:r>
-      <w:r>
-        <w:t xml:space="preserve"> </w:t>
-      </w:r>
-      <w:r>
-        <w:rPr>
-          <w:i/>
-        </w:rPr>
-        <w:t>ed.</w:t>
-      </w:r>
-      <w:r>
-        <w:t xml:space="preserve"> - </w:t>
-      </w:r>
-      <w:r>
-        <w:rPr>
-          <w:i/>
-        </w:rPr>
-        <w:t>Pearson</w:t>
-      </w:r>
-      <w:r>
-        <w:t xml:space="preserve">, 2021. - 764 </w:t>
-      </w:r>
-      <w:r>
-        <w:rPr>
-          <w:i/>
-        </w:rPr>
-        <w:t>p.</w:t>
-      </w:r>
-      <w:r>
-        <w:t xml:space="preserve"> - </w:t>
-      </w:r>
-      <w:r>
-        <w:rPr>
-          <w:i/>
-        </w:rPr>
-        <w:t>ISBN</w:t>
-      </w:r>
-      <w:r>
-        <w:t xml:space="preserve"> 978-0-13-668155-7.</w:t>
-      </w:r>
-    </w:p>
-    <w:p>
-      <w:r>
-        <w:t xml:space="preserve">7. </w:t>
-      </w:r>
-      <w:r>
-        <w:rPr>
-          <w:i/>
-        </w:rPr>
-        <w:t>HTML</w:t>
-      </w:r>
-      <w:r>
-        <w:t xml:space="preserve"> </w:t>
-      </w:r>
-      <w:r>
-        <w:rPr>
-          <w:i/>
-        </w:rPr>
-        <w:t>Living</w:t>
-      </w:r>
-      <w:r>
-        <w:t xml:space="preserve"> </w:t>
-      </w:r>
-      <w:r>
-        <w:rPr>
-          <w:i/>
-        </w:rPr>
-        <w:t>Standard.</w:t>
-      </w:r>
-      <w:r>
-        <w:t xml:space="preserve"> </w:t>
-      </w:r>
-      <w:r>
-        <w:rPr>
-          <w:i/>
-        </w:rPr>
-        <w:t>Server-sent</w:t>
-      </w:r>
-      <w:r>
-        <w:t xml:space="preserve"> </w:t>
-      </w:r>
-      <w:r>
-        <w:rPr>
-          <w:i/>
-        </w:rPr>
-        <w:t>events</w:t>
-      </w:r>
-      <w:r>
-        <w:t xml:space="preserve"> [Электронный ресурс] / </w:t>
-      </w:r>
-      <w:r>
-        <w:rPr>
-          <w:i/>
-        </w:rPr>
-        <w:t>WHATWG.</w:t>
-      </w:r>
-      <w:r>
-        <w:t xml:space="preserve"> - Режим доступа: </w:t>
-      </w:r>
-      <w:r>
-        <w:rPr>
-          <w:i/>
-        </w:rPr>
-        <w:t>https://html.spec.whatwg.org/multipage/server-sent-events.html.</w:t>
-      </w:r>
-      <w:r>
-        <w:t xml:space="preserve"> - Дата доступа: 21.10.2026.</w:t>
-      </w:r>
-    </w:p>
-    <w:p>
-      <w:r>
-        <w:t xml:space="preserve">8. </w:t>
-      </w:r>
-      <w:r>
-        <w:rPr>
-          <w:i/>
-        </w:rPr>
-        <w:t>Leskovec</w:t>
-      </w:r>
-      <w:r>
-        <w:t xml:space="preserve">, </w:t>
-      </w:r>
-      <w:r>
-        <w:rPr>
-          <w:i/>
-        </w:rPr>
-        <w:t>J.</w:t>
-      </w:r>
-      <w:r>
-        <w:t xml:space="preserve"> </w:t>
-      </w:r>
-      <w:r>
-        <w:rPr>
-          <w:i/>
-        </w:rPr>
-        <w:t>Mining</w:t>
-      </w:r>
-      <w:r>
-        <w:t xml:space="preserve"> </w:t>
-      </w:r>
-      <w:r>
-        <w:rPr>
-          <w:i/>
-        </w:rPr>
-        <w:t>of</w:t>
-      </w:r>
-      <w:r>
-        <w:t xml:space="preserve"> </w:t>
-      </w:r>
-      <w:r>
-        <w:rPr>
-          <w:i/>
-        </w:rPr>
-        <w:t>Massive</w:t>
-      </w:r>
-      <w:r>
-        <w:t xml:space="preserve"> </w:t>
-      </w:r>
-      <w:r>
-        <w:rPr>
-          <w:i/>
-        </w:rPr>
-        <w:t>Datasets</w:t>
-      </w:r>
-      <w:r>
-        <w:t xml:space="preserve"> / </w:t>
-      </w:r>
-      <w:r>
-        <w:rPr>
-          <w:i/>
-        </w:rPr>
-        <w:t>J.</w:t>
-      </w:r>
-      <w:r>
-        <w:t xml:space="preserve"> </w:t>
-      </w:r>
-      <w:r>
-        <w:rPr>
-          <w:i/>
-        </w:rPr>
-        <w:t>Leskovec</w:t>
-      </w:r>
-      <w:r>
-        <w:t xml:space="preserve">, </w:t>
-      </w:r>
-      <w:r>
-        <w:rPr>
-          <w:i/>
-        </w:rPr>
-        <w:t>A.</w:t>
-      </w:r>
-      <w:r>
-        <w:t xml:space="preserve"> </w:t>
-      </w:r>
-      <w:r>
-        <w:rPr>
-          <w:i/>
-        </w:rPr>
-        <w:t>Rajaraman</w:t>
-      </w:r>
-      <w:r>
-        <w:t xml:space="preserve">, </w:t>
-      </w:r>
-      <w:r>
-        <w:rPr>
-          <w:i/>
-        </w:rPr>
-        <w:t>J.</w:t>
-      </w:r>
-      <w:r>
-        <w:t xml:space="preserve"> </w:t>
-      </w:r>
-      <w:r>
-        <w:rPr>
-          <w:i/>
-        </w:rPr>
-        <w:t>D.</w:t>
-      </w:r>
-      <w:r>
-        <w:t xml:space="preserve"> </w:t>
-      </w:r>
-      <w:r>
-        <w:rPr>
-          <w:i/>
-        </w:rPr>
-        <w:t>Ullman.</w:t>
-      </w:r>
-      <w:r>
-        <w:t xml:space="preserve"> - 3</w:t>
-      </w:r>
-      <w:r>
-        <w:rPr>
-          <w:i/>
-        </w:rPr>
-        <w:t>rd</w:t>
-      </w:r>
-      <w:r>
-        <w:t xml:space="preserve"> </w:t>
-      </w:r>
-      <w:r>
-        <w:rPr>
-          <w:i/>
-        </w:rPr>
-        <w:t>ed.</w:t>
-      </w:r>
-      <w:r>
-        <w:t xml:space="preserve"> - </w:t>
-      </w:r>
-      <w:r>
-        <w:rPr>
-          <w:i/>
-        </w:rPr>
-        <w:t>Cambridge</w:t>
-      </w:r>
-      <w:r>
-        <w:t xml:space="preserve"> : </w:t>
-      </w:r>
-      <w:r>
-        <w:rPr>
-          <w:i/>
-        </w:rPr>
-        <w:t>Cambridge</w:t>
-      </w:r>
-      <w:r>
-        <w:t xml:space="preserve"> </w:t>
-      </w:r>
-      <w:r>
-        <w:rPr>
-          <w:i/>
-        </w:rPr>
-        <w:t>University</w:t>
-      </w:r>
-      <w:r>
-        <w:t xml:space="preserve"> </w:t>
-      </w:r>
-      <w:r>
-        <w:rPr>
-          <w:i/>
-        </w:rPr>
-        <w:t>Press</w:t>
-      </w:r>
-      <w:r>
-        <w:t xml:space="preserve">, 2020. - 566 </w:t>
-      </w:r>
-      <w:r>
-        <w:rPr>
-          <w:i/>
-        </w:rPr>
-        <w:t>p.</w:t>
-      </w:r>
-      <w:r>
-        <w:t xml:space="preserve"> - </w:t>
-      </w:r>
-      <w:r>
-        <w:rPr>
-          <w:i/>
-        </w:rPr>
-        <w:t>ISBN</w:t>
-      </w:r>
-      <w:r>
-        <w:t xml:space="preserve"> 978-1-108-47634-8.</w:t>
       </w:r>
     </w:p>
     <w:p>
@@ -4472,196 +4118,219 @@
         </w:rPr>
       </w:pPr>
       <w:r>
-        <w:t xml:space="preserve">9. </w:t>
-      </w:r>
-      <w:r>
-        <w:rPr>
-          <w:i/>
-        </w:rPr>
-        <w:t>Aumasson</w:t>
-      </w:r>
-      <w:r>
-        <w:t xml:space="preserve">, </w:t>
-      </w:r>
-      <w:r>
-        <w:rPr>
-          <w:i/>
-        </w:rPr>
-        <w:t>J.-P.</w:t>
-      </w:r>
-      <w:r>
+        <w:rPr>
+          <w:lang w:val="en-US"/>
+        </w:rPr>
+        <w:t xml:space="preserve">3. </w:t>
+      </w:r>
+      <w:r>
+        <w:rPr>
+          <w:i/>
+          <w:lang w:val="en-US"/>
+        </w:rPr>
+        <w:t>Consumer</w:t>
+      </w:r>
+      <w:r>
+        <w:rPr>
+          <w:lang w:val="en-US"/>
+        </w:rPr>
         <w:t xml:space="preserve"> </w:t>
       </w:r>
       <w:r>
         <w:rPr>
           <w:i/>
-        </w:rPr>
-        <w:t>Serious</w:t>
-      </w:r>
-      <w:r>
+          <w:lang w:val="en-US"/>
+        </w:rPr>
+        <w:t>Acknowledgements</w:t>
+      </w:r>
+      <w:r>
+        <w:rPr>
+          <w:lang w:val="en-US"/>
+        </w:rPr>
         <w:t xml:space="preserve"> </w:t>
       </w:r>
       <w:r>
         <w:rPr>
           <w:i/>
-        </w:rPr>
-        <w:t>Cryptography:</w:t>
-      </w:r>
-      <w:r>
+          <w:lang w:val="en-US"/>
+        </w:rPr>
+        <w:t>and</w:t>
+      </w:r>
+      <w:r>
+        <w:rPr>
+          <w:lang w:val="en-US"/>
+        </w:rPr>
         <w:t xml:space="preserve"> </w:t>
       </w:r>
       <w:r>
         <w:rPr>
           <w:i/>
-        </w:rPr>
-        <w:t>A</w:t>
-      </w:r>
-      <w:r>
+          <w:lang w:val="en-US"/>
+        </w:rPr>
+        <w:t>Publisher</w:t>
+      </w:r>
+      <w:r>
+        <w:rPr>
+          <w:lang w:val="en-US"/>
+        </w:rPr>
         <w:t xml:space="preserve"> </w:t>
       </w:r>
       <w:r>
         <w:rPr>
           <w:i/>
-        </w:rPr>
-        <w:t>Practical</w:t>
-      </w:r>
-      <w:r>
+          <w:lang w:val="en-US"/>
+        </w:rPr>
+        <w:t>Confirms</w:t>
+      </w:r>
+      <w:r>
+        <w:rPr>
+          <w:lang w:val="en-US"/>
+        </w:rPr>
+        <w:t xml:space="preserve"> [</w:t>
+      </w:r>
+      <w:r>
+        <w:t>Электронный</w:t>
+      </w:r>
+      <w:r>
+        <w:rPr>
+          <w:lang w:val="en-US"/>
+        </w:rPr>
         <w:t xml:space="preserve"> </w:t>
       </w:r>
       <w:r>
+        <w:t>ресурс</w:t>
+      </w:r>
+      <w:r>
+        <w:rPr>
+          <w:lang w:val="en-US"/>
+        </w:rPr>
+        <w:t xml:space="preserve">] / </w:t>
+      </w:r>
+      <w:r>
+        <w:rPr>
+          <w:i/>
+          <w:lang w:val="en-US"/>
+        </w:rPr>
+        <w:t>RabbitMQ.</w:t>
+      </w:r>
+      <w:r>
+        <w:rPr>
+          <w:lang w:val="en-US"/>
+        </w:rPr>
+        <w:t xml:space="preserve"> - </w:t>
+      </w:r>
+      <w:r>
+        <w:t>Режим</w:t>
+      </w:r>
+      <w:r>
+        <w:rPr>
+          <w:lang w:val="en-US"/>
+        </w:rPr>
+        <w:t xml:space="preserve"> </w:t>
+      </w:r>
+      <w:r>
+        <w:t>доступа</w:t>
+      </w:r>
+      <w:r>
+        <w:rPr>
+          <w:lang w:val="en-US"/>
+        </w:rPr>
+        <w:t xml:space="preserve">: </w:t>
+      </w:r>
+      <w:r>
+        <w:rPr>
+          <w:i/>
+          <w:lang w:val="en-US"/>
+        </w:rPr>
+        <w:t>https://www.rabbitmq.com/docs/confirms.</w:t>
+      </w:r>
+      <w:r>
+        <w:rPr>
+          <w:lang w:val="en-US"/>
+        </w:rPr>
+        <w:t xml:space="preserve"> - </w:t>
+      </w:r>
+      <w:r>
+        <w:t>Дата</w:t>
+      </w:r>
+      <w:r>
+        <w:rPr>
+          <w:lang w:val="en-US"/>
+        </w:rPr>
+        <w:t xml:space="preserve"> </w:t>
+      </w:r>
+      <w:r>
+        <w:t>доступа</w:t>
+      </w:r>
+      <w:r>
+        <w:rPr>
+          <w:lang w:val="en-US"/>
+        </w:rPr>
+        <w:t>: 21.10.2026.</w:t>
+      </w:r>
+    </w:p>
+    <w:p>
+      <w:r>
+        <w:t xml:space="preserve">4. </w:t>
+      </w:r>
+      <w:proofErr w:type="spellStart"/>
+      <w:r>
         <w:rPr>
           <w:i/>
         </w:rPr>
         <w:t>Introduction</w:t>
       </w:r>
+      <w:proofErr w:type="spellEnd"/>
       <w:r>
         <w:t xml:space="preserve"> </w:t>
       </w:r>
+      <w:proofErr w:type="spellStart"/>
       <w:r>
         <w:rPr>
           <w:i/>
         </w:rPr>
         <w:t>to</w:t>
       </w:r>
+      <w:proofErr w:type="spellEnd"/>
       <w:r>
         <w:t xml:space="preserve"> </w:t>
       </w:r>
-      <w:r>
-        <w:rPr>
-          <w:i/>
-        </w:rPr>
-        <w:t>Modern</w:t>
-      </w:r>
-      <w:r>
-        <w:t xml:space="preserve"> </w:t>
-      </w:r>
-      <w:r>
-        <w:rPr>
-          <w:i/>
-        </w:rPr>
-        <w:t>Encryption</w:t>
-      </w:r>
-      <w:r>
-        <w:t xml:space="preserve"> / </w:t>
-      </w:r>
-      <w:r>
-        <w:rPr>
-          <w:i/>
-        </w:rPr>
-        <w:t>J.-P.</w:t>
-      </w:r>
-      <w:r>
-        <w:t xml:space="preserve"> </w:t>
-      </w:r>
-      <w:r>
-        <w:rPr>
-          <w:i/>
-        </w:rPr>
-        <w:t>Aumasson.</w:t>
-      </w:r>
-      <w:r>
-        <w:t xml:space="preserve"> - 2</w:t>
-      </w:r>
-      <w:r>
-        <w:rPr>
-          <w:i/>
-        </w:rPr>
-        <w:t>nd</w:t>
-      </w:r>
-      <w:r>
-        <w:t xml:space="preserve"> </w:t>
-      </w:r>
-      <w:r>
-        <w:rPr>
-          <w:i/>
-        </w:rPr>
-        <w:t>ed.</w:t>
-      </w:r>
-      <w:r>
-        <w:t xml:space="preserve"> - </w:t>
-      </w:r>
-      <w:r>
-        <w:rPr>
-          <w:i/>
-        </w:rPr>
-        <w:t>San</w:t>
-      </w:r>
-      <w:r>
-        <w:t xml:space="preserve"> </w:t>
-      </w:r>
-      <w:r>
-        <w:rPr>
-          <w:i/>
-        </w:rPr>
-        <w:t>Francisco</w:t>
-      </w:r>
-      <w:r>
-        <w:t xml:space="preserve"> : </w:t>
-      </w:r>
-      <w:r>
-        <w:rPr>
-          <w:i/>
-        </w:rPr>
-        <w:t>No</w:t>
-      </w:r>
-      <w:r>
-        <w:t xml:space="preserve"> </w:t>
-      </w:r>
-      <w:r>
-        <w:rPr>
-          <w:i/>
-        </w:rPr>
-        <w:t>Starch</w:t>
-      </w:r>
-      <w:r>
-        <w:t xml:space="preserve"> </w:t>
-      </w:r>
-      <w:r>
-        <w:rPr>
-          <w:i/>
-        </w:rPr>
-        <w:t>Press</w:t>
-      </w:r>
-      <w:r>
-        <w:t xml:space="preserve">, 2024. - 376 </w:t>
-      </w:r>
-      <w:r>
-        <w:rPr>
-          <w:i/>
-        </w:rPr>
-        <w:t>p.</w:t>
-      </w:r>
-      <w:r>
-        <w:t xml:space="preserve"> - </w:t>
-      </w:r>
-      <w:r>
-        <w:rPr>
-          <w:i/>
-        </w:rPr>
-        <w:t>ISBN</w:t>
-      </w:r>
-      <w:r>
-        <w:t xml:space="preserve"> 978-1-71850-384-7.</w:t>
+      <w:proofErr w:type="spellStart"/>
+      <w:r>
+        <w:rPr>
+          <w:i/>
+        </w:rPr>
+        <w:t>Celery</w:t>
+      </w:r>
+      <w:proofErr w:type="spellEnd"/>
+      <w:r>
+        <w:t xml:space="preserve"> [Электронный ресурс] / </w:t>
+      </w:r>
+      <w:proofErr w:type="spellStart"/>
+      <w:r>
+        <w:rPr>
+          <w:i/>
+        </w:rPr>
+        <w:t>Celery</w:t>
+      </w:r>
+      <w:proofErr w:type="spellEnd"/>
+      <w:r>
+        <w:rPr>
+          <w:i/>
+        </w:rPr>
+        <w:t>.</w:t>
+      </w:r>
+      <w:r>
+        <w:t xml:space="preserve"> - Режим доступа: </w:t>
+      </w:r>
+      <w:r>
+        <w:rPr>
+          <w:i/>
+        </w:rPr>
+        <w:t>https://docs.celeryq.dev/en/stable/getting-started/introduction.html.</w:t>
+      </w:r>
+      <w:r>
+        <w:t xml:space="preserve"> - Дата доступа: 21.10.2026.</w:t>
       </w:r>
     </w:p>
     <w:p>
@@ -4671,168 +4340,1564 @@
         </w:rPr>
       </w:pPr>
       <w:r>
+        <w:rPr>
+          <w:lang w:val="en-US"/>
+        </w:rPr>
+        <w:t xml:space="preserve">5. </w:t>
+      </w:r>
+      <w:r>
+        <w:rPr>
+          <w:i/>
+          <w:lang w:val="en-US"/>
+        </w:rPr>
+        <w:t>Introduction</w:t>
+      </w:r>
+      <w:r>
+        <w:rPr>
+          <w:lang w:val="en-US"/>
+        </w:rPr>
+        <w:t xml:space="preserve"> </w:t>
+      </w:r>
+      <w:r>
+        <w:rPr>
+          <w:i/>
+          <w:lang w:val="en-US"/>
+        </w:rPr>
+        <w:t>to</w:t>
+      </w:r>
+      <w:r>
+        <w:rPr>
+          <w:lang w:val="en-US"/>
+        </w:rPr>
+        <w:t xml:space="preserve"> </w:t>
+      </w:r>
+      <w:r>
+        <w:rPr>
+          <w:i/>
+          <w:lang w:val="en-US"/>
+        </w:rPr>
+        <w:t>Algorithms</w:t>
+      </w:r>
+      <w:r>
+        <w:rPr>
+          <w:lang w:val="en-US"/>
+        </w:rPr>
+        <w:t xml:space="preserve"> / </w:t>
+      </w:r>
+      <w:r>
+        <w:rPr>
+          <w:i/>
+          <w:lang w:val="en-US"/>
+        </w:rPr>
+        <w:t>T.</w:t>
+      </w:r>
+      <w:r>
+        <w:rPr>
+          <w:lang w:val="en-US"/>
+        </w:rPr>
+        <w:t xml:space="preserve"> </w:t>
+      </w:r>
+      <w:r>
+        <w:rPr>
+          <w:i/>
+          <w:lang w:val="en-US"/>
+        </w:rPr>
+        <w:t>H.</w:t>
+      </w:r>
+      <w:r>
+        <w:rPr>
+          <w:lang w:val="en-US"/>
+        </w:rPr>
+        <w:t xml:space="preserve"> </w:t>
+      </w:r>
+      <w:proofErr w:type="spellStart"/>
+      <w:r>
+        <w:rPr>
+          <w:i/>
+          <w:lang w:val="en-US"/>
+        </w:rPr>
+        <w:t>Cormen</w:t>
+      </w:r>
+      <w:proofErr w:type="spellEnd"/>
+      <w:r>
+        <w:rPr>
+          <w:lang w:val="en-US"/>
+        </w:rPr>
+        <w:t xml:space="preserve">, </w:t>
+      </w:r>
+      <w:r>
+        <w:rPr>
+          <w:i/>
+          <w:lang w:val="en-US"/>
+        </w:rPr>
+        <w:t>C.</w:t>
+      </w:r>
+      <w:r>
+        <w:rPr>
+          <w:lang w:val="en-US"/>
+        </w:rPr>
+        <w:t xml:space="preserve"> </w:t>
+      </w:r>
+      <w:r>
+        <w:rPr>
+          <w:i/>
+          <w:lang w:val="en-US"/>
+        </w:rPr>
+        <w:t>E.</w:t>
+      </w:r>
+      <w:r>
+        <w:rPr>
+          <w:lang w:val="en-US"/>
+        </w:rPr>
+        <w:t xml:space="preserve"> </w:t>
+      </w:r>
+      <w:proofErr w:type="spellStart"/>
+      <w:r>
+        <w:rPr>
+          <w:i/>
+          <w:lang w:val="en-US"/>
+        </w:rPr>
+        <w:t>Leiserson</w:t>
+      </w:r>
+      <w:proofErr w:type="spellEnd"/>
+      <w:r>
+        <w:rPr>
+          <w:lang w:val="en-US"/>
+        </w:rPr>
+        <w:t xml:space="preserve">, </w:t>
+      </w:r>
+      <w:r>
+        <w:rPr>
+          <w:i/>
+          <w:lang w:val="en-US"/>
+        </w:rPr>
+        <w:t>R.</w:t>
+      </w:r>
+      <w:r>
+        <w:rPr>
+          <w:lang w:val="en-US"/>
+        </w:rPr>
+        <w:t xml:space="preserve"> </w:t>
+      </w:r>
+      <w:r>
+        <w:rPr>
+          <w:i/>
+          <w:lang w:val="en-US"/>
+        </w:rPr>
+        <w:t>L.</w:t>
+      </w:r>
+      <w:r>
+        <w:rPr>
+          <w:lang w:val="en-US"/>
+        </w:rPr>
+        <w:t xml:space="preserve"> </w:t>
+      </w:r>
+      <w:r>
+        <w:rPr>
+          <w:i/>
+          <w:lang w:val="en-US"/>
+        </w:rPr>
+        <w:t>Rivest</w:t>
+      </w:r>
+      <w:r>
+        <w:rPr>
+          <w:lang w:val="en-US"/>
+        </w:rPr>
+        <w:t xml:space="preserve">, </w:t>
+      </w:r>
+      <w:r>
+        <w:rPr>
+          <w:i/>
+          <w:lang w:val="en-US"/>
+        </w:rPr>
+        <w:t>C.</w:t>
+      </w:r>
+      <w:r>
+        <w:rPr>
+          <w:lang w:val="en-US"/>
+        </w:rPr>
+        <w:t xml:space="preserve"> </w:t>
+      </w:r>
+      <w:r>
+        <w:rPr>
+          <w:i/>
+          <w:lang w:val="en-US"/>
+        </w:rPr>
+        <w:t>Stein.</w:t>
+      </w:r>
+      <w:r>
+        <w:rPr>
+          <w:lang w:val="en-US"/>
+        </w:rPr>
+        <w:t xml:space="preserve"> - 4</w:t>
+      </w:r>
+      <w:r>
+        <w:rPr>
+          <w:i/>
+          <w:lang w:val="en-US"/>
+        </w:rPr>
+        <w:t>th</w:t>
+      </w:r>
+      <w:r>
+        <w:rPr>
+          <w:lang w:val="en-US"/>
+        </w:rPr>
+        <w:t xml:space="preserve"> </w:t>
+      </w:r>
+      <w:r>
+        <w:rPr>
+          <w:i/>
+          <w:lang w:val="en-US"/>
+        </w:rPr>
+        <w:t>ed.</w:t>
+      </w:r>
+      <w:r>
+        <w:rPr>
+          <w:lang w:val="en-US"/>
+        </w:rPr>
+        <w:t xml:space="preserve"> - </w:t>
+      </w:r>
+      <w:r>
+        <w:rPr>
+          <w:i/>
+          <w:lang w:val="en-US"/>
+        </w:rPr>
+        <w:t>Cambridge</w:t>
+      </w:r>
+      <w:r>
+        <w:rPr>
+          <w:lang w:val="en-US"/>
+        </w:rPr>
+        <w:t xml:space="preserve">, </w:t>
+      </w:r>
+      <w:r>
+        <w:rPr>
+          <w:i/>
+          <w:lang w:val="en-US"/>
+        </w:rPr>
+        <w:t>Massachusetts</w:t>
+      </w:r>
+      <w:r>
+        <w:rPr>
+          <w:lang w:val="en-US"/>
+        </w:rPr>
+        <w:t xml:space="preserve"> : </w:t>
+      </w:r>
+      <w:r>
+        <w:rPr>
+          <w:i/>
+          <w:lang w:val="en-US"/>
+        </w:rPr>
+        <w:t>The</w:t>
+      </w:r>
+      <w:r>
+        <w:rPr>
+          <w:lang w:val="en-US"/>
+        </w:rPr>
+        <w:t xml:space="preserve"> </w:t>
+      </w:r>
+      <w:r>
+        <w:rPr>
+          <w:i/>
+          <w:lang w:val="en-US"/>
+        </w:rPr>
+        <w:t>MIT</w:t>
+      </w:r>
+      <w:r>
+        <w:rPr>
+          <w:lang w:val="en-US"/>
+        </w:rPr>
+        <w:t xml:space="preserve"> </w:t>
+      </w:r>
+      <w:r>
+        <w:rPr>
+          <w:i/>
+          <w:lang w:val="en-US"/>
+        </w:rPr>
+        <w:t>Press</w:t>
+      </w:r>
+      <w:r>
+        <w:rPr>
+          <w:lang w:val="en-US"/>
+        </w:rPr>
+        <w:t xml:space="preserve">, 2022. - 1312 </w:t>
+      </w:r>
+      <w:r>
+        <w:rPr>
+          <w:i/>
+          <w:lang w:val="en-US"/>
+        </w:rPr>
+        <w:t>p.</w:t>
+      </w:r>
+      <w:r>
+        <w:rPr>
+          <w:lang w:val="en-US"/>
+        </w:rPr>
+        <w:t xml:space="preserve"> - </w:t>
+      </w:r>
+      <w:r>
+        <w:rPr>
+          <w:i/>
+          <w:lang w:val="en-US"/>
+        </w:rPr>
+        <w:t>ISBN</w:t>
+      </w:r>
+      <w:r>
+        <w:rPr>
+          <w:lang w:val="en-US"/>
+        </w:rPr>
+        <w:t xml:space="preserve"> 978-0-262-04630-5.</w:t>
+      </w:r>
+    </w:p>
+    <w:p>
+      <w:pPr>
+        <w:rPr>
+          <w:lang w:val="en-US"/>
+        </w:rPr>
+      </w:pPr>
+      <w:r>
+        <w:rPr>
+          <w:lang w:val="en-US"/>
+        </w:rPr>
+        <w:t xml:space="preserve">6. </w:t>
+      </w:r>
+      <w:r>
+        <w:rPr>
+          <w:i/>
+          <w:lang w:val="en-US"/>
+        </w:rPr>
+        <w:t>Kurose</w:t>
+      </w:r>
+      <w:r>
+        <w:rPr>
+          <w:lang w:val="en-US"/>
+        </w:rPr>
+        <w:t xml:space="preserve">, </w:t>
+      </w:r>
+      <w:r>
+        <w:rPr>
+          <w:i/>
+          <w:lang w:val="en-US"/>
+        </w:rPr>
+        <w:t>J.</w:t>
+      </w:r>
+      <w:r>
+        <w:rPr>
+          <w:lang w:val="en-US"/>
+        </w:rPr>
+        <w:t xml:space="preserve"> </w:t>
+      </w:r>
+      <w:r>
+        <w:rPr>
+          <w:i/>
+          <w:lang w:val="en-US"/>
+        </w:rPr>
+        <w:t>F.</w:t>
+      </w:r>
+      <w:r>
+        <w:rPr>
+          <w:lang w:val="en-US"/>
+        </w:rPr>
+        <w:t xml:space="preserve"> </w:t>
+      </w:r>
+      <w:r>
+        <w:rPr>
+          <w:i/>
+          <w:lang w:val="en-US"/>
+        </w:rPr>
+        <w:t>Computer</w:t>
+      </w:r>
+      <w:r>
+        <w:rPr>
+          <w:lang w:val="en-US"/>
+        </w:rPr>
+        <w:t xml:space="preserve"> </w:t>
+      </w:r>
+      <w:r>
+        <w:rPr>
+          <w:i/>
+          <w:lang w:val="en-US"/>
+        </w:rPr>
+        <w:t>Networking:</w:t>
+      </w:r>
+      <w:r>
+        <w:rPr>
+          <w:lang w:val="en-US"/>
+        </w:rPr>
+        <w:t xml:space="preserve"> </w:t>
+      </w:r>
+      <w:r>
+        <w:rPr>
+          <w:i/>
+          <w:lang w:val="en-US"/>
+        </w:rPr>
+        <w:t>A</w:t>
+      </w:r>
+      <w:r>
+        <w:rPr>
+          <w:lang w:val="en-US"/>
+        </w:rPr>
+        <w:t xml:space="preserve"> </w:t>
+      </w:r>
+      <w:r>
+        <w:rPr>
+          <w:i/>
+          <w:lang w:val="en-US"/>
+        </w:rPr>
+        <w:t>Top-Down</w:t>
+      </w:r>
+      <w:r>
+        <w:rPr>
+          <w:lang w:val="en-US"/>
+        </w:rPr>
+        <w:t xml:space="preserve"> </w:t>
+      </w:r>
+      <w:r>
+        <w:rPr>
+          <w:i/>
+          <w:lang w:val="en-US"/>
+        </w:rPr>
+        <w:t>Approach</w:t>
+      </w:r>
+      <w:r>
+        <w:rPr>
+          <w:lang w:val="en-US"/>
+        </w:rPr>
+        <w:t xml:space="preserve"> / </w:t>
+      </w:r>
+      <w:r>
+        <w:rPr>
+          <w:i/>
+          <w:lang w:val="en-US"/>
+        </w:rPr>
+        <w:t>J.</w:t>
+      </w:r>
+      <w:r>
+        <w:rPr>
+          <w:lang w:val="en-US"/>
+        </w:rPr>
+        <w:t xml:space="preserve"> </w:t>
+      </w:r>
+      <w:r>
+        <w:rPr>
+          <w:i/>
+          <w:lang w:val="en-US"/>
+        </w:rPr>
+        <w:t>F.</w:t>
+      </w:r>
+      <w:r>
+        <w:rPr>
+          <w:lang w:val="en-US"/>
+        </w:rPr>
+        <w:t xml:space="preserve"> </w:t>
+      </w:r>
+      <w:r>
+        <w:rPr>
+          <w:i/>
+          <w:lang w:val="en-US"/>
+        </w:rPr>
+        <w:t>Kurose</w:t>
+      </w:r>
+      <w:r>
+        <w:rPr>
+          <w:lang w:val="en-US"/>
+        </w:rPr>
+        <w:t xml:space="preserve">, </w:t>
+      </w:r>
+      <w:r>
+        <w:rPr>
+          <w:i/>
+          <w:lang w:val="en-US"/>
+        </w:rPr>
+        <w:t>K.</w:t>
+      </w:r>
+      <w:r>
+        <w:rPr>
+          <w:lang w:val="en-US"/>
+        </w:rPr>
+        <w:t xml:space="preserve"> </w:t>
+      </w:r>
+      <w:r>
+        <w:rPr>
+          <w:i/>
+          <w:lang w:val="en-US"/>
+        </w:rPr>
+        <w:t>W.</w:t>
+      </w:r>
+      <w:r>
+        <w:rPr>
+          <w:lang w:val="en-US"/>
+        </w:rPr>
+        <w:t xml:space="preserve"> </w:t>
+      </w:r>
+      <w:r>
+        <w:rPr>
+          <w:i/>
+          <w:lang w:val="en-US"/>
+        </w:rPr>
+        <w:t>Ross.</w:t>
+      </w:r>
+      <w:r>
+        <w:rPr>
+          <w:lang w:val="en-US"/>
+        </w:rPr>
+        <w:t xml:space="preserve"> - 8</w:t>
+      </w:r>
+      <w:r>
+        <w:rPr>
+          <w:i/>
+          <w:lang w:val="en-US"/>
+        </w:rPr>
+        <w:t>th</w:t>
+      </w:r>
+      <w:r>
+        <w:rPr>
+          <w:lang w:val="en-US"/>
+        </w:rPr>
+        <w:t xml:space="preserve"> </w:t>
+      </w:r>
+      <w:r>
+        <w:rPr>
+          <w:i/>
+          <w:lang w:val="en-US"/>
+        </w:rPr>
+        <w:t>ed.</w:t>
+      </w:r>
+      <w:r>
+        <w:rPr>
+          <w:lang w:val="en-US"/>
+        </w:rPr>
+        <w:t xml:space="preserve"> - </w:t>
+      </w:r>
+      <w:r>
+        <w:rPr>
+          <w:i/>
+          <w:lang w:val="en-US"/>
+        </w:rPr>
+        <w:t>Pearson</w:t>
+      </w:r>
+      <w:r>
+        <w:rPr>
+          <w:lang w:val="en-US"/>
+        </w:rPr>
+        <w:t xml:space="preserve">, 2021. - 764 </w:t>
+      </w:r>
+      <w:r>
+        <w:rPr>
+          <w:i/>
+          <w:lang w:val="en-US"/>
+        </w:rPr>
+        <w:t>p.</w:t>
+      </w:r>
+      <w:r>
+        <w:rPr>
+          <w:lang w:val="en-US"/>
+        </w:rPr>
+        <w:t xml:space="preserve"> - </w:t>
+      </w:r>
+      <w:r>
+        <w:rPr>
+          <w:i/>
+          <w:lang w:val="en-US"/>
+        </w:rPr>
+        <w:t>ISBN</w:t>
+      </w:r>
+      <w:r>
+        <w:rPr>
+          <w:lang w:val="en-US"/>
+        </w:rPr>
+        <w:t xml:space="preserve"> 978-0-13-668155-7.</w:t>
+      </w:r>
+    </w:p>
+    <w:p>
+      <w:pPr>
+        <w:rPr>
+          <w:lang w:val="en-US"/>
+        </w:rPr>
+      </w:pPr>
+      <w:r>
+        <w:rPr>
+          <w:lang w:val="en-US"/>
+        </w:rPr>
+        <w:t xml:space="preserve">7. </w:t>
+      </w:r>
+      <w:r>
+        <w:rPr>
+          <w:i/>
+          <w:lang w:val="en-US"/>
+        </w:rPr>
+        <w:t>HTML</w:t>
+      </w:r>
+      <w:r>
+        <w:rPr>
+          <w:lang w:val="en-US"/>
+        </w:rPr>
+        <w:t xml:space="preserve"> </w:t>
+      </w:r>
+      <w:r>
+        <w:rPr>
+          <w:i/>
+          <w:lang w:val="en-US"/>
+        </w:rPr>
+        <w:t>Living</w:t>
+      </w:r>
+      <w:r>
+        <w:rPr>
+          <w:lang w:val="en-US"/>
+        </w:rPr>
+        <w:t xml:space="preserve"> </w:t>
+      </w:r>
+      <w:r>
+        <w:rPr>
+          <w:i/>
+          <w:lang w:val="en-US"/>
+        </w:rPr>
+        <w:t>Standard.</w:t>
+      </w:r>
+      <w:r>
+        <w:rPr>
+          <w:lang w:val="en-US"/>
+        </w:rPr>
+        <w:t xml:space="preserve"> </w:t>
+      </w:r>
+      <w:r>
+        <w:rPr>
+          <w:i/>
+          <w:lang w:val="en-US"/>
+        </w:rPr>
+        <w:t>Server-sent</w:t>
+      </w:r>
+      <w:r>
+        <w:rPr>
+          <w:lang w:val="en-US"/>
+        </w:rPr>
+        <w:t xml:space="preserve"> </w:t>
+      </w:r>
+      <w:r>
+        <w:rPr>
+          <w:i/>
+          <w:lang w:val="en-US"/>
+        </w:rPr>
+        <w:t>events</w:t>
+      </w:r>
+      <w:r>
+        <w:rPr>
+          <w:lang w:val="en-US"/>
+        </w:rPr>
+        <w:t xml:space="preserve"> [</w:t>
+      </w:r>
+      <w:r>
+        <w:t>Электронный</w:t>
+      </w:r>
+      <w:r>
+        <w:rPr>
+          <w:lang w:val="en-US"/>
+        </w:rPr>
+        <w:t xml:space="preserve"> </w:t>
+      </w:r>
+      <w:r>
+        <w:t>ресурс</w:t>
+      </w:r>
+      <w:r>
+        <w:rPr>
+          <w:lang w:val="en-US"/>
+        </w:rPr>
+        <w:t xml:space="preserve">] / </w:t>
+      </w:r>
+      <w:r>
+        <w:rPr>
+          <w:i/>
+          <w:lang w:val="en-US"/>
+        </w:rPr>
+        <w:t>WHATWG.</w:t>
+      </w:r>
+      <w:r>
+        <w:rPr>
+          <w:lang w:val="en-US"/>
+        </w:rPr>
+        <w:t xml:space="preserve"> - </w:t>
+      </w:r>
+      <w:r>
+        <w:t>Режим</w:t>
+      </w:r>
+      <w:r>
+        <w:rPr>
+          <w:lang w:val="en-US"/>
+        </w:rPr>
+        <w:t xml:space="preserve"> </w:t>
+      </w:r>
+      <w:r>
+        <w:t>доступа</w:t>
+      </w:r>
+      <w:r>
+        <w:rPr>
+          <w:lang w:val="en-US"/>
+        </w:rPr>
+        <w:t xml:space="preserve">: </w:t>
+      </w:r>
+      <w:r>
+        <w:rPr>
+          <w:i/>
+          <w:lang w:val="en-US"/>
+        </w:rPr>
+        <w:t>https://html.spec.whatwg.org/multipage/server-sent-events.html.</w:t>
+      </w:r>
+      <w:r>
+        <w:rPr>
+          <w:lang w:val="en-US"/>
+        </w:rPr>
+        <w:t xml:space="preserve"> - </w:t>
+      </w:r>
+      <w:r>
+        <w:t>Дата</w:t>
+      </w:r>
+      <w:r>
+        <w:rPr>
+          <w:lang w:val="en-US"/>
+        </w:rPr>
+        <w:t xml:space="preserve"> </w:t>
+      </w:r>
+      <w:r>
+        <w:t>доступа</w:t>
+      </w:r>
+      <w:r>
+        <w:rPr>
+          <w:lang w:val="en-US"/>
+        </w:rPr>
+        <w:t>: 21.10.2026.</w:t>
+      </w:r>
+    </w:p>
+    <w:p>
+      <w:pPr>
+        <w:rPr>
+          <w:lang w:val="en-US"/>
+        </w:rPr>
+      </w:pPr>
+      <w:r>
+        <w:rPr>
+          <w:lang w:val="en-US"/>
+        </w:rPr>
+        <w:t xml:space="preserve">8. </w:t>
+      </w:r>
+      <w:proofErr w:type="spellStart"/>
+      <w:r>
+        <w:rPr>
+          <w:i/>
+          <w:lang w:val="en-US"/>
+        </w:rPr>
+        <w:t>Leskovec</w:t>
+      </w:r>
+      <w:proofErr w:type="spellEnd"/>
+      <w:r>
+        <w:rPr>
+          <w:lang w:val="en-US"/>
+        </w:rPr>
+        <w:t xml:space="preserve">, </w:t>
+      </w:r>
+      <w:r>
+        <w:rPr>
+          <w:i/>
+          <w:lang w:val="en-US"/>
+        </w:rPr>
+        <w:t>J.</w:t>
+      </w:r>
+      <w:r>
+        <w:rPr>
+          <w:lang w:val="en-US"/>
+        </w:rPr>
+        <w:t xml:space="preserve"> </w:t>
+      </w:r>
+      <w:r>
+        <w:rPr>
+          <w:i/>
+          <w:lang w:val="en-US"/>
+        </w:rPr>
+        <w:t>Mining</w:t>
+      </w:r>
+      <w:r>
+        <w:rPr>
+          <w:lang w:val="en-US"/>
+        </w:rPr>
+        <w:t xml:space="preserve"> </w:t>
+      </w:r>
+      <w:r>
+        <w:rPr>
+          <w:i/>
+          <w:lang w:val="en-US"/>
+        </w:rPr>
+        <w:t>of</w:t>
+      </w:r>
+      <w:r>
+        <w:rPr>
+          <w:lang w:val="en-US"/>
+        </w:rPr>
+        <w:t xml:space="preserve"> </w:t>
+      </w:r>
+      <w:r>
+        <w:rPr>
+          <w:i/>
+          <w:lang w:val="en-US"/>
+        </w:rPr>
+        <w:t>Massive</w:t>
+      </w:r>
+      <w:r>
+        <w:rPr>
+          <w:lang w:val="en-US"/>
+        </w:rPr>
+        <w:t xml:space="preserve"> </w:t>
+      </w:r>
+      <w:r>
+        <w:rPr>
+          <w:i/>
+          <w:lang w:val="en-US"/>
+        </w:rPr>
+        <w:t>Datasets</w:t>
+      </w:r>
+      <w:r>
+        <w:rPr>
+          <w:lang w:val="en-US"/>
+        </w:rPr>
+        <w:t xml:space="preserve"> / </w:t>
+      </w:r>
+      <w:r>
+        <w:rPr>
+          <w:i/>
+          <w:lang w:val="en-US"/>
+        </w:rPr>
+        <w:t>J.</w:t>
+      </w:r>
+      <w:r>
+        <w:rPr>
+          <w:lang w:val="en-US"/>
+        </w:rPr>
+        <w:t xml:space="preserve"> </w:t>
+      </w:r>
+      <w:proofErr w:type="spellStart"/>
+      <w:r>
+        <w:rPr>
+          <w:i/>
+          <w:lang w:val="en-US"/>
+        </w:rPr>
+        <w:t>Leskovec</w:t>
+      </w:r>
+      <w:proofErr w:type="spellEnd"/>
+      <w:r>
+        <w:rPr>
+          <w:lang w:val="en-US"/>
+        </w:rPr>
+        <w:t xml:space="preserve">, </w:t>
+      </w:r>
+      <w:r>
+        <w:rPr>
+          <w:i/>
+          <w:lang w:val="en-US"/>
+        </w:rPr>
+        <w:t>A.</w:t>
+      </w:r>
+      <w:r>
+        <w:rPr>
+          <w:lang w:val="en-US"/>
+        </w:rPr>
+        <w:t xml:space="preserve"> </w:t>
+      </w:r>
+      <w:r>
+        <w:rPr>
+          <w:i/>
+          <w:lang w:val="en-US"/>
+        </w:rPr>
+        <w:t>Rajaraman</w:t>
+      </w:r>
+      <w:r>
+        <w:rPr>
+          <w:lang w:val="en-US"/>
+        </w:rPr>
+        <w:t xml:space="preserve">, </w:t>
+      </w:r>
+      <w:r>
+        <w:rPr>
+          <w:i/>
+          <w:lang w:val="en-US"/>
+        </w:rPr>
+        <w:t>J.</w:t>
+      </w:r>
+      <w:r>
+        <w:rPr>
+          <w:lang w:val="en-US"/>
+        </w:rPr>
+        <w:t xml:space="preserve"> </w:t>
+      </w:r>
+      <w:r>
+        <w:rPr>
+          <w:i/>
+          <w:lang w:val="en-US"/>
+        </w:rPr>
+        <w:t>D.</w:t>
+      </w:r>
+      <w:r>
+        <w:rPr>
+          <w:lang w:val="en-US"/>
+        </w:rPr>
+        <w:t xml:space="preserve"> </w:t>
+      </w:r>
+      <w:r>
+        <w:rPr>
+          <w:i/>
+          <w:lang w:val="en-US"/>
+        </w:rPr>
+        <w:t>Ullman.</w:t>
+      </w:r>
+      <w:r>
+        <w:rPr>
+          <w:lang w:val="en-US"/>
+        </w:rPr>
+        <w:t xml:space="preserve"> - 3</w:t>
+      </w:r>
+      <w:r>
+        <w:rPr>
+          <w:i/>
+          <w:lang w:val="en-US"/>
+        </w:rPr>
+        <w:t>rd</w:t>
+      </w:r>
+      <w:r>
+        <w:rPr>
+          <w:lang w:val="en-US"/>
+        </w:rPr>
+        <w:t xml:space="preserve"> </w:t>
+      </w:r>
+      <w:r>
+        <w:rPr>
+          <w:i/>
+          <w:lang w:val="en-US"/>
+        </w:rPr>
+        <w:t>ed.</w:t>
+      </w:r>
+      <w:r>
+        <w:rPr>
+          <w:lang w:val="en-US"/>
+        </w:rPr>
+        <w:t xml:space="preserve"> - </w:t>
+      </w:r>
+      <w:r>
+        <w:rPr>
+          <w:i/>
+          <w:lang w:val="en-US"/>
+        </w:rPr>
+        <w:t>Cambridge</w:t>
+      </w:r>
+      <w:r>
+        <w:rPr>
+          <w:lang w:val="en-US"/>
+        </w:rPr>
+        <w:t xml:space="preserve"> : </w:t>
+      </w:r>
+      <w:r>
+        <w:rPr>
+          <w:i/>
+          <w:lang w:val="en-US"/>
+        </w:rPr>
+        <w:t>Cambridge</w:t>
+      </w:r>
+      <w:r>
+        <w:rPr>
+          <w:lang w:val="en-US"/>
+        </w:rPr>
+        <w:t xml:space="preserve"> </w:t>
+      </w:r>
+      <w:r>
+        <w:rPr>
+          <w:i/>
+          <w:lang w:val="en-US"/>
+        </w:rPr>
+        <w:t>University</w:t>
+      </w:r>
+      <w:r>
+        <w:rPr>
+          <w:lang w:val="en-US"/>
+        </w:rPr>
+        <w:t xml:space="preserve"> </w:t>
+      </w:r>
+      <w:r>
+        <w:rPr>
+          <w:i/>
+          <w:lang w:val="en-US"/>
+        </w:rPr>
+        <w:t>Press</w:t>
+      </w:r>
+      <w:r>
+        <w:rPr>
+          <w:lang w:val="en-US"/>
+        </w:rPr>
+        <w:t xml:space="preserve">, 2020. - 566 </w:t>
+      </w:r>
+      <w:r>
+        <w:rPr>
+          <w:i/>
+          <w:lang w:val="en-US"/>
+        </w:rPr>
+        <w:t>p.</w:t>
+      </w:r>
+      <w:r>
+        <w:rPr>
+          <w:lang w:val="en-US"/>
+        </w:rPr>
+        <w:t xml:space="preserve"> - </w:t>
+      </w:r>
+      <w:r>
+        <w:rPr>
+          <w:i/>
+          <w:lang w:val="en-US"/>
+        </w:rPr>
+        <w:t>ISBN</w:t>
+      </w:r>
+      <w:r>
+        <w:rPr>
+          <w:lang w:val="en-US"/>
+        </w:rPr>
+        <w:t xml:space="preserve"> 978-1-108-47634-8.</w:t>
+      </w:r>
+    </w:p>
+    <w:p>
+      <w:pPr>
+        <w:rPr>
+          <w:lang w:val="en-US"/>
+        </w:rPr>
+      </w:pPr>
+      <w:r>
+        <w:rPr>
+          <w:lang w:val="en-US"/>
+        </w:rPr>
+        <w:t xml:space="preserve">9. </w:t>
+      </w:r>
+      <w:proofErr w:type="spellStart"/>
+      <w:r>
+        <w:rPr>
+          <w:i/>
+          <w:lang w:val="en-US"/>
+        </w:rPr>
+        <w:t>Aumasson</w:t>
+      </w:r>
+      <w:proofErr w:type="spellEnd"/>
+      <w:r>
+        <w:rPr>
+          <w:lang w:val="en-US"/>
+        </w:rPr>
+        <w:t xml:space="preserve">, </w:t>
+      </w:r>
+      <w:r>
+        <w:rPr>
+          <w:i/>
+          <w:lang w:val="en-US"/>
+        </w:rPr>
+        <w:t>J.-P.</w:t>
+      </w:r>
+      <w:r>
+        <w:rPr>
+          <w:lang w:val="en-US"/>
+        </w:rPr>
+        <w:t xml:space="preserve"> </w:t>
+      </w:r>
+      <w:r>
+        <w:rPr>
+          <w:i/>
+          <w:lang w:val="en-US"/>
+        </w:rPr>
+        <w:t>Serious</w:t>
+      </w:r>
+      <w:r>
+        <w:rPr>
+          <w:lang w:val="en-US"/>
+        </w:rPr>
+        <w:t xml:space="preserve"> </w:t>
+      </w:r>
+      <w:r>
+        <w:rPr>
+          <w:i/>
+          <w:lang w:val="en-US"/>
+        </w:rPr>
+        <w:t>Cryptography:</w:t>
+      </w:r>
+      <w:r>
+        <w:rPr>
+          <w:lang w:val="en-US"/>
+        </w:rPr>
+        <w:t xml:space="preserve"> </w:t>
+      </w:r>
+      <w:r>
+        <w:rPr>
+          <w:i/>
+          <w:lang w:val="en-US"/>
+        </w:rPr>
+        <w:t>A</w:t>
+      </w:r>
+      <w:r>
+        <w:rPr>
+          <w:lang w:val="en-US"/>
+        </w:rPr>
+        <w:t xml:space="preserve"> </w:t>
+      </w:r>
+      <w:r>
+        <w:rPr>
+          <w:i/>
+          <w:lang w:val="en-US"/>
+        </w:rPr>
+        <w:t>Practical</w:t>
+      </w:r>
+      <w:r>
+        <w:rPr>
+          <w:lang w:val="en-US"/>
+        </w:rPr>
+        <w:t xml:space="preserve"> </w:t>
+      </w:r>
+      <w:r>
+        <w:rPr>
+          <w:i/>
+          <w:lang w:val="en-US"/>
+        </w:rPr>
+        <w:t>Introduction</w:t>
+      </w:r>
+      <w:r>
+        <w:rPr>
+          <w:lang w:val="en-US"/>
+        </w:rPr>
+        <w:t xml:space="preserve"> </w:t>
+      </w:r>
+      <w:r>
+        <w:rPr>
+          <w:i/>
+          <w:lang w:val="en-US"/>
+        </w:rPr>
+        <w:t>to</w:t>
+      </w:r>
+      <w:r>
+        <w:rPr>
+          <w:lang w:val="en-US"/>
+        </w:rPr>
+        <w:t xml:space="preserve"> </w:t>
+      </w:r>
+      <w:r>
+        <w:rPr>
+          <w:i/>
+          <w:lang w:val="en-US"/>
+        </w:rPr>
+        <w:t>Modern</w:t>
+      </w:r>
+      <w:r>
+        <w:rPr>
+          <w:lang w:val="en-US"/>
+        </w:rPr>
+        <w:t xml:space="preserve"> </w:t>
+      </w:r>
+      <w:r>
+        <w:rPr>
+          <w:i/>
+          <w:lang w:val="en-US"/>
+        </w:rPr>
+        <w:t>Encryption</w:t>
+      </w:r>
+      <w:r>
+        <w:rPr>
+          <w:lang w:val="en-US"/>
+        </w:rPr>
+        <w:t xml:space="preserve"> / </w:t>
+      </w:r>
+      <w:r>
+        <w:rPr>
+          <w:i/>
+          <w:lang w:val="en-US"/>
+        </w:rPr>
+        <w:t>J.-P.</w:t>
+      </w:r>
+      <w:r>
+        <w:rPr>
+          <w:lang w:val="en-US"/>
+        </w:rPr>
+        <w:t xml:space="preserve"> </w:t>
+      </w:r>
+      <w:proofErr w:type="spellStart"/>
+      <w:r>
+        <w:rPr>
+          <w:i/>
+          <w:lang w:val="en-US"/>
+        </w:rPr>
+        <w:t>Aumasson</w:t>
+      </w:r>
+      <w:proofErr w:type="spellEnd"/>
+      <w:r>
+        <w:rPr>
+          <w:i/>
+          <w:lang w:val="en-US"/>
+        </w:rPr>
+        <w:t>.</w:t>
+      </w:r>
+      <w:r>
+        <w:rPr>
+          <w:lang w:val="en-US"/>
+        </w:rPr>
+        <w:t xml:space="preserve"> - 2</w:t>
+      </w:r>
+      <w:r>
+        <w:rPr>
+          <w:i/>
+          <w:lang w:val="en-US"/>
+        </w:rPr>
+        <w:t>nd</w:t>
+      </w:r>
+      <w:r>
+        <w:rPr>
+          <w:lang w:val="en-US"/>
+        </w:rPr>
+        <w:t xml:space="preserve"> </w:t>
+      </w:r>
+      <w:r>
+        <w:rPr>
+          <w:i/>
+          <w:lang w:val="en-US"/>
+        </w:rPr>
+        <w:t>ed.</w:t>
+      </w:r>
+      <w:r>
+        <w:rPr>
+          <w:lang w:val="en-US"/>
+        </w:rPr>
+        <w:t xml:space="preserve"> - </w:t>
+      </w:r>
+      <w:r>
+        <w:rPr>
+          <w:i/>
+          <w:lang w:val="en-US"/>
+        </w:rPr>
+        <w:t>San</w:t>
+      </w:r>
+      <w:r>
+        <w:rPr>
+          <w:lang w:val="en-US"/>
+        </w:rPr>
+        <w:t xml:space="preserve"> </w:t>
+      </w:r>
+      <w:r>
+        <w:rPr>
+          <w:i/>
+          <w:lang w:val="en-US"/>
+        </w:rPr>
+        <w:t>Francisco</w:t>
+      </w:r>
+      <w:r>
+        <w:rPr>
+          <w:lang w:val="en-US"/>
+        </w:rPr>
+        <w:t xml:space="preserve"> : </w:t>
+      </w:r>
+      <w:r>
+        <w:rPr>
+          <w:i/>
+          <w:lang w:val="en-US"/>
+        </w:rPr>
+        <w:t>No</w:t>
+      </w:r>
+      <w:r>
+        <w:rPr>
+          <w:lang w:val="en-US"/>
+        </w:rPr>
+        <w:t xml:space="preserve"> </w:t>
+      </w:r>
+      <w:r>
+        <w:rPr>
+          <w:i/>
+          <w:lang w:val="en-US"/>
+        </w:rPr>
+        <w:t>Starch</w:t>
+      </w:r>
+      <w:r>
+        <w:rPr>
+          <w:lang w:val="en-US"/>
+        </w:rPr>
+        <w:t xml:space="preserve"> </w:t>
+      </w:r>
+      <w:r>
+        <w:rPr>
+          <w:i/>
+          <w:lang w:val="en-US"/>
+        </w:rPr>
+        <w:t>Press</w:t>
+      </w:r>
+      <w:r>
+        <w:rPr>
+          <w:lang w:val="en-US"/>
+        </w:rPr>
+        <w:t xml:space="preserve">, 2024. - 376 </w:t>
+      </w:r>
+      <w:r>
+        <w:rPr>
+          <w:i/>
+          <w:lang w:val="en-US"/>
+        </w:rPr>
+        <w:t>p.</w:t>
+      </w:r>
+      <w:r>
+        <w:rPr>
+          <w:lang w:val="en-US"/>
+        </w:rPr>
+        <w:t xml:space="preserve"> - </w:t>
+      </w:r>
+      <w:r>
+        <w:rPr>
+          <w:i/>
+          <w:lang w:val="en-US"/>
+        </w:rPr>
+        <w:t>ISBN</w:t>
+      </w:r>
+      <w:r>
+        <w:rPr>
+          <w:lang w:val="en-US"/>
+        </w:rPr>
+        <w:t xml:space="preserve"> 978-1-71850-384-7.</w:t>
+      </w:r>
+    </w:p>
+    <w:p>
+      <w:pPr>
+        <w:rPr>
+          <w:lang w:val="en-US"/>
+        </w:rPr>
+      </w:pPr>
+      <w:r>
+        <w:rPr>
+          <w:lang w:val="en-US"/>
+        </w:rPr>
         <w:t xml:space="preserve">10. </w:t>
       </w:r>
       <w:r>
         <w:rPr>
           <w:i/>
+          <w:lang w:val="en-US"/>
         </w:rPr>
         <w:t>Beaulieu</w:t>
       </w:r>
       <w:r>
+        <w:rPr>
+          <w:lang w:val="en-US"/>
+        </w:rPr>
         <w:t xml:space="preserve">, </w:t>
       </w:r>
       <w:r>
         <w:rPr>
           <w:i/>
+          <w:lang w:val="en-US"/>
         </w:rPr>
         <w:t>A.</w:t>
       </w:r>
       <w:r>
+        <w:rPr>
+          <w:lang w:val="en-US"/>
+        </w:rPr>
         <w:t xml:space="preserve"> </w:t>
       </w:r>
       <w:r>
         <w:rPr>
           <w:i/>
+          <w:lang w:val="en-US"/>
         </w:rPr>
         <w:t>Learning</w:t>
       </w:r>
       <w:r>
+        <w:rPr>
+          <w:lang w:val="en-US"/>
+        </w:rPr>
         <w:t xml:space="preserve"> </w:t>
       </w:r>
       <w:r>
         <w:rPr>
           <w:i/>
+          <w:lang w:val="en-US"/>
         </w:rPr>
         <w:t>SQL:</w:t>
       </w:r>
       <w:r>
+        <w:rPr>
+          <w:lang w:val="en-US"/>
+        </w:rPr>
         <w:t xml:space="preserve"> </w:t>
       </w:r>
       <w:r>
         <w:rPr>
           <w:i/>
+          <w:lang w:val="en-US"/>
         </w:rPr>
         <w:t>Generate</w:t>
       </w:r>
       <w:r>
+        <w:rPr>
+          <w:lang w:val="en-US"/>
+        </w:rPr>
         <w:t xml:space="preserve">, </w:t>
       </w:r>
       <w:r>
         <w:rPr>
           <w:i/>
+          <w:lang w:val="en-US"/>
         </w:rPr>
         <w:t>Manipulate</w:t>
       </w:r>
       <w:r>
+        <w:rPr>
+          <w:lang w:val="en-US"/>
+        </w:rPr>
         <w:t xml:space="preserve">, </w:t>
       </w:r>
       <w:r>
         <w:rPr>
           <w:i/>
+          <w:lang w:val="en-US"/>
         </w:rPr>
         <w:t>and</w:t>
       </w:r>
       <w:r>
+        <w:rPr>
+          <w:lang w:val="en-US"/>
+        </w:rPr>
         <w:t xml:space="preserve"> </w:t>
       </w:r>
       <w:r>
         <w:rPr>
           <w:i/>
+          <w:lang w:val="en-US"/>
         </w:rPr>
         <w:t>Retrieve</w:t>
       </w:r>
       <w:r>
+        <w:rPr>
+          <w:lang w:val="en-US"/>
+        </w:rPr>
         <w:t xml:space="preserve"> </w:t>
       </w:r>
       <w:r>
         <w:rPr>
           <w:i/>
+          <w:lang w:val="en-US"/>
         </w:rPr>
         <w:t>Data</w:t>
       </w:r>
       <w:r>
+        <w:rPr>
+          <w:lang w:val="en-US"/>
+        </w:rPr>
         <w:t xml:space="preserve"> / </w:t>
       </w:r>
       <w:r>
         <w:rPr>
           <w:i/>
+          <w:lang w:val="en-US"/>
         </w:rPr>
         <w:t>A.</w:t>
       </w:r>
       <w:r>
+        <w:rPr>
+          <w:lang w:val="en-US"/>
+        </w:rPr>
         <w:t xml:space="preserve"> </w:t>
       </w:r>
       <w:r>
         <w:rPr>
           <w:i/>
+          <w:lang w:val="en-US"/>
         </w:rPr>
         <w:t>Beaulieu.</w:t>
       </w:r>
       <w:r>
+        <w:rPr>
+          <w:lang w:val="en-US"/>
+        </w:rPr>
         <w:t xml:space="preserve"> - 3</w:t>
       </w:r>
       <w:r>
         <w:rPr>
           <w:i/>
+          <w:lang w:val="en-US"/>
         </w:rPr>
         <w:t>rd</w:t>
       </w:r>
       <w:r>
+        <w:rPr>
+          <w:lang w:val="en-US"/>
+        </w:rPr>
         <w:t xml:space="preserve"> </w:t>
       </w:r>
       <w:r>
         <w:rPr>
           <w:i/>
+          <w:lang w:val="en-US"/>
         </w:rPr>
         <w:t>ed.</w:t>
       </w:r>
       <w:r>
+        <w:rPr>
+          <w:lang w:val="en-US"/>
+        </w:rPr>
         <w:t xml:space="preserve"> - </w:t>
       </w:r>
       <w:r>
         <w:rPr>
           <w:i/>
+          <w:lang w:val="en-US"/>
         </w:rPr>
         <w:t>Sebastopol</w:t>
       </w:r>
       <w:r>
+        <w:rPr>
+          <w:lang w:val="en-US"/>
+        </w:rPr>
         <w:t xml:space="preserve"> : </w:t>
       </w:r>
       <w:r>
         <w:rPr>
           <w:i/>
+          <w:lang w:val="en-US"/>
         </w:rPr>
         <w:t>O’Reilly</w:t>
       </w:r>
       <w:r>
+        <w:rPr>
+          <w:lang w:val="en-US"/>
+        </w:rPr>
         <w:t xml:space="preserve"> </w:t>
       </w:r>
       <w:r>
         <w:rPr>
           <w:i/>
+          <w:lang w:val="en-US"/>
         </w:rPr>
         <w:t>Media</w:t>
       </w:r>
       <w:r>
+        <w:rPr>
+          <w:lang w:val="en-US"/>
+        </w:rPr>
         <w:t xml:space="preserve">, 2020. - 380 </w:t>
       </w:r>
       <w:r>
         <w:rPr>
           <w:i/>
+          <w:lang w:val="en-US"/>
         </w:rPr>
         <w:t>p.</w:t>
       </w:r>
       <w:r>
+        <w:rPr>
+          <w:lang w:val="en-US"/>
+        </w:rPr>
         <w:t xml:space="preserve"> - </w:t>
       </w:r>
       <w:r>
         <w:rPr>
           <w:i/>
+          <w:lang w:val="en-US"/>
         </w:rPr>
         <w:t>ISBN</w:t>
       </w:r>
       <w:r>
+        <w:rPr>
+          <w:lang w:val="en-US"/>
+        </w:rPr>
         <w:t xml:space="preserve"> 978-1-492-05761-1.</w:t>
       </w:r>
     </w:p>

</xml_diff>

<commit_message>
docs: frame chapter one as technology evaluation and design choices
</commit_message>
<xml_diff>
--- a/docs/coursework/ПЗ_Белковец.docx
+++ b/docs/coursework/ПЗ_Белковец.docx
@@ -218,7 +218,7 @@
         <w:rPr>
           <w:noProof/>
         </w:rPr>
-        <w:t>7</w:t>
+        <w:t>8</w:t>
       </w:r>
       <w:r>
         <w:fldChar w:fldCharType="end"/>
@@ -252,7 +252,7 @@
         <w:rPr>
           <w:noProof/>
         </w:rPr>
-        <w:t>8</w:t>
+        <w:t>9</w:t>
       </w:r>
       <w:r>
         <w:fldChar w:fldCharType="end"/>
@@ -320,7 +320,7 @@
         <w:rPr>
           <w:noProof/>
         </w:rPr>
-        <w:t>11</w:t>
+        <w:t>12</w:t>
       </w:r>
       <w:r>
         <w:fldChar w:fldCharType="end"/>
@@ -406,15 +406,7 @@
         <w:ind w:left="709" w:firstLine="0"/>
       </w:pPr>
       <w:r>
-        <w:t xml:space="preserve">- организовать контроль работоспособности </w:t>
-      </w:r>
-      <w:proofErr w:type="spellStart"/>
-      <w:r>
-        <w:t>воркеров</w:t>
-      </w:r>
-      <w:proofErr w:type="spellEnd"/>
-      <w:r>
-        <w:t xml:space="preserve"> по </w:t>
+        <w:t xml:space="preserve">- организовать контроль работоспособности воркеров по </w:t>
       </w:r>
       <w:r>
         <w:rPr>
@@ -453,100 +445,25 @@
     </w:p>
     <w:p>
       <w:r>
-        <w:t xml:space="preserve">Программный комплекс получил название </w:t>
-      </w:r>
-      <w:proofErr w:type="spellStart"/>
-      <w:r>
-        <w:rPr>
-          <w:i/>
-        </w:rPr>
-        <w:t>BasketNet</w:t>
-      </w:r>
-      <w:proofErr w:type="spellEnd"/>
-      <w:r>
-        <w:t xml:space="preserve">. Пользовательская часть представлена веб-магазином: посетитель просматривает каталог, после </w:t>
+        <w:t xml:space="preserve">Для проектируемого программного комплекса предлагается название </w:t>
+      </w:r>
+      <w:r>
+        <w:rPr>
+          <w:i/>
+        </w:rPr>
+        <w:t>BasketNet.</w:t>
+      </w:r>
+      <w:r>
+        <w:t xml:space="preserve"> В качестве прикладного сценария целесообразно выбрать учебный </w:t>
       </w:r>
       <w:r>
         <w:lastRenderedPageBreak/>
-        <w:t xml:space="preserve">входа собирает корзину, применяет купон и оформляет учебный заказ. В административной части доступны каталог, настройки купонов, аналитика, состояние </w:t>
-      </w:r>
-      <w:proofErr w:type="spellStart"/>
-      <w:r>
-        <w:t>воркеров</w:t>
-      </w:r>
-      <w:proofErr w:type="spellEnd"/>
-      <w:r>
-        <w:t xml:space="preserve"> и генератор тестовых заказов. Такая организация связывает распределённые вычисления с предметной областью и позволяет наблюдать прохождение транзакции от ввода до получения чека.</w:t>
+        <w:t>веб-магазин: каталог, корзину, купоны и оформление заказа с электронным чеком. Для администратора следует предусмотреть настройку каталога, анализ покупок, наблюдение за вычислительными узлами и генерацию тестовой нагрузки. Такой сценарий позволит связать распределённые вычисления с предметной областью и проверить прохождение транзакции от ввода до получения результата.</w:t>
       </w:r>
     </w:p>
     <w:p>
       <w:r>
-        <w:t xml:space="preserve">Для реализации выбраны </w:t>
-      </w:r>
-      <w:r>
-        <w:rPr>
-          <w:i/>
-        </w:rPr>
-        <w:t>Python</w:t>
-      </w:r>
-      <w:r>
-        <w:t xml:space="preserve"> 3.12, сокеты </w:t>
-      </w:r>
-      <w:r>
-        <w:rPr>
-          <w:i/>
-        </w:rPr>
-        <w:t>TCP</w:t>
-      </w:r>
-      <w:r>
-        <w:t xml:space="preserve"> и </w:t>
-      </w:r>
-      <w:r>
-        <w:rPr>
-          <w:i/>
-        </w:rPr>
-        <w:t>UDP</w:t>
-      </w:r>
-      <w:r>
-        <w:t xml:space="preserve">, стандартные средства многопоточности, </w:t>
-      </w:r>
-      <w:proofErr w:type="spellStart"/>
-      <w:r>
-        <w:rPr>
-          <w:i/>
-        </w:rPr>
-        <w:t>SQLite</w:t>
-      </w:r>
-      <w:proofErr w:type="spellEnd"/>
-      <w:r>
-        <w:t xml:space="preserve">, </w:t>
-      </w:r>
-      <w:r>
-        <w:rPr>
-          <w:i/>
-        </w:rPr>
-        <w:t>HTML</w:t>
-      </w:r>
-      <w:r>
-        <w:t xml:space="preserve">, </w:t>
-      </w:r>
-      <w:r>
-        <w:rPr>
-          <w:i/>
-        </w:rPr>
-        <w:t>CSS</w:t>
-      </w:r>
-      <w:r>
-        <w:t xml:space="preserve"> и </w:t>
-      </w:r>
-      <w:r>
-        <w:rPr>
-          <w:i/>
-        </w:rPr>
-        <w:t>JavaScript</w:t>
-      </w:r>
-      <w:r>
-        <w:t>. Вычислительные узлы запускаются отдельными процессами, поэтому обработка может выполняться как на одном многоядерном компьютере, так и на нескольких узлах локальной сети. Разработка не требует внешнего сервиса очередей и позволяет изучить механизм брокера непосредственно по его исходному коду.</w:t>
+        <w:t>Выбор архитектуры, языка программирования, сетевых протоколов и средств хранения необходимо выполнить с учётом учебного задания. Основными критериями являются наглядность обмена сообщениями, возможность параллельной обработки, доступность средств контроля отказов и простота развёртывания в локальной сети. Предпочтение следует отдать средствам, позволяющим реализовать собственный механизм распределения заданий без внешнего сервиса очередей.</w:t>
       </w:r>
     </w:p>
     <w:p>
@@ -609,52 +526,17 @@
         <w:t>Python</w:t>
       </w:r>
       <w:r>
-        <w:t xml:space="preserve"> это также не равнозначно запуску независимых интерпретаторов. В книге М. </w:t>
-      </w:r>
-      <w:proofErr w:type="spellStart"/>
-      <w:r>
-        <w:t>Фаулера</w:t>
-      </w:r>
-      <w:proofErr w:type="spellEnd"/>
-      <w:r>
-        <w:t xml:space="preserve"> рассмотрены различия потоков, процессов и асинхронного исполнения; поэтому в </w:t>
-      </w:r>
-      <w:proofErr w:type="spellStart"/>
-      <w:r>
-        <w:rPr>
-          <w:i/>
-        </w:rPr>
-        <w:t>BasketNet</w:t>
-      </w:r>
-      <w:proofErr w:type="spellEnd"/>
-      <w:r>
-        <w:t xml:space="preserve"> многопоточность используется преимущественно для сетевого обслуживания и управления [1].</w:t>
+        <w:t xml:space="preserve"> это не равнозначно запуску независимых интерпретаторов. Различия потоков, процессов и асинхронного исполнения рассматриваются в книге М. Фаулера [1]. Для проектируемой системы целесообразно разделить сетевое обслуживание и выполнение вычислений.</w:t>
       </w:r>
     </w:p>
     <w:p>
       <w:r>
-        <w:t xml:space="preserve">В архитектуре с брокером клиент передаёт описание задания посреднику. Брокер проверяет запрос, помещает его в очередь и назначает исполнителя. </w:t>
-      </w:r>
-      <w:proofErr w:type="spellStart"/>
-      <w:r>
-        <w:t>Воркер</w:t>
-      </w:r>
-      <w:proofErr w:type="spellEnd"/>
-      <w:r>
-        <w:t xml:space="preserve"> получает данные, выполняет операцию и возвращает результат. Клиент может получать сведения о ходе работы независимо от продолжительности вычисления. Добавление исполнителя увеличивает доступный вычислительный ресурс без изменения формата запроса. Разделение компонентов, обмен сообщениями и обработка частичных отказов относятся к основным вопросам построения распределённых систем [2].</w:t>
+        <w:t>В архитектуре с брокером клиент передаёт описание задания посреднику. Брокер проверяет запрос, помещает его в очередь и назначает исполнителя. Воркер получает данные, выполняет операцию и возвращает результат. Клиент может получать сведения о ходе работы независимо от продолжительности вычисления. Добавление исполнителя увеличивает доступный вычислительный ресурс без изменения формата запроса. Разделение компонентов, обмен сообщениями и обработка частичных отказов относятся к основным вопросам построения распределённых систем [2].</w:t>
       </w:r>
     </w:p>
     <w:p>
       <w:r>
-        <w:t xml:space="preserve">Для рассматриваемой задачи брокер является центром принятия решений о назначении работ. Он знает приоритет, состояние и номер попытки каждого задания, а также доступность исполнителей. </w:t>
-      </w:r>
-      <w:proofErr w:type="spellStart"/>
-      <w:r>
-        <w:t>Воркеры</w:t>
-      </w:r>
-      <w:proofErr w:type="spellEnd"/>
-      <w:r>
-        <w:t xml:space="preserve"> не выбирают произвольные задания из базы и не изменяют сведения о заказе напрямую. Это уменьшает число мест, в которых требуется разрешать конфликты состояния, и делает поведение при отказе наблюдаемым.</w:t>
+        <w:t>При выборе архитектуры с брокером следует сосредоточить решения о назначении работ в одном компоненте. Для этого ему потребуются сведения о приоритетах, состоянии заданий и доступности исполнителей. Прямое изменение прикладных данных вычислительными узлами целесообразно исключить: исполнитель должен возвращать результат, а решение о его принятии следует оставлять управляющему компоненту. Такой подход упрощает согласование состояний и последующий анализ отказов.</w:t>
       </w:r>
     </w:p>
     <w:p>
@@ -949,13 +831,8 @@
               <w:pStyle w:val="TableText"/>
             </w:pPr>
             <w:r>
-              <w:t>Брокер и процессы-</w:t>
+              <w:t>Брокер и процессы-воркеры</w:t>
             </w:r>
-            <w:proofErr w:type="spellStart"/>
-            <w:r>
-              <w:t>воркеры</w:t>
-            </w:r>
-            <w:proofErr w:type="spellEnd"/>
           </w:p>
         </w:tc>
         <w:tc>
@@ -1069,34 +946,16 @@
     <w:p/>
     <w:p>
       <w:r>
-        <w:t xml:space="preserve">Для </w:t>
-      </w:r>
-      <w:proofErr w:type="spellStart"/>
+        <w:t xml:space="preserve">По результатам сравнения для </w:t>
+      </w:r>
       <w:r>
         <w:rPr>
           <w:i/>
         </w:rPr>
         <w:t>BasketNet</w:t>
       </w:r>
-      <w:proofErr w:type="spellEnd"/>
-      <w:r>
-        <w:t xml:space="preserve"> выбран централизованный брокер с отдельными процессами-</w:t>
-      </w:r>
-      <w:proofErr w:type="spellStart"/>
-      <w:r>
-        <w:t>воркерами</w:t>
-      </w:r>
-      <w:proofErr w:type="spellEnd"/>
-      <w:r>
-        <w:t xml:space="preserve">. Централизация упрощает реализацию очереди и подтверждений, а процессы обеспечивают независимое выполнение вычислений. При этом сам брокер становится единой точкой отказа. В проекте это ограничение зафиксировано: восстановление после отказа </w:t>
-      </w:r>
-      <w:proofErr w:type="spellStart"/>
-      <w:r>
-        <w:t>воркера</w:t>
-      </w:r>
-      <w:proofErr w:type="spellEnd"/>
-      <w:r>
-        <w:t xml:space="preserve"> реализовано, автоматическое резервирование брокера не заявляется.</w:t>
+      <w:r>
+        <w:t xml:space="preserve"> целесообразно выбрать централизованный брокер с отдельными процессами-воркерами. Централизация позволит упростить управление очередью и подтверждениями, а процессы - организовать независимое выполнение вычислений. При этом брокер останется единой точкой отказа. Поэтому в требования необходимо включить восстановление после отказа исполнителя, а автоматическое резервирование самого брокера определить как направление возможного развития.</w:t>
       </w:r>
     </w:p>
     <w:p>
@@ -1123,37 +982,25 @@
       <w:r>
         <w:t xml:space="preserve">В готовых системах очередей подтверждение доставки и выполнения является отдельным механизмом. В документации </w:t>
       </w:r>
-      <w:proofErr w:type="spellStart"/>
       <w:r>
         <w:rPr>
           <w:i/>
         </w:rPr>
         <w:t>RabbitMQ</w:t>
       </w:r>
-      <w:proofErr w:type="spellEnd"/>
       <w:r>
         <w:t xml:space="preserve"> различаются подтверждения от потребителя и подтверждения публикации. При отсутствии успешного завершения сообщение может быть возвращено для повторной обработки [3]. Для собственного брокера существенен тот же инженерный принцип: факт отправки по соединению не доказывает, что прикладной расчёт завершён.</w:t>
       </w:r>
     </w:p>
     <w:p>
-      <w:proofErr w:type="spellStart"/>
       <w:r>
         <w:rPr>
           <w:i/>
         </w:rPr>
         <w:t>Celery</w:t>
       </w:r>
-      <w:proofErr w:type="spellEnd"/>
-      <w:r>
-        <w:t xml:space="preserve"> представляет более высокий уровень организации фоновых работ: клиент отправляет описание задачи, а </w:t>
-      </w:r>
-      <w:proofErr w:type="spellStart"/>
-      <w:r>
-        <w:t>воркеры</w:t>
-      </w:r>
-      <w:proofErr w:type="spellEnd"/>
-      <w:r>
-        <w:t xml:space="preserve"> выполняют её с использованием брокера сообщений [4]. Применение такого средства сокращает объём самостоятельно разрабатываемой инфраструктуры. Однако учебное задание требует показать собственные алгоритмы </w:t>
+      <w:r>
+        <w:t xml:space="preserve"> представляет более высокий уровень организации фоновых работ: клиент отправляет описание задачи, а воркеры выполняют её с использованием брокера сообщений [4]. Применение такого средства сокращает объём самостоятельно разрабатываемой инфраструктуры. Однако учебное задание требует показать собственные алгоритмы </w:t>
       </w:r>
       <w:r>
         <w:rPr>
@@ -1171,21 +1018,7 @@
         <w:t>UDP-</w:t>
       </w:r>
       <w:r>
-        <w:t xml:space="preserve">контроля и многопоточного планирования. Поэтому готовые брокеры рассматриваются как аналоги, а не включаются в состав </w:t>
-      </w:r>
-      <w:proofErr w:type="spellStart"/>
-      <w:r>
-        <w:rPr>
-          <w:i/>
-        </w:rPr>
-        <w:t>BasketNet</w:t>
-      </w:r>
-      <w:proofErr w:type="spellEnd"/>
-      <w:r>
-        <w:rPr>
-          <w:i/>
-        </w:rPr>
-        <w:t>.</w:t>
+        <w:t>контроля и многопоточного планирования. Поэтому готовые брокеры следует рассматривать как аналоги; основу разрабатываемой системы должен составить собственный механизм обмена.</w:t>
       </w:r>
     </w:p>
     <w:p>
@@ -1199,11 +1032,11 @@
         <w:t>FIFO</w:t>
       </w:r>
       <w:r>
-        <w:t xml:space="preserve"> сохраняет последовательность запросов, но не выделяет срочные транзакции. Строгий приоритет позволяет обрабатывать более важные задания раньше, однако при постоянном поступлении срочных запросов может </w:t>
+        <w:t xml:space="preserve"> сохраняет последовательность запросов, но не выделяет </w:t>
       </w:r>
       <w:r>
         <w:lastRenderedPageBreak/>
-        <w:t xml:space="preserve">задерживать менее важные. В проекте применяется строгий приоритет с </w:t>
+        <w:t xml:space="preserve">срочные транзакции. Строгий приоритет позволяет обрабатывать более важные задания раньше, однако при постоянном поступлении срочных запросов может задерживать менее важные. Для учебной системы предлагается строгий приоритет с </w:t>
       </w:r>
       <w:r>
         <w:rPr>
@@ -1212,31 +1045,12 @@
         <w:t>FIFO</w:t>
       </w:r>
       <w:r>
-        <w:t xml:space="preserve"> внутри каждого уровня. Старение приоритета в текущей версии не реализовано.</w:t>
+        <w:t xml:space="preserve"> внутри каждого уровня. Механизм старения приоритетов потребовал бы отдельного обоснования и не относится к обязательным требованиям.</w:t>
       </w:r>
     </w:p>
     <w:p>
       <w:r>
-        <w:t xml:space="preserve">Хранение очереди в двоичной куче позволяет получать минимальный ключ без полной сортировки списка. Двоичные кучи и реализация очередей с приоритетами рассматриваются в учебнике Т. </w:t>
-      </w:r>
-      <w:proofErr w:type="spellStart"/>
-      <w:r>
-        <w:t>Кормена</w:t>
-      </w:r>
-      <w:proofErr w:type="spellEnd"/>
-      <w:r>
-        <w:t xml:space="preserve"> и соавторов [5]. В </w:t>
-      </w:r>
-      <w:proofErr w:type="spellStart"/>
-      <w:r>
-        <w:rPr>
-          <w:i/>
-        </w:rPr>
-        <w:t>BasketNet</w:t>
-      </w:r>
-      <w:proofErr w:type="spellEnd"/>
-      <w:r>
-        <w:t xml:space="preserve"> ключ включает отрицательный приоритет, возрастающий номер поступления и идентификатор задания. Такая структура обеспечивает однозначное сравнение даже для сложных исходных данных.</w:t>
+        <w:t>Для представления очереди можно использовать отсортированный список либо двоичную кучу. Куча позволяет выбирать элемент с минимальным ключом без полной сортировки набора; устройство таких структур и очередей с приоритетами рассматривается в учебнике Т. Кормена и соавторов [5]. Поэтому для последующей реализации целесообразно выбрать кучу. При равных приоритетах потребуется дополнительный признак порядка поступления, обеспечивающий однозначный выбор задания.</w:t>
       </w:r>
     </w:p>
     <w:p>
@@ -1250,28 +1064,12 @@
         <w:t>TCP</w:t>
       </w:r>
       <w:r>
-        <w:t xml:space="preserve"> повторяет передачу потерянных сегментов, но при разрыве соединения после вычисления клиент может не знать, был ли результат принят. Если брокер выдаст работу повторно, фактическое вычисление может произойти несколько раз. Для проекта выбрана модель повторного исполнения с принятием только актуального результата. Она допустима, поскольку операции </w:t>
-      </w:r>
-      <w:proofErr w:type="spellStart"/>
-      <w:r>
-        <w:t>воркера</w:t>
-      </w:r>
-      <w:proofErr w:type="spellEnd"/>
-      <w:r>
-        <w:t xml:space="preserve"> не списывают деньги и не изменяют внешние остатки товаров.</w:t>
+        <w:t xml:space="preserve"> повторяет передачу потерянных сегментов, но при разрыве соединения после вычисления клиент может не знать, был ли результат принят. Повторная выдача работы способна привести к повторному вычислению. Поэтому предлагается модель повторного исполнения с принятием только актуального результата. Её применение требует, чтобы операции исполнителя не вызывали необратимых внешних действий, например списания денежных средств.</w:t>
       </w:r>
     </w:p>
     <w:p>
       <w:r>
-        <w:t xml:space="preserve">Для каждой попытки формируется отдельный идентификатор. Подтверждение принимается только от назначенного </w:t>
-      </w:r>
-      <w:proofErr w:type="spellStart"/>
-      <w:r>
-        <w:t>воркера</w:t>
-      </w:r>
-      <w:proofErr w:type="spellEnd"/>
-      <w:r>
-        <w:t xml:space="preserve"> и только для текущей попытки до истечения срока исполнения. Это предотвращает перезапись результата запоздалым сообщением от прежнего узла. Ограничение числа попыток также защищает систему от бесконечного возврата неисправного задания в очередь.</w:t>
+        <w:t>Для защиты от запоздалых подтверждений целесообразно различать отдельные попытки выполнения одного задания. При проектировании следует предусмотреть проверку отправителя, актуальности попытки и допустимого срока исполнения. Это позволит исключить перезапись принятого результата сообщением от прежнего узла. Число повторов необходимо ограничить, чтобы неисправное задание не возвращалось в очередь бесконечно.</w:t>
       </w:r>
     </w:p>
     <w:p>
@@ -1307,25 +1105,7 @@
     </w:p>
     <w:p>
       <w:r>
-        <w:t xml:space="preserve">В проекте каждый кадр является </w:t>
-      </w:r>
-      <w:r>
-        <w:rPr>
-          <w:i/>
-        </w:rPr>
-        <w:t>JSON-</w:t>
-      </w:r>
-      <w:r>
-        <w:t xml:space="preserve">объектом в </w:t>
-      </w:r>
-      <w:r>
-        <w:rPr>
-          <w:i/>
-        </w:rPr>
-        <w:t>UTF-8</w:t>
-      </w:r>
-      <w:r>
-        <w:t xml:space="preserve">, за которым следует перевод строки. </w:t>
+        <w:t xml:space="preserve">В качестве формата прикладных сообщений предлагается выбрать </w:t>
       </w:r>
       <w:r>
         <w:rPr>
@@ -1334,7 +1114,25 @@
         <w:t>JSON</w:t>
       </w:r>
       <w:r>
-        <w:t xml:space="preserve"> используется как текстовое представление структурированных данных. Его применение удобно для массивов товаров, параметров расчёта и состояний задания. На принимающей стороне накапливается буфер, в котором ищется завершённая строка. Ограничение размера кадра не позволяет бесконечно наращивать буфер при некорректном запросе.</w:t>
+        <w:t xml:space="preserve"> в кодировке </w:t>
+      </w:r>
+      <w:r>
+        <w:rPr>
+          <w:i/>
+        </w:rPr>
+        <w:t>UTF-8.</w:t>
+      </w:r>
+      <w:r>
+        <w:t xml:space="preserve"> Он позволяет единообразно представлять массивы товаров, параметры расчёта и состояния заданий. Поскольку </w:t>
+      </w:r>
+      <w:r>
+        <w:rPr>
+          <w:i/>
+        </w:rPr>
+        <w:t>TCP</w:t>
+      </w:r>
+      <w:r>
+        <w:t xml:space="preserve"> не выделяет границы сообщений, необходимо дополнительно определить способ разделения кадров. Для учебного протокола целесообразно рассмотреть завершение сообщения переводом строки и установить ограничение его размера. Точный состав полей и правила разбора следует определить при проектировании.</w:t>
       </w:r>
     </w:p>
     <w:p>
@@ -1342,97 +1140,57 @@
         <w:rPr>
           <w:i/>
         </w:rPr>
+        <w:lastRenderedPageBreak/>
         <w:t>UDP</w:t>
       </w:r>
       <w:r>
-        <w:t xml:space="preserve"> передаёт отдельные </w:t>
-      </w:r>
-      <w:proofErr w:type="spellStart"/>
-      <w:r>
-        <w:t>датаграммы</w:t>
-      </w:r>
-      <w:proofErr w:type="spellEnd"/>
-      <w:r>
-        <w:t xml:space="preserve"> без установления соединения и не предоставляет гарантии доставки и порядка сообщений [6]. Эти свойства подходят для периодического </w:t>
-      </w:r>
-      <w:proofErr w:type="spellStart"/>
+        <w:t xml:space="preserve"> передаёт отдельные датаграммы без установления соединения и не предоставляет гарантии доставки и порядка сообщений [6]. Эти свойства подходят для периодических сигналов </w:t>
+      </w:r>
       <w:r>
         <w:rPr>
           <w:i/>
         </w:rPr>
         <w:t>heartbeat</w:t>
       </w:r>
-      <w:proofErr w:type="spellEnd"/>
-      <w:r>
-        <w:rPr>
-          <w:i/>
-        </w:rPr>
-        <w:t>:</w:t>
-      </w:r>
-      <w:r>
-        <w:t xml:space="preserve"> каждое новое сообщение заменяет предыдущее свидетельство активности. Потеря одной </w:t>
-      </w:r>
-      <w:proofErr w:type="spellStart"/>
-      <w:r>
-        <w:t>датаграммы</w:t>
-      </w:r>
-      <w:proofErr w:type="spellEnd"/>
-      <w:r>
-        <w:t xml:space="preserve"> не должна немед</w:t>
-      </w:r>
-      <w:r>
-        <w:lastRenderedPageBreak/>
-        <w:t>ленно объявлять узел неисправным, поэтому обнаружение отказа основано на превышении интервала с последнего корректного сообщения.</w:t>
+      <w:r>
+        <w:t>, поскольку новое сообщение может заменять предыдущее свидетельство активности. При проектировании контроля узлов необходимо учитывать, что потеря одной датаграммы не доказывает отказ. Решение о недоступности следует принимать по превышению допустимого интервала без подтверждения активности.</w:t>
       </w:r>
     </w:p>
     <w:p>
       <w:r>
-        <w:t xml:space="preserve">Работоспособность контролируется двумя независимыми сроками. Первый ограничивает допустимое отсутствие </w:t>
-      </w:r>
-      <w:proofErr w:type="spellStart"/>
+        <w:t xml:space="preserve">Для контроля выполнения целесообразно различать доступность узла и завершение конкретного задания. Первый срок должен ограничивать допустимое отсутствие </w:t>
+      </w:r>
       <w:r>
         <w:rPr>
           <w:i/>
         </w:rPr>
         <w:t>heartbeat</w:t>
       </w:r>
-      <w:proofErr w:type="spellEnd"/>
-      <w:r>
-        <w:t xml:space="preserve"> и относится к узлу в целом. Второй ограничивает длительность задания без прикладного подтверждения. Исполнитель может продолжать передавать </w:t>
-      </w:r>
-      <w:proofErr w:type="spellStart"/>
-      <w:r>
-        <w:rPr>
-          <w:i/>
-        </w:rPr>
-        <w:t>heartbeat</w:t>
-      </w:r>
-      <w:proofErr w:type="spellEnd"/>
-      <w:r>
-        <w:t xml:space="preserve">, но зависнуть на расчёте; в таком случае обнаружить проблему позволяет именно таймаут </w:t>
-      </w:r>
-      <w:r>
-        <w:rPr>
-          <w:i/>
-        </w:rPr>
-        <w:t>ACK</w:t>
-      </w:r>
-      <w:r>
-        <w:t xml:space="preserve">. Разрыв </w:t>
-      </w:r>
-      <w:r>
-        <w:rPr>
-          <w:i/>
-        </w:rPr>
-        <w:t>TCP</w:t>
-      </w:r>
-      <w:r>
-        <w:t>-соединения является третьим основанием для возврата работы.</w:t>
+      <w:r>
+        <w:t xml:space="preserve">, второй - длительность ожидания прикладного подтверждения </w:t>
+      </w:r>
+      <w:r>
+        <w:rPr>
+          <w:i/>
+        </w:rPr>
+        <w:t>ACK.</w:t>
+      </w:r>
+      <w:r>
+        <w:t xml:space="preserve"> Такое разделение позволит учитывать ситуацию, когда исполнитель остаётся доступным по сети, но не завершает расчёт. Разрыв </w:t>
+      </w:r>
+      <w:r>
+        <w:rPr>
+          <w:i/>
+        </w:rPr>
+        <w:t>TCP-</w:t>
+      </w:r>
+      <w:r>
+        <w:t>соединения также следует рассматривать как возможное основание для повторного назначения работы.</w:t>
       </w:r>
     </w:p>
     <w:p>
       <w:r>
-        <w:t xml:space="preserve">Клиентские уведомления передаются по отдельному </w:t>
+        <w:t xml:space="preserve">Для клиентских уведомлений следует предусмотреть отдельное </w:t>
       </w:r>
       <w:r>
         <w:rPr>
@@ -1441,41 +1199,25 @@
         <w:t>TCP-</w:t>
       </w:r>
       <w:r>
-        <w:t xml:space="preserve">соединению. Такое разделение исключает необходимость удерживать запрос отправки открытым до получения ответа. Браузер не работает напрямую с сокетами брокера, поэтому веб-сервер преобразует уведомления в </w:t>
-      </w:r>
-      <w:r>
-        <w:rPr>
-          <w:i/>
-        </w:rPr>
-        <w:t>Server-</w:t>
-      </w:r>
-      <w:proofErr w:type="spellStart"/>
-      <w:r>
-        <w:rPr>
-          <w:i/>
-        </w:rPr>
-        <w:t>Sent</w:t>
-      </w:r>
-      <w:proofErr w:type="spellEnd"/>
+        <w:t xml:space="preserve">соединение, чтобы получение состояний не зависело от запроса отправки задания. При выборе браузерного интерфейса потребуется согласовать этот канал с возможностями веб-клиента. Подходящим вариантом являются </w:t>
+      </w:r>
+      <w:r>
+        <w:rPr>
+          <w:i/>
+        </w:rPr>
+        <w:t>Server-Sent</w:t>
+      </w:r>
       <w:r>
         <w:t xml:space="preserve"> </w:t>
       </w:r>
-      <w:proofErr w:type="spellStart"/>
-      <w:r>
-        <w:rPr>
-          <w:i/>
-        </w:rPr>
-        <w:t>Events</w:t>
-      </w:r>
-      <w:proofErr w:type="spellEnd"/>
-      <w:r>
-        <w:rPr>
-          <w:i/>
-        </w:rPr>
-        <w:t>.</w:t>
-      </w:r>
-      <w:r>
-        <w:t xml:space="preserve"> Спецификация </w:t>
+      <w:r>
+        <w:rPr>
+          <w:i/>
+        </w:rPr>
+        <w:t>Events:</w:t>
+      </w:r>
+      <w:r>
+        <w:t xml:space="preserve"> спецификация </w:t>
       </w:r>
       <w:r>
         <w:rPr>
@@ -1484,48 +1226,30 @@
         <w:t>HTML</w:t>
       </w:r>
       <w:r>
-        <w:t xml:space="preserve"> определяет </w:t>
-      </w:r>
-      <w:proofErr w:type="spellStart"/>
+        <w:t xml:space="preserve"> определяет интерфейс </w:t>
+      </w:r>
       <w:r>
         <w:rPr>
           <w:i/>
         </w:rPr>
         <w:t>EventSource</w:t>
       </w:r>
-      <w:proofErr w:type="spellEnd"/>
-      <w:r>
-        <w:t xml:space="preserve"> и формат потока </w:t>
-      </w:r>
-      <w:proofErr w:type="spellStart"/>
-      <w:r>
-        <w:rPr>
-          <w:i/>
-        </w:rPr>
-        <w:t>text</w:t>
-      </w:r>
-      <w:proofErr w:type="spellEnd"/>
-      <w:r>
-        <w:rPr>
-          <w:i/>
-        </w:rPr>
-        <w:t>/</w:t>
-      </w:r>
-      <w:proofErr w:type="spellStart"/>
-      <w:r>
-        <w:rPr>
-          <w:i/>
-        </w:rPr>
-        <w:t>event-stream</w:t>
-      </w:r>
-      <w:proofErr w:type="spellEnd"/>
-      <w:r>
-        <w:t xml:space="preserve"> для поступающих от сервера событий [7].</w:t>
+      <w:r>
+        <w:t xml:space="preserve"> и формат </w:t>
+      </w:r>
+      <w:r>
+        <w:rPr>
+          <w:i/>
+        </w:rPr>
+        <w:t>text/event-stream</w:t>
+      </w:r>
+      <w:r>
+        <w:t xml:space="preserve"> для передачи событий от сервера браузеру [7]. Этот механизм целесообразен для однонаправленных уведомлений о ходе вычислений.</w:t>
       </w:r>
     </w:p>
     <w:p>
       <w:r>
-        <w:t xml:space="preserve">Сопоставление каналов приведено в таблице 1.2. </w:t>
+        <w:t xml:space="preserve">Результат выбора транспортных средств представлен в таблице 1.2. Для браузерной границы предлагается </w:t>
       </w:r>
       <w:r>
         <w:rPr>
@@ -1534,7 +1258,16 @@
         <w:t>HTTP</w:t>
       </w:r>
       <w:r>
-        <w:t xml:space="preserve"> используется на внешней границе веб-клиента, а внутренние роли брокера взаимодействуют по собственному </w:t>
+        <w:t xml:space="preserve"> с уведомлениями </w:t>
+      </w:r>
+      <w:r>
+        <w:rPr>
+          <w:i/>
+        </w:rPr>
+        <w:t>SSE</w:t>
+      </w:r>
+      <w:r>
+        <w:t xml:space="preserve">, для обмена заданиями и результатами - </w:t>
       </w:r>
       <w:r>
         <w:rPr>
@@ -1543,7 +1276,16 @@
         <w:t>TCP</w:t>
       </w:r>
       <w:r>
-        <w:t>-протоколу. Следовательно, наличие сайта не отменяет требований задания к отдельным сетевым каналам.</w:t>
+        <w:t xml:space="preserve">, для периодического контроля узлов - </w:t>
+      </w:r>
+      <w:r>
+        <w:rPr>
+          <w:i/>
+        </w:rPr>
+        <w:t>UDP.</w:t>
+      </w:r>
+      <w:r>
+        <w:t xml:space="preserve"> Таким образом, выбор веб-интерфейса не отменяет требований к самостоятельным сетевым каналам. Конкретные адреса, порты и состав сообщений следует определить на этапе проектирования.</w:t>
       </w:r>
     </w:p>
     <w:p>
@@ -1556,22 +1298,8 @@
         <w:keepNext/>
       </w:pPr>
       <w:r>
-        <w:t xml:space="preserve">Таблица 1.2 </w:t>
-      </w:r>
-      <w:r>
-        <w:t xml:space="preserve">– Сетевые </w:t>
-      </w:r>
-      <w:r>
-        <w:t xml:space="preserve">каналы </w:t>
-      </w:r>
-      <w:proofErr w:type="spellStart"/>
-      <w:r>
-        <w:rPr>
-          <w:i/>
-        </w:rPr>
-        <w:t>BasketNet</w:t>
-      </w:r>
-      <w:proofErr w:type="spellEnd"/>
+        <w:t>Таблица 1.2 – Выбор сетевых каналов</w:t>
+      </w:r>
     </w:p>
     <w:tbl>
       <w:tblPr>
@@ -1619,7 +1347,7 @@
               <w:rPr>
                 <w:b/>
               </w:rPr>
-              <w:t>Порт</w:t>
+              <w:t>Канал</w:t>
             </w:r>
           </w:p>
         </w:tc>
@@ -1644,7 +1372,7 @@
               <w:rPr>
                 <w:b/>
               </w:rPr>
-              <w:t>Протокол</w:t>
+              <w:t>Транспорт</w:t>
             </w:r>
           </w:p>
         </w:tc>
@@ -1669,7 +1397,7 @@
               <w:rPr>
                 <w:b/>
               </w:rPr>
-              <w:t>Содержание</w:t>
+              <w:t>Назначение</w:t>
             </w:r>
           </w:p>
         </w:tc>
@@ -1720,7 +1448,7 @@
               <w:pStyle w:val="TableText"/>
             </w:pPr>
             <w:r>
-              <w:t>9000</w:t>
+              <w:t>Приём</w:t>
             </w:r>
           </w:p>
         </w:tc>
@@ -1763,7 +1491,7 @@
               <w:pStyle w:val="TableText"/>
             </w:pPr>
             <w:r>
-              <w:t>Задания, запрос состояния, мониторинг</w:t>
+              <w:t>Передача заданий и запрос состояния</w:t>
             </w:r>
           </w:p>
         </w:tc>
@@ -1783,22 +1511,8 @@
               <w:pStyle w:val="TableText"/>
             </w:pPr>
             <w:r>
-              <w:rPr>
-                <w:i/>
-              </w:rPr>
-              <w:t>Client</w:t>
+              <w:t>Клиент - брокер</w:t>
             </w:r>
-            <w:r>
-              <w:t xml:space="preserve"> - </w:t>
-            </w:r>
-            <w:proofErr w:type="spellStart"/>
-            <w:r>
-              <w:rPr>
-                <w:i/>
-              </w:rPr>
-              <w:t>Broker</w:t>
-            </w:r>
-            <w:proofErr w:type="spellEnd"/>
           </w:p>
         </w:tc>
       </w:tr>
@@ -1823,7 +1537,7 @@
               <w:pStyle w:val="TableText"/>
             </w:pPr>
             <w:r>
-              <w:t>9001</w:t>
+              <w:t>Выдача</w:t>
             </w:r>
           </w:p>
         </w:tc>
@@ -1866,13 +1580,7 @@
               <w:pStyle w:val="TableText"/>
             </w:pPr>
             <w:r>
-              <w:t xml:space="preserve">Регистрация, выдача задания, </w:t>
-            </w:r>
-            <w:r>
-              <w:rPr>
-                <w:i/>
-              </w:rPr>
-              <w:t>ACK</w:t>
+              <w:t>Назначение работы и подтверждение</w:t>
             </w:r>
           </w:p>
         </w:tc>
@@ -1891,25 +1599,9 @@
             <w:pPr>
               <w:pStyle w:val="TableText"/>
             </w:pPr>
-            <w:proofErr w:type="spellStart"/>
             <w:r>
-              <w:rPr>
-                <w:i/>
-              </w:rPr>
-              <w:t>WorkerClient</w:t>
+              <w:t>Воркер - брокер</w:t>
             </w:r>
-            <w:proofErr w:type="spellEnd"/>
-            <w:r>
-              <w:t xml:space="preserve"> - </w:t>
-            </w:r>
-            <w:proofErr w:type="spellStart"/>
-            <w:r>
-              <w:rPr>
-                <w:i/>
-              </w:rPr>
-              <w:t>Broker</w:t>
-            </w:r>
-            <w:proofErr w:type="spellEnd"/>
           </w:p>
         </w:tc>
       </w:tr>
@@ -1934,7 +1626,7 @@
               <w:pStyle w:val="TableText"/>
             </w:pPr>
             <w:r>
-              <w:t>9002</w:t>
+              <w:t>Статус</w:t>
             </w:r>
           </w:p>
         </w:tc>
@@ -1977,7 +1669,7 @@
               <w:pStyle w:val="TableText"/>
             </w:pPr>
             <w:r>
-              <w:t>Подписка и изменения состояния</w:t>
+              <w:t>Изменения состояния и результаты</w:t>
             </w:r>
           </w:p>
         </w:tc>
@@ -1997,22 +1689,8 @@
               <w:pStyle w:val="TableText"/>
             </w:pPr>
             <w:r>
-              <w:rPr>
-                <w:i/>
-              </w:rPr>
-              <w:t>Client</w:t>
+              <w:t>Клиент - брокер</w:t>
             </w:r>
-            <w:r>
-              <w:t xml:space="preserve"> - </w:t>
-            </w:r>
-            <w:proofErr w:type="spellStart"/>
-            <w:r>
-              <w:rPr>
-                <w:i/>
-              </w:rPr>
-              <w:t>Broker</w:t>
-            </w:r>
-            <w:proofErr w:type="spellEnd"/>
           </w:p>
         </w:tc>
       </w:tr>
@@ -2037,7 +1715,7 @@
               <w:pStyle w:val="TableText"/>
             </w:pPr>
             <w:r>
-              <w:t>9003</w:t>
+              <w:t>Контроль</w:t>
             </w:r>
           </w:p>
         </w:tc>
@@ -2079,16 +1757,8 @@
             <w:pPr>
               <w:pStyle w:val="TableText"/>
             </w:pPr>
-            <w:proofErr w:type="spellStart"/>
             <w:r>
-              <w:rPr>
-                <w:i/>
-              </w:rPr>
-              <w:t>Heartbeat</w:t>
-            </w:r>
-            <w:proofErr w:type="spellEnd"/>
-            <w:r>
-              <w:t xml:space="preserve"> текущей сессии</w:t>
+              <w:t>Периодические сигналы активности</w:t>
             </w:r>
           </w:p>
         </w:tc>
@@ -2107,25 +1777,9 @@
             <w:pPr>
               <w:pStyle w:val="TableText"/>
             </w:pPr>
-            <w:proofErr w:type="spellStart"/>
             <w:r>
-              <w:rPr>
-                <w:i/>
-              </w:rPr>
-              <w:t>WorkerClient</w:t>
+              <w:t>Воркер - брокер</w:t>
             </w:r>
-            <w:proofErr w:type="spellEnd"/>
-            <w:r>
-              <w:t xml:space="preserve"> - </w:t>
-            </w:r>
-            <w:proofErr w:type="spellStart"/>
-            <w:r>
-              <w:rPr>
-                <w:i/>
-              </w:rPr>
-              <w:t>Broker</w:t>
-            </w:r>
-            <w:proofErr w:type="spellEnd"/>
           </w:p>
         </w:tc>
       </w:tr>
@@ -2150,7 +1804,7 @@
               <w:pStyle w:val="TableText"/>
             </w:pPr>
             <w:r>
-              <w:t>8088</w:t>
+              <w:t>Сайт</w:t>
             </w:r>
           </w:p>
         </w:tc>
@@ -2173,16 +1827,7 @@
               <w:rPr>
                 <w:i/>
               </w:rPr>
-              <w:t>HTTP</w:t>
-            </w:r>
-            <w:r>
-              <w:t>/</w:t>
-            </w:r>
-            <w:r>
-              <w:rPr>
-                <w:i/>
-              </w:rPr>
-              <w:t>SSE</w:t>
+              <w:t>HTTP/SSE</w:t>
             </w:r>
             <w:r>
               <w:t xml:space="preserve"> поверх </w:t>
@@ -2211,16 +1856,7 @@
               <w:pStyle w:val="TableText"/>
             </w:pPr>
             <w:r>
-              <w:t xml:space="preserve">Сайт, </w:t>
-            </w:r>
-            <w:r>
-              <w:rPr>
-                <w:i/>
-              </w:rPr>
-              <w:t>API</w:t>
-            </w:r>
-            <w:r>
-              <w:t>, события браузера</w:t>
+              <w:t>Интерфейс и события браузера</w:t>
             </w:r>
           </w:p>
         </w:tc>
@@ -2240,16 +1876,8 @@
               <w:pStyle w:val="TableText"/>
             </w:pPr>
             <w:r>
-              <w:t xml:space="preserve">Браузер - </w:t>
+              <w:t>Браузер - веб-сервер</w:t>
             </w:r>
-            <w:proofErr w:type="spellStart"/>
-            <w:r>
-              <w:rPr>
-                <w:i/>
-              </w:rPr>
-              <w:t>WebServer</w:t>
-            </w:r>
-            <w:proofErr w:type="spellEnd"/>
           </w:p>
         </w:tc>
       </w:tr>
@@ -2272,29 +1900,16 @@
     </w:p>
     <w:p>
       <w:r>
-        <w:t xml:space="preserve">Для обработки одного чека требуется арифметическое агрегирование цен и скидок. При этом необходимо определить порядок округления. Суммирование двоичных чисел с плавающей точкой без явного денежного правила может давать нежелательные расхождения в копейках. В </w:t>
-      </w:r>
-      <w:proofErr w:type="spellStart"/>
-      <w:r>
-        <w:rPr>
-          <w:i/>
-        </w:rPr>
-        <w:t>BasketNet</w:t>
-      </w:r>
-      <w:proofErr w:type="spellEnd"/>
-      <w:r>
-        <w:t xml:space="preserve"> для денежного расчёта используется модуль </w:t>
-      </w:r>
-      <w:proofErr w:type="spellStart"/>
+        <w:t xml:space="preserve">Для обработки одного чека требуется арифметическое агрегирование цен и скидок. При этом необходимо определить порядок округления. Суммирование двоичных чисел с плавающей точкой без явного денежного правила может давать нежелательные расхождения в копейках. Для будущей реализации целесообразно выбрать десятичную арифметику </w:t>
+      </w:r>
       <w:r>
         <w:rPr>
           <w:i/>
         </w:rPr>
         <w:t>decimal</w:t>
       </w:r>
-      <w:proofErr w:type="spellEnd"/>
-      <w:r>
-        <w:t xml:space="preserve"> с явным правилом округления </w:t>
+      <w:r>
+        <w:t xml:space="preserve"> и явно задать округление </w:t>
       </w:r>
       <w:r>
         <w:rPr>
@@ -2303,102 +1918,36 @@
         <w:t>ROUND_HALF_UP.</w:t>
       </w:r>
       <w:r>
-        <w:t xml:space="preserve"> В проекте денежные результаты формируются как строки с двумя знаками после запятой.</w:t>
+        <w:t xml:space="preserve"> При передаче денежных результатов следует сохранять точное представление с двумя знаками после запятой.</w:t>
       </w:r>
     </w:p>
     <w:p>
       <w:r>
-        <w:lastRenderedPageBreak/>
-        <w:t xml:space="preserve">Для анализа набора чеков полезен подсчёт совместных появлений товаров. В книге Дж. </w:t>
-      </w:r>
-      <w:proofErr w:type="spellStart"/>
-      <w:r>
-        <w:t>Лесковца</w:t>
-      </w:r>
-      <w:proofErr w:type="spellEnd"/>
-      <w:r>
-        <w:t xml:space="preserve">, А. </w:t>
-      </w:r>
-      <w:proofErr w:type="spellStart"/>
-      <w:r>
-        <w:t>Раджарамана</w:t>
-      </w:r>
-      <w:proofErr w:type="spellEnd"/>
-      <w:r>
-        <w:t xml:space="preserve"> и Дж. Ульмана анализ частых наборов товаров рассматривается через поддержку сочетаний и достоверность ассоциативных правил [8]. Полный поиск наборов произвольной длины не является целью </w:t>
-      </w:r>
-      <w:proofErr w:type="spellStart"/>
-      <w:r>
-        <w:rPr>
-          <w:i/>
-        </w:rPr>
-        <w:t>BasketNet</w:t>
-      </w:r>
-      <w:proofErr w:type="spellEnd"/>
-      <w:r>
-        <w:rPr>
-          <w:i/>
-        </w:rPr>
-        <w:t>.</w:t>
-      </w:r>
-      <w:r>
-        <w:t xml:space="preserve"> Реализован ограниченный анализ пар, достаточный для демонстрации сопутствующих покупок и удобный для проверки на небольших примерах.</w:t>
+        <w:t>Для анализа набора чеков полезен подсчёт совместных появлений товаров. В книге Дж. Лесковца, А. Раджарамана и Дж. Ульмана анализ частых наборов рассматривается через поддержку сочетаний и достоверность ассоциативных правил [8]. Для учебного проекта целесообразно ограничиться анализом пар: он позволяет выявлять сопутствующие покупки, допускает наглядную проверку на небольших примерах и не требует полного поиска наборов произвольной длины.</w:t>
       </w:r>
     </w:p>
     <w:p>
       <w:r>
-        <w:t xml:space="preserve">Каждый чек предварительно преобразуется во множество названий. Если один товар куплен в количестве нескольких единиц, это не увеличивает число его совместных появлений внутри того же чека. После этого подсчитываются одиночные товары и неупорядоченные пары. Для каждой пары вычисляются доля чеков с совместной покупкой, условные доли по обоим направлениям и коэффициент </w:t>
-      </w:r>
-      <w:proofErr w:type="spellStart"/>
-      <w:r>
-        <w:rPr>
-          <w:i/>
-        </w:rPr>
-        <w:t>lift</w:t>
-      </w:r>
-      <w:proofErr w:type="spellEnd"/>
-      <w:r>
-        <w:t>. Эти показатели показывают структуру наблюдаемого набора, но сами по себе не доказывают причинную связь между покупками.</w:t>
+        <w:t xml:space="preserve">При выборе метода анализа пар следует учитывать один товар не более одного раза в пределах чека. Иначе несколько единиц одного наименования будут искажать частоту совместных покупок. Для оценки пары предлагается использовать долю чеков с её совместным появлением, условные доли по обоим направлениям и коэффициент </w:t>
+      </w:r>
+      <w:r>
+        <w:rPr>
+          <w:i/>
+        </w:rPr>
+        <w:t>lift.</w:t>
+      </w:r>
+      <w:r>
+        <w:t xml:space="preserve"> Эти показатели характеризуют структуру наблюдаемого набора, но сами по себе не доказывают причинную связь между покупками.</w:t>
       </w:r>
     </w:p>
     <w:p>
       <w:r>
-        <w:t xml:space="preserve">Сортировка позволяет упорядочить товары по цене либо другому числовому признаку. Частотный анализ текста подсчитывает слова в названиях и служит дополнительным способом агрегации. Он не заменяет учёт количества проданных единиц: словоформы не объединяются морфологически, а совпадение отдельных слов не гарантирует совпадения товарных позиций. Для точного структурированного анализа используется </w:t>
-      </w:r>
-      <w:proofErr w:type="spellStart"/>
-      <w:r>
-        <w:rPr>
-          <w:i/>
-        </w:rPr>
-        <w:t>basket_affinity</w:t>
-      </w:r>
-      <w:proofErr w:type="spellEnd"/>
-      <w:r>
-        <w:t>.</w:t>
+        <w:t>Сортировка позволяет упорядочить товары по цене либо другому числовому признаку. Частотный анализ текста может служить дополнительным способом агрегации названий, однако его нельзя приравнивать к учёту проданных единиц. Без отдельной обработки словоформ совпадение слов не гарантирует совпадения товарных позиций. Поэтому для анализа состава чеков следует выбрать структурированный подсчёт товарных пар, а текстовую статистику рассматривать как вспомогательную операцию.</w:t>
       </w:r>
     </w:p>
     <w:p>
       <w:r>
-        <w:t xml:space="preserve">Хеширование применяется для получения контрольной суммы документа чека. Свойства криптографических хеш-функций и их отличие от механизмов аутентификации рассматриваются в книге Ж.-Ф. </w:t>
-      </w:r>
-      <w:proofErr w:type="spellStart"/>
-      <w:r>
-        <w:t>Омассона</w:t>
-      </w:r>
-      <w:proofErr w:type="spellEnd"/>
-      <w:r>
-        <w:t xml:space="preserve"> [9]. В </w:t>
-      </w:r>
-      <w:proofErr w:type="spellStart"/>
-      <w:r>
-        <w:rPr>
-          <w:i/>
-        </w:rPr>
-        <w:t>BasketNet</w:t>
-      </w:r>
-      <w:proofErr w:type="spellEnd"/>
-      <w:r>
-        <w:t xml:space="preserve"> функции </w:t>
+        <w:t xml:space="preserve">Для контроля неизменности документа чека целесообразно рассмотреть криптографическое хеширование. Свойства хеш-функций и их отличие от механизмов аутентификации рассматриваются в книге Ж.-Ф. Омассона [9]. Для последующей реализации предлагается </w:t>
       </w:r>
       <w:r>
         <w:rPr>
@@ -2407,77 +1956,43 @@
         <w:t>SHA-256</w:t>
       </w:r>
       <w:r>
-        <w:t xml:space="preserve"> и </w:t>
-      </w:r>
-      <w:r>
-        <w:rPr>
-          <w:i/>
-        </w:rPr>
-        <w:t>PBKDF2</w:t>
-      </w:r>
-      <w:r>
-        <w:t xml:space="preserve"> вызываются через модуль </w:t>
-      </w:r>
-      <w:proofErr w:type="spellStart"/>
-      <w:r>
-        <w:rPr>
-          <w:i/>
-        </w:rPr>
-        <w:t>hashlib</w:t>
-      </w:r>
-      <w:proofErr w:type="spellEnd"/>
-      <w:r>
-        <w:rPr>
-          <w:i/>
-        </w:rPr>
-        <w:t>.</w:t>
-      </w:r>
-      <w:r>
-        <w:t xml:space="preserve"> В проекте </w:t>
-      </w:r>
-      <w:r>
-        <w:rPr>
-          <w:i/>
-        </w:rPr>
-        <w:t>SHA-256</w:t>
-      </w:r>
-      <w:r>
-        <w:t xml:space="preserve"> позволяет сопоставить сохранённый текст чека с его контрольной суммой. Наличие такого </w:t>
-      </w:r>
-      <w:proofErr w:type="spellStart"/>
-      <w:r>
-        <w:t>хеша</w:t>
-      </w:r>
-      <w:proofErr w:type="spellEnd"/>
-      <w:r>
-        <w:t xml:space="preserve"> не является электронной подписью, не подтверждает личность автора и не заменяет фискальную регистрацию.</w:t>
+        <w:t xml:space="preserve">, доступный через стандартный модуль </w:t>
+      </w:r>
+      <w:r>
+        <w:rPr>
+          <w:i/>
+        </w:rPr>
+        <w:t>hashlib.</w:t>
+      </w:r>
+      <w:r>
+        <w:t xml:space="preserve"> Контрольная сумма позволит сопоставлять текст чека с ранее сохранённым значением. При этом хеш не является электронной подписью, не подтверждает личность автора и не заменяет фискальную регистрацию.</w:t>
       </w:r>
     </w:p>
     <w:p>
       <w:r>
-        <w:t xml:space="preserve">Операции </w:t>
-      </w:r>
-      <w:proofErr w:type="spellStart"/>
+        <w:t xml:space="preserve">В соответствии с заданием в вычислительный интерфейс необходимо включить операции </w:t>
+      </w:r>
       <w:r>
         <w:rPr>
           <w:i/>
         </w:rPr>
         <w:t>fib</w:t>
       </w:r>
-      <w:proofErr w:type="spellEnd"/>
       <w:r>
         <w:t xml:space="preserve"> и </w:t>
       </w:r>
-      <w:proofErr w:type="spellStart"/>
-      <w:r>
-        <w:rPr>
-          <w:i/>
-        </w:rPr>
-        <w:t>factorial</w:t>
-      </w:r>
-      <w:proofErr w:type="spellEnd"/>
-      <w:r>
-        <w:t xml:space="preserve"> сохраняются в составе вычислительного интерфейса в соответствии с заданием. Они используются в административной лаборатории для демонстрации выполнения параметризованных задач и выдачи больших целых чисел. В текущем магазине они не определяют стоимость реальной покупки и не вводят произвольные правила бонусной программы.</w:t>
+      <w:r>
+        <w:rPr>
+          <w:i/>
+        </w:rPr>
+        <w:t>factorial.</w:t>
+      </w:r>
+      <w:r>
+        <w:t xml:space="preserve"> Их целесообразно использовать для проверки выполнения параметризованных задач и обработки больших целых чисел. Для </w:t>
+      </w:r>
+      <w:r>
+        <w:lastRenderedPageBreak/>
+        <w:t>связи с предметной областью магазина основное внимание следует уделить суммированию, сортировке, анализу текста, хешированию и исследованию товарных пар; учебные числовые операции не должны определять стоимость покупки.</w:t>
       </w:r>
     </w:p>
     <w:p>
@@ -2502,30 +2017,25 @@
     </w:p>
     <w:p>
       <w:r>
-        <w:rPr>
-          <w:i/>
-        </w:rPr>
-        <w:t>Python</w:t>
-      </w:r>
-      <w:r>
-        <w:t xml:space="preserve"> выбран благодаря наличию в стандартной библиотеке средств </w:t>
-      </w:r>
-      <w:proofErr w:type="spellStart"/>
-      <w:r>
-        <w:t>сокетного</w:t>
-      </w:r>
-      <w:proofErr w:type="spellEnd"/>
-      <w:r>
-        <w:t xml:space="preserve"> обмена, потоков, </w:t>
-      </w:r>
-      <w:r>
-        <w:rPr>
-          <w:i/>
-        </w:rPr>
-        <w:t>HTTP</w:t>
-      </w:r>
-      <w:r>
-        <w:t xml:space="preserve">-сервера, </w:t>
+        <w:t xml:space="preserve">В качестве языка реализации целесообразно выбрать </w:t>
+      </w:r>
+      <w:r>
+        <w:rPr>
+          <w:i/>
+        </w:rPr>
+        <w:t>Python.</w:t>
+      </w:r>
+      <w:r>
+        <w:t xml:space="preserve"> Его стандартная библиотека предоставляет средства сокетного обмена, многопоточности, </w:t>
+      </w:r>
+      <w:r>
+        <w:rPr>
+          <w:i/>
+        </w:rPr>
+        <w:t>HTTP-</w:t>
+      </w:r>
+      <w:r>
+        <w:t xml:space="preserve">сервера, обработки </w:t>
       </w:r>
       <w:r>
         <w:rPr>
@@ -2534,56 +2044,26 @@
         <w:t>JSON</w:t>
       </w:r>
       <w:r>
-        <w:t xml:space="preserve">, криптографических функций и </w:t>
-      </w:r>
-      <w:proofErr w:type="spellStart"/>
-      <w:r>
-        <w:rPr>
-          <w:i/>
-        </w:rPr>
-        <w:t>SQLite</w:t>
-      </w:r>
-      <w:proofErr w:type="spellEnd"/>
-      <w:r>
-        <w:t>. Это позволяет сосредоточить проект на алгоритмах взаимодействия, а не на настройке большого числа внешних зависимостей. При этом удобство языка не отменяет необходимости ограничивать размер входных данных и разделять сетевую координацию с тяжёлыми вычислениями.</w:t>
+        <w:t xml:space="preserve">, криптографических вычислений и доступа к </w:t>
+      </w:r>
+      <w:r>
+        <w:rPr>
+          <w:i/>
+        </w:rPr>
+        <w:t>SQLite.</w:t>
+      </w:r>
+      <w:r>
+        <w:t xml:space="preserve"> Это позволит сосредоточить работу на собственных алгоритмах взаимодействия и сократить число внешних зависимостей. При проектировании необходимо дополнительно предусмотреть ограничения входных данных и отделить сетевую координацию от тяжёлых вычислений.</w:t>
       </w:r>
     </w:p>
     <w:p>
       <w:r>
-        <w:lastRenderedPageBreak/>
-        <w:t xml:space="preserve">На стороне брокера создаются потоки приёма соединений, планировщика, контроля сроков и обработки </w:t>
-      </w:r>
-      <w:proofErr w:type="spellStart"/>
-      <w:r>
-        <w:rPr>
-          <w:i/>
-        </w:rPr>
-        <w:t>heartbeat</w:t>
-      </w:r>
-      <w:proofErr w:type="spellEnd"/>
-      <w:r>
-        <w:t xml:space="preserve">. Состояние заданий и </w:t>
-      </w:r>
-      <w:proofErr w:type="spellStart"/>
-      <w:r>
-        <w:t>воркеров</w:t>
-      </w:r>
-      <w:proofErr w:type="spellEnd"/>
-      <w:r>
-        <w:t xml:space="preserve"> защищено условной переменной с повторно </w:t>
-      </w:r>
-      <w:proofErr w:type="spellStart"/>
-      <w:r>
-        <w:t>входимой</w:t>
-      </w:r>
-      <w:proofErr w:type="spellEnd"/>
-      <w:r>
-        <w:t xml:space="preserve"> блокировкой. Исполнители запускаются отдельными процессами интерпретатора. Такая комбинация соответствует роли каждого механизма: потоки координируют ожидания, а процессы выполняют независимые задачи.</w:t>
+        <w:t>Для сетевого обслуживания брокера предлагается использовать потоки, поскольку значительная часть их работы связана с ожиданием соединений и сообщений. Общее состояние очереди и узлов потребуется защищать средствами синхронизации. Для вычислительных исполнителей целесообразно выбрать отдельные процессы интерпретатора: это позволит независимо выполнять задачи и в дальнейшем рассмотреть размещение узлов на разных компьютерах.</w:t>
       </w:r>
     </w:p>
     <w:p>
       <w:r>
-        <w:t xml:space="preserve">Для веб-интерфейса используются </w:t>
+        <w:t xml:space="preserve">Для пользовательского интерфейса целесообразно выбрать </w:t>
       </w:r>
       <w:r>
         <w:rPr>
@@ -2610,28 +2090,21 @@
         <w:t>JavaScript</w:t>
       </w:r>
       <w:r>
-        <w:t xml:space="preserve"> без внешнего клиентского фреймворка. Пользователю нужен браузер, а вычислительная часть остаётся на стороне </w:t>
-      </w:r>
-      <w:proofErr w:type="spellStart"/>
-      <w:r>
-        <w:t>воркеров</w:t>
-      </w:r>
-      <w:proofErr w:type="spellEnd"/>
-      <w:r>
-        <w:t>. Каталог работает без входа, операции с корзиной и заказами привязаны к учётной записи. Административная роль предоставляет доступ к настройкам и диагностике через тот же сайт.</w:t>
+        <w:t xml:space="preserve"> без обязательного внешнего фреймворка. Такой вариант обеспечит доступ через браузер и позволит оставить распределённые вычисления на стороне исполнителей. В требования следует включить открытый просмотр каталога, привязку корзины и заказов к учётной записи, а также разграничение возможностей покупателя и администратора. Подробные сценарии доступа необходимо определить во втором разделе.</w:t>
       </w:r>
     </w:p>
     <w:p>
-      <w:proofErr w:type="spellStart"/>
-      <w:r>
-        <w:rPr>
-          <w:i/>
-        </w:rPr>
-        <w:t>SQLite</w:t>
-      </w:r>
-      <w:proofErr w:type="spellEnd"/>
-      <w:r>
-        <w:t xml:space="preserve"> используется для постоянного хранения прикладных данных. Это встроенная СУБД, поддерживающая транзакционное изменение базы. Принципы фиксации, отката и изоляции </w:t>
+      <w:r>
+        <w:t xml:space="preserve">Для постоянного хранения прикладных данных предлагается </w:t>
+      </w:r>
+      <w:r>
+        <w:rPr>
+          <w:i/>
+        </w:rPr>
+        <w:t>SQLite.</w:t>
+      </w:r>
+      <w:r>
+        <w:t xml:space="preserve"> Встроенная СУБД не требует отдельной службы, что упрощает учебное развёртывание с одним веб-сервером. Принципы фиксации, отката и изоляции </w:t>
       </w:r>
       <w:r>
         <w:rPr>
@@ -2640,34 +2113,12 @@
         <w:t>SQL-</w:t>
       </w:r>
       <w:r>
-        <w:t xml:space="preserve">транзакций рассматриваются в книге А. </w:t>
-      </w:r>
-      <w:proofErr w:type="spellStart"/>
-      <w:r>
-        <w:t>Болье</w:t>
-      </w:r>
-      <w:proofErr w:type="spellEnd"/>
-      <w:r>
-        <w:t xml:space="preserve"> [10]. Для учебного варианта с одним процессом веб-сервера она не требует отдельной службы. Взаимодействующие обработчики используют одну защищённую блокировкой связь с базой; очередь брокера при этом хранится отдельно в памяти и не становится долговечной вследствие наличия </w:t>
-      </w:r>
-      <w:proofErr w:type="spellStart"/>
-      <w:r>
-        <w:rPr>
-          <w:i/>
-        </w:rPr>
-        <w:t>SQLite</w:t>
-      </w:r>
-      <w:proofErr w:type="spellEnd"/>
-      <w:r>
-        <w:rPr>
-          <w:i/>
-        </w:rPr>
-        <w:t>.</w:t>
+        <w:t>транзакций рассматриваются в книге А. Болье [10]. При проектировании необходимо разделить хранение заказов и управление очередью вычислений: выбор СУБД сам по себе не обеспечивает сохранение состояния брокера и не решает вопрос восстановления незавершённых заданий.</w:t>
       </w:r>
     </w:p>
     <w:p>
       <w:r>
-        <w:t xml:space="preserve">Применение стандартного </w:t>
+        <w:t xml:space="preserve">Для учебного стенда можно выбрать </w:t>
       </w:r>
       <w:r>
         <w:rPr>
@@ -2676,7 +2127,16 @@
         <w:t>HTTP-</w:t>
       </w:r>
       <w:r>
-        <w:t xml:space="preserve">сервера упрощает демонстрационное развёртывание, но ограничивает назначение стенда. В текущем проекте не реализована инфраструктура публичного сервиса с </w:t>
+        <w:t xml:space="preserve">сервер из стандартной библиотеки </w:t>
+      </w:r>
+      <w:r>
+        <w:rPr>
+          <w:i/>
+        </w:rPr>
+        <w:t>Python.</w:t>
+      </w:r>
+      <w:r>
+        <w:t xml:space="preserve"> Его применение позволит уменьшить число зависимостей и сосредоточиться на логике распределённой обработки. Область предполагаемого использования следует ограничить доверенной локальной сетью. Создание публичного магазина с реальными платежами потребовало бы отдельного рассмотрения </w:t>
       </w:r>
       <w:r>
         <w:rPr>
@@ -2685,21 +2145,22 @@
         <w:t>HTTPS</w:t>
       </w:r>
       <w:r>
-        <w:t>, внешним прокси и промышленным сопровождением. Область применения стенда ограничивается доверенной локальной сетью. Публичный магазин с реальными платежами в текущую разработку не входит.</w:t>
+        <w:t>, защиты внешнего доступа и сопровождения сервиса, что выходит за границы данной разработки.</w:t>
       </w:r>
     </w:p>
     <w:p>
       <w:r>
-        <w:t xml:space="preserve">Результат выбора средств приведён в таблице 1.3. Все компоненты выполняются локально и не обращаются к облачному вычислительному </w:t>
-      </w:r>
-      <w:r>
-        <w:rPr>
-          <w:i/>
-        </w:rPr>
-        <w:t>API</w:t>
-      </w:r>
-      <w:r>
-        <w:t xml:space="preserve"> для получения результатов анализа.</w:t>
+        <w:lastRenderedPageBreak/>
+        <w:t xml:space="preserve">Выбранные средства и основания их применения сведены в таблицу 1.3. При дальнейшей разработке предполагается локальное выполнение вычислений без обращения к внешнему облачному </w:t>
+      </w:r>
+      <w:r>
+        <w:rPr>
+          <w:i/>
+        </w:rPr>
+        <w:t>API.</w:t>
+      </w:r>
+      <w:r>
+        <w:t xml:space="preserve"> Это позволит наблюдать сетевой обмен и проверять работу компонентов в пределах управляемого учебного стенда.</w:t>
       </w:r>
     </w:p>
     <w:p>
@@ -2823,86 +2284,6 @@
       </w:tr>
       <w:tr>
         <w:trPr>
-          <w:trHeight w:val="454"/>
-        </w:trPr>
-        <w:tc>
-          <w:tcPr>
-            <w:tcW w:w="1871" w:type="dxa"/>
-            <w:vAlign w:val="center"/>
-          </w:tcPr>
-          <w:p>
-            <w:pPr>
-              <w:keepNext/>
-              <w:ind w:firstLine="0"/>
-              <w:jc w:val="center"/>
-              <w:rPr>
-                <w:b/>
-                <w:bCs/>
-              </w:rPr>
-            </w:pPr>
-            <w:r>
-              <w:rPr>
-                <w:b/>
-                <w:bCs/>
-                <w:sz w:val="24"/>
-              </w:rPr>
-              <w:t>1</w:t>
-            </w:r>
-          </w:p>
-        </w:tc>
-        <w:tc>
-          <w:tcPr>
-            <w:tcW w:w="3402" w:type="dxa"/>
-            <w:vAlign w:val="center"/>
-          </w:tcPr>
-          <w:p>
-            <w:pPr>
-              <w:keepNext/>
-              <w:ind w:firstLine="0"/>
-              <w:jc w:val="center"/>
-              <w:rPr>
-                <w:b/>
-                <w:bCs/>
-              </w:rPr>
-            </w:pPr>
-            <w:r>
-              <w:rPr>
-                <w:b/>
-                <w:bCs/>
-                <w:sz w:val="24"/>
-              </w:rPr>
-              <w:t>2</w:t>
-            </w:r>
-          </w:p>
-        </w:tc>
-        <w:tc>
-          <w:tcPr>
-            <w:tcW w:w="4365" w:type="dxa"/>
-            <w:vAlign w:val="center"/>
-          </w:tcPr>
-          <w:p>
-            <w:pPr>
-              <w:keepNext/>
-              <w:ind w:firstLine="0"/>
-              <w:jc w:val="center"/>
-              <w:rPr>
-                <w:b/>
-                <w:bCs/>
-              </w:rPr>
-            </w:pPr>
-            <w:r>
-              <w:rPr>
-                <w:b/>
-                <w:bCs/>
-                <w:sz w:val="24"/>
-              </w:rPr>
-              <w:t>3</w:t>
-            </w:r>
-          </w:p>
-        </w:tc>
-      </w:tr>
-      <w:tr>
-        <w:trPr>
           <w:cantSplit/>
           <w:trHeight w:val="454"/>
         </w:trPr>
@@ -2920,6 +2301,7 @@
           <w:p>
             <w:pPr>
               <w:pStyle w:val="TableText"/>
+              <w:keepNext/>
             </w:pPr>
             <w:r>
               <w:t>Сетевое ядро</w:t>
@@ -2940,6 +2322,7 @@
           <w:p>
             <w:pPr>
               <w:pStyle w:val="TableText"/>
+              <w:keepNext/>
             </w:pPr>
             <w:r>
               <w:rPr>
@@ -2950,14 +2333,12 @@
             <w:r>
               <w:t xml:space="preserve">, </w:t>
             </w:r>
-            <w:proofErr w:type="spellStart"/>
             <w:r>
               <w:rPr>
                 <w:i/>
               </w:rPr>
               <w:t>socket</w:t>
             </w:r>
-            <w:proofErr w:type="spellEnd"/>
             <w:r>
               <w:t xml:space="preserve">, </w:t>
             </w:r>
@@ -2983,6 +2364,7 @@
           <w:p>
             <w:pPr>
               <w:pStyle w:val="TableText"/>
+              <w:keepNext/>
             </w:pPr>
             <w:r>
               <w:t xml:space="preserve">Явное управление </w:t>
@@ -3027,6 +2409,7 @@
           <w:p>
             <w:pPr>
               <w:pStyle w:val="TableText"/>
+              <w:keepNext/>
             </w:pPr>
             <w:r>
               <w:t>Координация</w:t>
@@ -3047,37 +2430,17 @@
           <w:p>
             <w:pPr>
               <w:pStyle w:val="TableText"/>
+              <w:keepNext/>
             </w:pPr>
-            <w:proofErr w:type="spellStart"/>
             <w:r>
               <w:rPr>
                 <w:i/>
               </w:rPr>
               <w:t>threading</w:t>
             </w:r>
-            <w:proofErr w:type="spellEnd"/>
             <w:r>
-              <w:t xml:space="preserve">, </w:t>
+              <w:t>, средства синхронизации</w:t>
             </w:r>
-            <w:proofErr w:type="spellStart"/>
-            <w:r>
-              <w:rPr>
-                <w:i/>
-              </w:rPr>
-              <w:t>Condition</w:t>
-            </w:r>
-            <w:proofErr w:type="spellEnd"/>
-            <w:r>
-              <w:t xml:space="preserve">, </w:t>
-            </w:r>
-            <w:proofErr w:type="spellStart"/>
-            <w:r>
-              <w:rPr>
-                <w:i/>
-              </w:rPr>
-              <w:t>RLock</w:t>
-            </w:r>
-            <w:proofErr w:type="spellEnd"/>
           </w:p>
         </w:tc>
         <w:tc>
@@ -3094,6 +2457,7 @@
           <w:p>
             <w:pPr>
               <w:pStyle w:val="TableText"/>
+              <w:keepNext/>
             </w:pPr>
             <w:r>
               <w:t>Согласованное изменение общей очереди и состояний</w:t>
@@ -3120,6 +2484,7 @@
           <w:p>
             <w:pPr>
               <w:pStyle w:val="TableText"/>
+              <w:keepNext/>
             </w:pPr>
             <w:r>
               <w:t>Вычислительные узлы</w:t>
@@ -3140,6 +2505,7 @@
           <w:p>
             <w:pPr>
               <w:pStyle w:val="TableText"/>
+              <w:keepNext/>
             </w:pPr>
             <w:r>
               <w:t xml:space="preserve">Отдельные процессы </w:t>
@@ -3166,119 +2532,10 @@
           <w:p>
             <w:pPr>
               <w:pStyle w:val="TableText"/>
+              <w:keepNext/>
             </w:pPr>
             <w:r>
               <w:t>Независимость вычислений и возможность разных ПК</w:t>
-            </w:r>
-          </w:p>
-        </w:tc>
-      </w:tr>
-    </w:tbl>
-    <w:p>
-      <w:pPr>
-        <w:keepNext/>
-        <w:pageBreakBefore/>
-      </w:pPr>
-      <w:r>
-        <w:lastRenderedPageBreak/>
-        <w:t>Продолжение таблицы 1.3</w:t>
-      </w:r>
-    </w:p>
-    <w:tbl>
-      <w:tblPr>
-        <w:tblW w:w="0" w:type="auto"/>
-        <w:tblBorders>
-          <w:top w:val="single" w:sz="5" w:space="0" w:color="777777"/>
-          <w:left w:val="single" w:sz="5" w:space="0" w:color="777777"/>
-          <w:bottom w:val="single" w:sz="5" w:space="0" w:color="777777"/>
-          <w:right w:val="single" w:sz="5" w:space="0" w:color="777777"/>
-          <w:insideH w:val="single" w:sz="5" w:space="0" w:color="777777"/>
-          <w:insideV w:val="single" w:sz="5" w:space="0" w:color="777777"/>
-        </w:tblBorders>
-        <w:tblLayout w:type="fixed"/>
-        <w:tblLook w:val="04A0" w:firstRow="1" w:lastRow="0" w:firstColumn="1" w:lastColumn="0" w:noHBand="0" w:noVBand="1"/>
-      </w:tblPr>
-      <w:tblGrid>
-        <w:gridCol w:w="1871"/>
-        <w:gridCol w:w="3402"/>
-        <w:gridCol w:w="4365"/>
-      </w:tblGrid>
-      <w:tr>
-        <w:trPr>
-          <w:trHeight w:val="454"/>
-        </w:trPr>
-        <w:tc>
-          <w:tcPr>
-            <w:tcW w:w="1871" w:type="dxa"/>
-            <w:vAlign w:val="center"/>
-          </w:tcPr>
-          <w:p>
-            <w:pPr>
-              <w:keepNext/>
-              <w:ind w:firstLine="0"/>
-              <w:jc w:val="center"/>
-              <w:rPr>
-                <w:b/>
-                <w:bCs/>
-              </w:rPr>
-            </w:pPr>
-            <w:r>
-              <w:rPr>
-                <w:b/>
-                <w:bCs/>
-                <w:sz w:val="24"/>
-              </w:rPr>
-              <w:t>1</w:t>
-            </w:r>
-          </w:p>
-        </w:tc>
-        <w:tc>
-          <w:tcPr>
-            <w:tcW w:w="3402" w:type="dxa"/>
-            <w:vAlign w:val="center"/>
-          </w:tcPr>
-          <w:p>
-            <w:pPr>
-              <w:keepNext/>
-              <w:ind w:firstLine="0"/>
-              <w:jc w:val="center"/>
-              <w:rPr>
-                <w:b/>
-                <w:bCs/>
-              </w:rPr>
-            </w:pPr>
-            <w:r>
-              <w:rPr>
-                <w:b/>
-                <w:bCs/>
-                <w:sz w:val="24"/>
-              </w:rPr>
-              <w:t>2</w:t>
-            </w:r>
-          </w:p>
-        </w:tc>
-        <w:tc>
-          <w:tcPr>
-            <w:tcW w:w="4365" w:type="dxa"/>
-            <w:vAlign w:val="center"/>
-          </w:tcPr>
-          <w:p>
-            <w:pPr>
-              <w:keepNext/>
-              <w:ind w:firstLine="0"/>
-              <w:jc w:val="center"/>
-              <w:rPr>
-                <w:b/>
-                <w:bCs/>
-              </w:rPr>
-            </w:pPr>
-            <w:r>
-              <w:rPr>
-                <w:b/>
-                <w:bCs/>
-                <w:sz w:val="24"/>
-              </w:rPr>
-              <w:t>3</w:t>
             </w:r>
           </w:p>
         </w:tc>
@@ -3302,6 +2559,7 @@
           <w:p>
             <w:pPr>
               <w:pStyle w:val="TableText"/>
+              <w:keepNext/>
             </w:pPr>
             <w:r>
               <w:t>Сайт</w:t>
@@ -3322,11 +2580,11 @@
           <w:p>
             <w:pPr>
               <w:pStyle w:val="TableText"/>
+              <w:keepNext/>
               <w:rPr>
                 <w:lang w:val="en-US"/>
               </w:rPr>
             </w:pPr>
-            <w:proofErr w:type="spellStart"/>
             <w:r>
               <w:rPr>
                 <w:i/>
@@ -3347,7 +2605,6 @@
               </w:rPr>
               <w:t>server</w:t>
             </w:r>
-            <w:proofErr w:type="spellEnd"/>
             <w:r>
               <w:rPr>
                 <w:lang w:val="en-US"/>
@@ -3403,6 +2660,7 @@
           <w:p>
             <w:pPr>
               <w:pStyle w:val="TableText"/>
+              <w:keepNext/>
             </w:pPr>
             <w:r>
               <w:t>Браузерный доступ без установки клиента</w:t>
@@ -3429,6 +2687,7 @@
           <w:p>
             <w:pPr>
               <w:pStyle w:val="TableText"/>
+              <w:keepNext/>
             </w:pPr>
             <w:r>
               <w:t>Хранение</w:t>
@@ -3449,15 +2708,14 @@
           <w:p>
             <w:pPr>
               <w:pStyle w:val="TableText"/>
+              <w:keepNext/>
             </w:pPr>
-            <w:proofErr w:type="spellStart"/>
             <w:r>
               <w:rPr>
                 <w:i/>
               </w:rPr>
               <w:t>SQLite</w:t>
             </w:r>
-            <w:proofErr w:type="spellEnd"/>
             <w:r>
               <w:t xml:space="preserve">, </w:t>
             </w:r>
@@ -3486,6 +2744,7 @@
           <w:p>
             <w:pPr>
               <w:pStyle w:val="TableText"/>
+              <w:keepNext/>
             </w:pPr>
             <w:r>
               <w:t>Постоянные заказы и аккаунты без отдельной СУБД</w:t>
@@ -3533,14 +2792,12 @@
             <w:pPr>
               <w:pStyle w:val="TableText"/>
             </w:pPr>
-            <w:proofErr w:type="spellStart"/>
             <w:r>
               <w:rPr>
                 <w:i/>
               </w:rPr>
               <w:t>unittest</w:t>
             </w:r>
-            <w:proofErr w:type="spellEnd"/>
           </w:p>
         </w:tc>
         <w:tc>
@@ -3608,14 +2865,12 @@
       <w:r>
         <w:t xml:space="preserve"> с результатом, повторная выдача после отказа и контроль </w:t>
       </w:r>
-      <w:proofErr w:type="spellStart"/>
       <w:r>
         <w:rPr>
           <w:i/>
         </w:rPr>
         <w:t>heartbeat</w:t>
       </w:r>
-      <w:proofErr w:type="spellEnd"/>
       <w:r>
         <w:t xml:space="preserve"> по </w:t>
       </w:r>
@@ -3626,25 +2881,21 @@
         <w:t>UDP</w:t>
       </w:r>
       <w:r>
-        <w:t xml:space="preserve">. Клиент должен видеть изменение состояния задания и получать итог либо сообщение об ошибке. Повторная попытка должна назначаться другому идентификатору </w:t>
-      </w:r>
-      <w:proofErr w:type="spellStart"/>
-      <w:r>
-        <w:t>воркера</w:t>
-      </w:r>
-      <w:proofErr w:type="spellEnd"/>
-      <w:r>
-        <w:t>, чтобы демонстрировать именно переназначение узлу.</w:t>
+        <w:t>. Клиент должен видеть изменение состояния задания и получать итог либо сообщение об ошибке. Повторная попытка должна назначаться другому идентификатору воркера, чтобы демонстрировать именно переназначение узлу.</w:t>
       </w:r>
     </w:p>
     <w:p>
       <w:r>
-        <w:t>Прикладные требования дополняют сетевое ядро: вход по логину и паролю, роли покупателя и администратора, каталог, корзина, серверный расчёт скидок, купоны с ограничениями, история и электронные чеки. Генератор должен создавать помеченные тестовые заказы с управляемым окном допуска, нагрузкой и диапазоном приоритетов. При подготовке аналитики такие заказы необходимо иметь возможность исключать.</w:t>
+        <w:t xml:space="preserve">Прикладные требования дополняют сетевое ядро: вход по логину и паролю, роли покупателя и администратора, каталог, корзина, серверный расчёт скидок, купоны с ограничениями, история и электронные чеки. Генератор должен создавать помеченные тестовые заказы с управляемым окном допуска, </w:t>
+      </w:r>
+      <w:r>
+        <w:lastRenderedPageBreak/>
+        <w:t>нагрузкой и диапазоном приоритетов. При подготовке аналитики такие заказы необходимо иметь возможность исключать.</w:t>
       </w:r>
     </w:p>
     <w:p>
       <w:r>
-        <w:t>Данные требования служат основанием для алгоритмического анализа во втором разделе. При проектировании отдельно рассматриваются надёжность вычисления, постоянство прикладной истории и ограничения учебного развёртывания: это разные свойства системы, и проверка одного из них не доказывает остальные.</w:t>
+        <w:t>Сформулированные требования необходимо использовать как основание для алгоритмического анализа и проектирования во втором разделе. На следующем этапе следует уточнить взаимодействие компонентов, форматы данных и способы обработки ошибок. Проверку выбранных решений и оценку ограничений предполагается выполнить после реализации, разделяя надёжность вычислений, сохранность прикладной истории и условия учебного развёртывания.</w:t>
       </w:r>
     </w:p>
     <w:p>
@@ -3770,7 +3021,6 @@
         </w:rPr>
         <w:t xml:space="preserve"> </w:t>
       </w:r>
-      <w:proofErr w:type="spellStart"/>
       <w:r>
         <w:rPr>
           <w:i/>
@@ -3778,7 +3028,6 @@
         </w:rPr>
         <w:t>asyncio</w:t>
       </w:r>
-      <w:proofErr w:type="spellEnd"/>
       <w:r>
         <w:rPr>
           <w:lang w:val="en-US"/>
@@ -4273,52 +3522,38 @@
       <w:r>
         <w:t xml:space="preserve">4. </w:t>
       </w:r>
-      <w:proofErr w:type="spellStart"/>
       <w:r>
         <w:rPr>
           <w:i/>
         </w:rPr>
         <w:t>Introduction</w:t>
       </w:r>
-      <w:proofErr w:type="spellEnd"/>
       <w:r>
         <w:t xml:space="preserve"> </w:t>
       </w:r>
-      <w:proofErr w:type="spellStart"/>
       <w:r>
         <w:rPr>
           <w:i/>
         </w:rPr>
         <w:t>to</w:t>
       </w:r>
-      <w:proofErr w:type="spellEnd"/>
       <w:r>
         <w:t xml:space="preserve"> </w:t>
       </w:r>
-      <w:proofErr w:type="spellStart"/>
       <w:r>
         <w:rPr>
           <w:i/>
         </w:rPr>
         <w:t>Celery</w:t>
       </w:r>
-      <w:proofErr w:type="spellEnd"/>
       <w:r>
         <w:t xml:space="preserve"> [Электронный ресурс] / </w:t>
       </w:r>
-      <w:proofErr w:type="spellStart"/>
-      <w:r>
-        <w:rPr>
-          <w:i/>
-        </w:rPr>
-        <w:t>Celery</w:t>
-      </w:r>
-      <w:proofErr w:type="spellEnd"/>
-      <w:r>
-        <w:rPr>
-          <w:i/>
-        </w:rPr>
-        <w:t>.</w:t>
+      <w:r>
+        <w:rPr>
+          <w:i/>
+        </w:rPr>
+        <w:t>Celery.</w:t>
       </w:r>
       <w:r>
         <w:t xml:space="preserve"> - Режим доступа: </w:t>
@@ -4410,7 +3645,6 @@
         </w:rPr>
         <w:t xml:space="preserve"> </w:t>
       </w:r>
-      <w:proofErr w:type="spellStart"/>
       <w:r>
         <w:rPr>
           <w:i/>
@@ -4418,7 +3652,6 @@
         </w:rPr>
         <w:t>Cormen</w:t>
       </w:r>
-      <w:proofErr w:type="spellEnd"/>
       <w:r>
         <w:rPr>
           <w:lang w:val="en-US"/>
@@ -4451,7 +3684,6 @@
         </w:rPr>
         <w:t xml:space="preserve"> </w:t>
       </w:r>
-      <w:proofErr w:type="spellStart"/>
       <w:r>
         <w:rPr>
           <w:i/>
@@ -4459,7 +3691,6 @@
         </w:rPr>
         <w:t>Leiserson</w:t>
       </w:r>
-      <w:proofErr w:type="spellEnd"/>
       <w:r>
         <w:rPr>
           <w:lang w:val="en-US"/>
@@ -5079,7 +4310,6 @@
         </w:rPr>
         <w:t xml:space="preserve">8. </w:t>
       </w:r>
-      <w:proofErr w:type="spellStart"/>
       <w:r>
         <w:rPr>
           <w:i/>
@@ -5087,7 +4317,6 @@
         </w:rPr>
         <w:t>Leskovec</w:t>
       </w:r>
-      <w:proofErr w:type="spellEnd"/>
       <w:r>
         <w:rPr>
           <w:lang w:val="en-US"/>
@@ -5172,7 +4401,6 @@
         </w:rPr>
         <w:t xml:space="preserve"> </w:t>
       </w:r>
-      <w:proofErr w:type="spellStart"/>
       <w:r>
         <w:rPr>
           <w:i/>
@@ -5180,7 +4408,6 @@
         </w:rPr>
         <w:t>Leskovec</w:t>
       </w:r>
-      <w:proofErr w:type="spellEnd"/>
       <w:r>
         <w:rPr>
           <w:lang w:val="en-US"/>
@@ -5369,7 +4596,6 @@
         </w:rPr>
         <w:t xml:space="preserve">9. </w:t>
       </w:r>
-      <w:proofErr w:type="spellStart"/>
       <w:r>
         <w:rPr>
           <w:i/>
@@ -5377,7 +4603,6 @@
         </w:rPr>
         <w:t>Aumasson</w:t>
       </w:r>
-      <w:proofErr w:type="spellEnd"/>
       <w:r>
         <w:rPr>
           <w:lang w:val="en-US"/>
@@ -5514,21 +4739,12 @@
         </w:rPr>
         <w:t xml:space="preserve"> </w:t>
       </w:r>
-      <w:proofErr w:type="spellStart"/>
-      <w:r>
-        <w:rPr>
-          <w:i/>
-          <w:lang w:val="en-US"/>
-        </w:rPr>
-        <w:t>Aumasson</w:t>
-      </w:r>
-      <w:proofErr w:type="spellEnd"/>
-      <w:r>
-        <w:rPr>
-          <w:i/>
-          <w:lang w:val="en-US"/>
-        </w:rPr>
-        <w:t>.</w:t>
+      <w:r>
+        <w:rPr>
+          <w:i/>
+          <w:lang w:val="en-US"/>
+        </w:rPr>
+        <w:t>Aumasson.</w:t>
       </w:r>
       <w:r>
         <w:rPr>

</xml_diff>